<commit_message>
nmv 14 08 2026
</commit_message>
<xml_diff>
--- a/Ghana Sandhi/GS-TS 7.1-7.5 Sanskrit.docx
+++ b/Ghana Sandhi/GS-TS 7.1-7.5 Sanskrit.docx
@@ -1,6 +1,6 @@
 
 <file path=word/document.xml><?xml version="1.0" encoding="utf-8"?>
-<w:document xmlns:wpc="http://schemas.microsoft.com/office/word/2010/wordprocessingCanvas" xmlns:cx="http://schemas.microsoft.com/office/drawing/2014/chartex" xmlns:cx1="http://schemas.microsoft.com/office/drawing/2015/9/8/chartex" xmlns:cx2="http://schemas.microsoft.com/office/drawing/2015/10/21/chartex" xmlns:cx3="http://schemas.microsoft.com/office/drawing/2016/5/9/chartex" xmlns:cx4="http://schemas.microsoft.com/office/drawing/2016/5/10/chartex" xmlns:cx5="http://schemas.microsoft.com/office/drawing/2016/5/11/chartex" xmlns:cx6="http://schemas.microsoft.com/office/drawing/2016/5/12/chartex" xmlns:cx7="http://schemas.microsoft.com/office/drawing/2016/5/13/chartex" xmlns:cx8="http://schemas.microsoft.com/office/drawing/2016/5/14/chartex" xmlns:mc="http://schemas.openxmlformats.org/markup-compatibility/2006" xmlns:aink="http://schemas.microsoft.com/office/drawing/2016/ink" xmlns:am3d="http://schemas.microsoft.com/office/drawing/2017/model3d" xmlns:o="urn:schemas-microsoft-com:office:office" xmlns:oel="http://schemas.microsoft.com/office/2019/extlst" xmlns:r="http://schemas.openxmlformats.org/officeDocument/2006/relationships" xmlns:m="http://schemas.openxmlformats.org/officeDocument/2006/math" xmlns:v="urn:schemas-microsoft-com:vml" xmlns:wp14="http://schemas.microsoft.com/office/word/2010/wordprocessingDrawing" xmlns:wp="http://schemas.openxmlformats.org/drawingml/2006/wordprocessingDrawing" xmlns:w10="urn:schemas-microsoft-com:office:word" xmlns:w="http://schemas.openxmlformats.org/wordprocessingml/2006/main" xmlns:w14="http://schemas.microsoft.com/office/word/2010/wordml" xmlns:w15="http://schemas.microsoft.com/office/word/2012/wordml" xmlns:w16cex="http://schemas.microsoft.com/office/word/2018/wordml/cex" xmlns:w16cid="http://schemas.microsoft.com/office/word/2016/wordml/cid" xmlns:w16="http://schemas.microsoft.com/office/word/2018/wordml" xmlns:w16du="http://schemas.microsoft.com/office/word/2023/wordml/word16du" xmlns:w16sdtdh="http://schemas.microsoft.com/office/word/2020/wordml/sdtdatahash" xmlns:w16se="http://schemas.microsoft.com/office/word/2015/wordml/symex" xmlns:wpg="http://schemas.microsoft.com/office/word/2010/wordprocessingGroup" xmlns:wpi="http://schemas.microsoft.com/office/word/2010/wordprocessingInk" xmlns:wne="http://schemas.microsoft.com/office/word/2006/wordml" xmlns:wps="http://schemas.microsoft.com/office/word/2010/wordprocessingShape" mc:Ignorable="w14 w15 w16se w16cid w16 w16cex w16sdtdh w16du wp14">
+<w:document xmlns:wpc="http://schemas.microsoft.com/office/word/2010/wordprocessingCanvas" xmlns:cx="http://schemas.microsoft.com/office/drawing/2014/chartex" xmlns:cx1="http://schemas.microsoft.com/office/drawing/2015/9/8/chartex" xmlns:cx2="http://schemas.microsoft.com/office/drawing/2015/10/21/chartex" xmlns:cx3="http://schemas.microsoft.com/office/drawing/2016/5/9/chartex" xmlns:cx4="http://schemas.microsoft.com/office/drawing/2016/5/10/chartex" xmlns:cx5="http://schemas.microsoft.com/office/drawing/2016/5/11/chartex" xmlns:cx6="http://schemas.microsoft.com/office/drawing/2016/5/12/chartex" xmlns:cx7="http://schemas.microsoft.com/office/drawing/2016/5/13/chartex" xmlns:cx8="http://schemas.microsoft.com/office/drawing/2016/5/14/chartex" xmlns:mc="http://schemas.openxmlformats.org/markup-compatibility/2006" xmlns:aink="http://schemas.microsoft.com/office/drawing/2016/ink" xmlns:am3d="http://schemas.microsoft.com/office/drawing/2017/model3d" xmlns:o="urn:schemas-microsoft-com:office:office" xmlns:oel="http://schemas.microsoft.com/office/2019/extlst" xmlns:r="http://schemas.openxmlformats.org/officeDocument/2006/relationships" xmlns:m="http://schemas.openxmlformats.org/officeDocument/2006/math" xmlns:v="urn:schemas-microsoft-com:vml" xmlns:wp14="http://schemas.microsoft.com/office/word/2010/wordprocessingDrawing" xmlns:wp="http://schemas.openxmlformats.org/drawingml/2006/wordprocessingDrawing" xmlns:w10="urn:schemas-microsoft-com:office:word" xmlns:w="http://schemas.openxmlformats.org/wordprocessingml/2006/main" xmlns:w14="http://schemas.microsoft.com/office/word/2010/wordml" xmlns:w15="http://schemas.microsoft.com/office/word/2012/wordml" xmlns:w16cei="http://schemas.microsoft.com/office/word/2026/wordml/cei" xmlns:w16cex="http://schemas.microsoft.com/office/word/2018/wordml/cex" xmlns:w16cid="http://schemas.microsoft.com/office/word/2016/wordml/cid" xmlns:w16="http://schemas.microsoft.com/office/word/2018/wordml" xmlns:w16du="http://schemas.microsoft.com/office/word/2023/wordml/word16du" xmlns:w16sdtdh="http://schemas.microsoft.com/office/word/2020/wordml/sdtdatahash" xmlns:w16sdtfl="http://schemas.microsoft.com/office/word/2024/wordml/sdtformatlock" xmlns:w16se="http://schemas.microsoft.com/office/word/2015/wordml/symex" xmlns:wpg="http://schemas.microsoft.com/office/word/2010/wordprocessingGroup" xmlns:wpi="http://schemas.microsoft.com/office/word/2010/wordprocessingInk" xmlns:wne="http://schemas.microsoft.com/office/word/2006/wordml" xmlns:wps="http://schemas.microsoft.com/office/word/2010/wordprocessingShape" mc:Ignorable="w14 w15 w16se w16cid w16 w16cex w16sdtdh w16sdtfl w16du wp14">
   <w:body>
     <w:p>
       <w:pPr>
@@ -9803,8 +9803,9 @@
           <w:szCs w:val="36"/>
           <w:lang w:eastAsia="en-US" w:bidi="ar-SA"/>
         </w:rPr>
-        <w:t>3) WûÏ(3) AÎxiuÉiÉÏ</w:t>
-      </w:r>
+        <w:t xml:space="preserve">3) </w:t>
+      </w:r>
+      <w:proofErr w:type="gramStart"/>
       <w:r>
         <w:rPr>
           <w:rFonts w:ascii="BRH Devanagari Extra" w:eastAsiaTheme="minorHAnsi" w:hAnsi="BRH Devanagari Extra" w:cs="BRH Devanagari Extra"/>
@@ -9814,8 +9815,9 @@
           <w:szCs w:val="36"/>
           <w:lang w:eastAsia="en-US" w:bidi="ar-SA"/>
         </w:rPr>
-        <w:t xml:space="preserve"> </w:t>
-      </w:r>
+        <w:t>WûÏ(</w:t>
+      </w:r>
+      <w:proofErr w:type="gramEnd"/>
       <w:r>
         <w:rPr>
           <w:rFonts w:ascii="BRH Devanagari Extra" w:eastAsiaTheme="minorHAnsi" w:hAnsi="BRH Devanagari Extra" w:cs="BRH Devanagari Extra"/>
@@ -9825,7 +9827,53 @@
           <w:szCs w:val="36"/>
           <w:lang w:eastAsia="en-US" w:bidi="ar-SA"/>
         </w:rPr>
-        <w:t xml:space="preserve">irÉxiÉÑý WûÏ(3) | </w:t>
+        <w:t>3) AÎxiuÉiÉÏ</w:t>
+      </w:r>
+      <w:r>
+        <w:rPr>
+          <w:rFonts w:ascii="BRH Devanagari Extra" w:eastAsiaTheme="minorHAnsi" w:hAnsi="BRH Devanagari Extra" w:cs="BRH Devanagari Extra"/>
+          <w:b/>
+          <w:color w:val="000000"/>
+          <w:sz w:val="36"/>
+          <w:szCs w:val="36"/>
+          <w:lang w:eastAsia="en-US" w:bidi="ar-SA"/>
+        </w:rPr>
+        <w:t xml:space="preserve"> </w:t>
+      </w:r>
+      <w:r>
+        <w:rPr>
+          <w:rFonts w:ascii="BRH Devanagari Extra" w:eastAsiaTheme="minorHAnsi" w:hAnsi="BRH Devanagari Extra" w:cs="BRH Devanagari Extra"/>
+          <w:b/>
+          <w:color w:val="000000"/>
+          <w:sz w:val="36"/>
+          <w:szCs w:val="36"/>
+          <w:lang w:eastAsia="en-US" w:bidi="ar-SA"/>
+        </w:rPr>
+        <w:t xml:space="preserve">irÉxiÉÑý </w:t>
+      </w:r>
+      <w:proofErr w:type="gramStart"/>
+      <w:r>
+        <w:rPr>
+          <w:rFonts w:ascii="BRH Devanagari Extra" w:eastAsiaTheme="minorHAnsi" w:hAnsi="BRH Devanagari Extra" w:cs="BRH Devanagari Extra"/>
+          <w:b/>
+          <w:color w:val="000000"/>
+          <w:sz w:val="36"/>
+          <w:szCs w:val="36"/>
+          <w:lang w:eastAsia="en-US" w:bidi="ar-SA"/>
+        </w:rPr>
+        <w:t>WûÏ(</w:t>
+      </w:r>
+      <w:proofErr w:type="gramEnd"/>
+      <w:r>
+        <w:rPr>
+          <w:rFonts w:ascii="BRH Devanagari Extra" w:eastAsiaTheme="minorHAnsi" w:hAnsi="BRH Devanagari Extra" w:cs="BRH Devanagari Extra"/>
+          <w:b/>
+          <w:color w:val="000000"/>
+          <w:sz w:val="36"/>
+          <w:szCs w:val="36"/>
+          <w:lang w:eastAsia="en-US" w:bidi="ar-SA"/>
+        </w:rPr>
+        <w:t xml:space="preserve">3) | </w:t>
       </w:r>
     </w:p>
     <w:p>
@@ -10032,7 +10080,103 @@
           <w:szCs w:val="40"/>
           <w:lang w:eastAsia="en-US" w:bidi="ar-SA"/>
         </w:rPr>
-        <w:t>3) WûÏ(3) AxiuÉxiÉÑý WûÏ(3) CiÉÏÌiÉý WûÏ(3) AxiuÉxiÉÑý WûÏ(3) CÌiÉþ |</w:t>
+        <w:t xml:space="preserve">3) </w:t>
+      </w:r>
+      <w:proofErr w:type="gramStart"/>
+      <w:r>
+        <w:rPr>
+          <w:rFonts w:ascii="BRH Devanagari Extra" w:eastAsiaTheme="minorHAnsi" w:hAnsi="BRH Devanagari Extra" w:cs="BRH Devanagari Extra"/>
+          <w:b/>
+          <w:color w:val="000000"/>
+          <w:sz w:val="40"/>
+          <w:szCs w:val="40"/>
+          <w:lang w:eastAsia="en-US" w:bidi="ar-SA"/>
+        </w:rPr>
+        <w:t>WûÏ(</w:t>
+      </w:r>
+      <w:proofErr w:type="gramEnd"/>
+      <w:r>
+        <w:rPr>
+          <w:rFonts w:ascii="BRH Devanagari Extra" w:eastAsiaTheme="minorHAnsi" w:hAnsi="BRH Devanagari Extra" w:cs="BRH Devanagari Extra"/>
+          <w:b/>
+          <w:color w:val="000000"/>
+          <w:sz w:val="40"/>
+          <w:szCs w:val="40"/>
+          <w:lang w:eastAsia="en-US" w:bidi="ar-SA"/>
+        </w:rPr>
+        <w:t xml:space="preserve">3) AxiuÉxiÉÑý </w:t>
+      </w:r>
+      <w:proofErr w:type="gramStart"/>
+      <w:r>
+        <w:rPr>
+          <w:rFonts w:ascii="BRH Devanagari Extra" w:eastAsiaTheme="minorHAnsi" w:hAnsi="BRH Devanagari Extra" w:cs="BRH Devanagari Extra"/>
+          <w:b/>
+          <w:color w:val="000000"/>
+          <w:sz w:val="40"/>
+          <w:szCs w:val="40"/>
+          <w:lang w:eastAsia="en-US" w:bidi="ar-SA"/>
+        </w:rPr>
+        <w:t>WûÏ(</w:t>
+      </w:r>
+      <w:proofErr w:type="gramEnd"/>
+      <w:r>
+        <w:rPr>
+          <w:rFonts w:ascii="BRH Devanagari Extra" w:eastAsiaTheme="minorHAnsi" w:hAnsi="BRH Devanagari Extra" w:cs="BRH Devanagari Extra"/>
+          <w:b/>
+          <w:color w:val="000000"/>
+          <w:sz w:val="40"/>
+          <w:szCs w:val="40"/>
+          <w:lang w:eastAsia="en-US" w:bidi="ar-SA"/>
+        </w:rPr>
+        <w:t xml:space="preserve">3) CiÉÏÌiÉý </w:t>
+      </w:r>
+      <w:proofErr w:type="gramStart"/>
+      <w:r>
+        <w:rPr>
+          <w:rFonts w:ascii="BRH Devanagari Extra" w:eastAsiaTheme="minorHAnsi" w:hAnsi="BRH Devanagari Extra" w:cs="BRH Devanagari Extra"/>
+          <w:b/>
+          <w:color w:val="000000"/>
+          <w:sz w:val="40"/>
+          <w:szCs w:val="40"/>
+          <w:lang w:eastAsia="en-US" w:bidi="ar-SA"/>
+        </w:rPr>
+        <w:t>WûÏ(</w:t>
+      </w:r>
+      <w:proofErr w:type="gramEnd"/>
+      <w:r>
+        <w:rPr>
+          <w:rFonts w:ascii="BRH Devanagari Extra" w:eastAsiaTheme="minorHAnsi" w:hAnsi="BRH Devanagari Extra" w:cs="BRH Devanagari Extra"/>
+          <w:b/>
+          <w:color w:val="000000"/>
+          <w:sz w:val="40"/>
+          <w:szCs w:val="40"/>
+          <w:lang w:eastAsia="en-US" w:bidi="ar-SA"/>
+        </w:rPr>
+        <w:t xml:space="preserve">3) AxiuÉxiÉÑý </w:t>
+      </w:r>
+      <w:proofErr w:type="gramStart"/>
+      <w:r>
+        <w:rPr>
+          <w:rFonts w:ascii="BRH Devanagari Extra" w:eastAsiaTheme="minorHAnsi" w:hAnsi="BRH Devanagari Extra" w:cs="BRH Devanagari Extra"/>
+          <w:b/>
+          <w:color w:val="000000"/>
+          <w:sz w:val="40"/>
+          <w:szCs w:val="40"/>
+          <w:lang w:eastAsia="en-US" w:bidi="ar-SA"/>
+        </w:rPr>
+        <w:t>WûÏ(</w:t>
+      </w:r>
+      <w:proofErr w:type="gramEnd"/>
+      <w:r>
+        <w:rPr>
+          <w:rFonts w:ascii="BRH Devanagari Extra" w:eastAsiaTheme="minorHAnsi" w:hAnsi="BRH Devanagari Extra" w:cs="BRH Devanagari Extra"/>
+          <w:b/>
+          <w:color w:val="000000"/>
+          <w:sz w:val="40"/>
+          <w:szCs w:val="40"/>
+          <w:lang w:eastAsia="en-US" w:bidi="ar-SA"/>
+        </w:rPr>
+        <w:t>3) CÌiÉþ |</w:t>
       </w:r>
     </w:p>
     <w:p>
@@ -11172,15 +11316,15 @@
       </w:r>
       <w:r>
         <w:rPr>
-          <w:rFonts w:ascii="BRH Devanagari" w:eastAsiaTheme="minorHAnsi" w:hAnsi="BRH Devanagari" w:cs="BRH Devanagari"/>
+          <w:rFonts w:ascii="BRH Devanagari Extra" w:eastAsiaTheme="minorHAnsi" w:hAnsi="BRH Devanagari Extra" w:cs="BRH Devanagari"/>
           <w:b/>
           <w:color w:val="000000"/>
-          <w:sz w:val="40"/>
+          <w:sz w:val="36"/>
           <w:szCs w:val="40"/>
           <w:highlight w:val="green"/>
           <w:lang w:eastAsia="en-US" w:bidi="ar-SA"/>
         </w:rPr>
-        <w:t>(aaÉç)</w:t>
+        <w:t>ò</w:t>
       </w:r>
       <w:r>
         <w:rPr>
@@ -12600,8 +12744,9 @@
           <w:highlight w:val="yellow"/>
           <w:lang w:val="en-US"/>
         </w:rPr>
-        <w:t xml:space="preserve"> in blue </w:t>
-      </w:r>
+        <w:t xml:space="preserve"> in </w:t>
+      </w:r>
+      <w:proofErr w:type="gramStart"/>
       <w:r>
         <w:rPr>
           <w:rFonts w:ascii="Arial" w:hAnsi="Arial" w:cs="Arial"/>
@@ -12612,8 +12757,21 @@
           <w:highlight w:val="yellow"/>
           <w:lang w:val="en-US"/>
         </w:rPr>
+        <w:t xml:space="preserve">blue </w:t>
+      </w:r>
+      <w:r>
+        <w:rPr>
+          <w:rFonts w:ascii="Arial" w:hAnsi="Arial" w:cs="Arial"/>
+          <w:b/>
+          <w:bCs/>
+          <w:sz w:val="32"/>
+          <w:szCs w:val="32"/>
+          <w:highlight w:val="yellow"/>
+          <w:lang w:val="en-US"/>
+        </w:rPr>
         <w:t>)</w:t>
       </w:r>
+      <w:proofErr w:type="gramEnd"/>
       <w:r>
         <w:rPr>
           <w:rFonts w:ascii="Arial" w:hAnsi="Arial" w:cs="Arial"/>
@@ -14414,7 +14572,29 @@
           <w:szCs w:val="40"/>
           <w:lang w:eastAsia="en-US" w:bidi="ar-SA"/>
         </w:rPr>
-        <w:t>[cÉiÉÑ¹ÉåqÉÉ(aaÉç) ¶ÉiÉÑ¹ÉåqÉÉlÉç]</w:t>
+        <w:t>[cÉiÉÑ¹ÉåqÉÉ</w:t>
+      </w:r>
+      <w:r>
+        <w:rPr>
+          <w:rFonts w:ascii="BRH Devanagari Extra" w:eastAsiaTheme="minorHAnsi" w:hAnsi="BRH Devanagari Extra" w:cs="BRH Devanagari"/>
+          <w:b/>
+          <w:color w:val="000000"/>
+          <w:sz w:val="36"/>
+          <w:szCs w:val="40"/>
+          <w:lang w:eastAsia="en-US" w:bidi="ar-SA"/>
+        </w:rPr>
+        <w:t>ò</w:t>
+      </w:r>
+      <w:r>
+        <w:rPr>
+          <w:rFonts w:ascii="BRH Devanagari" w:eastAsiaTheme="minorHAnsi" w:hAnsi="BRH Devanagari" w:cs="BRH Devanagari"/>
+          <w:b/>
+          <w:color w:val="000000"/>
+          <w:sz w:val="40"/>
+          <w:szCs w:val="40"/>
+          <w:lang w:eastAsia="en-US" w:bidi="ar-SA"/>
+        </w:rPr>
+        <w:t xml:space="preserve"> ¶ÉiÉÑ¹ÉåqÉÉlÉç]</w:t>
       </w:r>
     </w:p>
     <w:p>
@@ -14600,7 +14780,29 @@
           <w:szCs w:val="40"/>
           <w:lang w:eastAsia="en-US" w:bidi="ar-SA"/>
         </w:rPr>
-        <w:t>[LiÉÉlÉç mÉÉåwÉÉlÉç mÉÉåwÉÉ(aqÉç) LiÉÉlÉåiÉÉlÉç mÉÉåwÉÉlÉç]</w:t>
+        <w:t>[LiÉÉlÉç mÉÉåwÉÉlÉç mÉÉåwÉÉ</w:t>
+      </w:r>
+      <w:r>
+        <w:rPr>
+          <w:rFonts w:ascii="BRH Devanagari Extra" w:eastAsiaTheme="minorHAnsi" w:hAnsi="BRH Devanagari Extra" w:cs="BRH Devanagari"/>
+          <w:b/>
+          <w:color w:val="000000"/>
+          <w:sz w:val="36"/>
+          <w:szCs w:val="40"/>
+          <w:lang w:eastAsia="en-US" w:bidi="ar-SA"/>
+        </w:rPr>
+        <w:t>óè</w:t>
+      </w:r>
+      <w:r>
+        <w:rPr>
+          <w:rFonts w:ascii="BRH Devanagari" w:eastAsiaTheme="minorHAnsi" w:hAnsi="BRH Devanagari" w:cs="BRH Devanagari"/>
+          <w:b/>
+          <w:color w:val="000000"/>
+          <w:sz w:val="40"/>
+          <w:szCs w:val="40"/>
+          <w:lang w:eastAsia="en-US" w:bidi="ar-SA"/>
+        </w:rPr>
+        <w:t xml:space="preserve"> LiÉÉlÉåiÉÉlÉç mÉÉåwÉÉlÉç]</w:t>
       </w:r>
     </w:p>
     <w:p>
@@ -15544,7 +15746,47 @@
           <w:szCs w:val="40"/>
           <w:lang w:eastAsia="en-US" w:bidi="hi-IN"/>
         </w:rPr>
-        <w:t xml:space="preserve">Fý wÉÑ xÉÔþ wÉÑ xÉÑý§ÉÉqÉÉþhÉ(aqÉç) xÉÑý§ÉÉqÉÉþhÉý(aqÉç)ý xÉÔþ wÉÑ xÉÑý§ÉÉqÉÉþhÉqÉç | </w:t>
+        <w:t>Fý wÉÑ xÉÔþ wÉÑ xÉÑý§ÉÉqÉÉþhÉ</w:t>
+      </w:r>
+      <w:r>
+        <w:rPr>
+          <w:rFonts w:ascii="BRH Devanagari Extra" w:eastAsiaTheme="minorHAnsi" w:hAnsi="BRH Devanagari Extra" w:cs="BRH Devanagari Extra"/>
+          <w:color w:val="FF0000"/>
+          <w:sz w:val="36"/>
+          <w:szCs w:val="40"/>
+          <w:lang w:eastAsia="en-US" w:bidi="hi-IN"/>
+        </w:rPr>
+        <w:t>óè</w:t>
+      </w:r>
+      <w:r>
+        <w:rPr>
+          <w:rFonts w:ascii="BRH Devanagari Extra" w:eastAsiaTheme="minorHAnsi" w:hAnsi="BRH Devanagari Extra" w:cs="BRH Devanagari Extra"/>
+          <w:color w:val="FF0000"/>
+          <w:sz w:val="40"/>
+          <w:szCs w:val="40"/>
+          <w:lang w:eastAsia="en-US" w:bidi="hi-IN"/>
+        </w:rPr>
+        <w:t xml:space="preserve"> xÉÑý§ÉÉqÉÉþhÉý</w:t>
+      </w:r>
+      <w:r>
+        <w:rPr>
+          <w:rFonts w:ascii="BRH Devanagari Extra" w:eastAsiaTheme="minorHAnsi" w:hAnsi="BRH Devanagari Extra" w:cs="BRH Devanagari Extra"/>
+          <w:color w:val="FF0000"/>
+          <w:sz w:val="36"/>
+          <w:szCs w:val="40"/>
+          <w:lang w:eastAsia="en-US" w:bidi="hi-IN"/>
+        </w:rPr>
+        <w:t>óè</w:t>
+      </w:r>
+      <w:r>
+        <w:rPr>
+          <w:rFonts w:ascii="BRH Devanagari Extra" w:eastAsiaTheme="minorHAnsi" w:hAnsi="BRH Devanagari Extra" w:cs="BRH Devanagari Extra"/>
+          <w:color w:val="FF0000"/>
+          <w:sz w:val="40"/>
+          <w:szCs w:val="40"/>
+          <w:lang w:eastAsia="en-US" w:bidi="hi-IN"/>
+        </w:rPr>
+        <w:t xml:space="preserve">ý xÉÔþ wÉÑ xÉÑý§ÉÉqÉÉþhÉqÉç | </w:t>
       </w:r>
     </w:p>
     <w:p>
@@ -19486,14 +19728,25 @@
       </w:r>
       <w:r>
         <w:rPr>
-          <w:rFonts w:ascii="BRH Devanagari" w:eastAsiaTheme="minorHAnsi" w:hAnsi="BRH Devanagari" w:cs="BRH Devanagari"/>
+          <w:rFonts w:ascii="BRH Devanagari Extra" w:eastAsiaTheme="minorHAnsi" w:hAnsi="BRH Devanagari Extra" w:cs="BRH Devanagari"/>
           <w:b/>
           <w:bCs/>
           <w:sz w:val="36"/>
           <w:szCs w:val="36"/>
           <w:lang w:eastAsia="en-US" w:bidi="ar-SA"/>
         </w:rPr>
-        <w:t xml:space="preserve">(aaÉç) </w:t>
+        <w:t>ò</w:t>
+      </w:r>
+      <w:r>
+        <w:rPr>
+          <w:rFonts w:ascii="BRH Devanagari" w:eastAsiaTheme="minorHAnsi" w:hAnsi="BRH Devanagari" w:cs="BRH Devanagari"/>
+          <w:b/>
+          <w:bCs/>
+          <w:sz w:val="36"/>
+          <w:szCs w:val="36"/>
+          <w:lang w:eastAsia="en-US" w:bidi="ar-SA"/>
+        </w:rPr>
+        <w:t xml:space="preserve"> </w:t>
       </w:r>
       <w:r>
         <w:rPr>
@@ -20168,7 +20421,29 @@
           <w:szCs w:val="40"/>
           <w:lang w:eastAsia="en-US" w:bidi="hi-IN"/>
         </w:rPr>
-        <w:t xml:space="preserve"> sÉÉåýMåüwÉÑþ sÉÉåýMåü wuÉåýuÉæwuÉåÿ(1ý)wuÉåþuÉ sÉÉåýMåüwÉÑþ | </w:t>
+        <w:t xml:space="preserve"> sÉÉåýMåüwÉÑþ sÉÉåýMåü wuÉåýuÉæwuÉåÿ(1</w:t>
+      </w:r>
+      <w:proofErr w:type="gramStart"/>
+      <w:r>
+        <w:rPr>
+          <w:rFonts w:ascii="BRH Devanagari Extra" w:eastAsiaTheme="minorHAnsi" w:hAnsi="BRH Devanagari Extra" w:cs="BRH Devanagari Extra"/>
+          <w:color w:val="FF0000"/>
+          <w:sz w:val="40"/>
+          <w:szCs w:val="40"/>
+          <w:lang w:eastAsia="en-US" w:bidi="hi-IN"/>
+        </w:rPr>
+        <w:t>ý)wuÉåþuÉ</w:t>
+      </w:r>
+      <w:proofErr w:type="gramEnd"/>
+      <w:r>
+        <w:rPr>
+          <w:rFonts w:ascii="BRH Devanagari Extra" w:eastAsiaTheme="minorHAnsi" w:hAnsi="BRH Devanagari Extra" w:cs="BRH Devanagari Extra"/>
+          <w:color w:val="FF0000"/>
+          <w:sz w:val="40"/>
+          <w:szCs w:val="40"/>
+          <w:lang w:eastAsia="en-US" w:bidi="hi-IN"/>
+        </w:rPr>
+        <w:t xml:space="preserve"> sÉÉåýMåüwÉÑþ | </w:t>
       </w:r>
     </w:p>
     <w:p>
@@ -21126,7 +21401,29 @@
           <w:szCs w:val="40"/>
           <w:lang w:val="it-IT" w:eastAsia="en-US" w:bidi="ar-SA"/>
         </w:rPr>
-        <w:t>[AWû(aaÉç) ¶ÉiÉÑjÉåï]</w:t>
+        <w:t>[AWû</w:t>
+      </w:r>
+      <w:r>
+        <w:rPr>
+          <w:rFonts w:ascii="BRH Devanagari Extra" w:eastAsiaTheme="minorHAnsi" w:hAnsi="BRH Devanagari Extra" w:cs="BRH Devanagari"/>
+          <w:b/>
+          <w:color w:val="000000"/>
+          <w:sz w:val="36"/>
+          <w:szCs w:val="40"/>
+          <w:lang w:val="it-IT" w:eastAsia="en-US" w:bidi="ar-SA"/>
+        </w:rPr>
+        <w:t>ò</w:t>
+      </w:r>
+      <w:r>
+        <w:rPr>
+          <w:rFonts w:ascii="BRH Devanagari" w:eastAsiaTheme="minorHAnsi" w:hAnsi="BRH Devanagari" w:cs="BRH Devanagari"/>
+          <w:b/>
+          <w:color w:val="000000"/>
+          <w:sz w:val="40"/>
+          <w:szCs w:val="40"/>
+          <w:lang w:val="it-IT" w:eastAsia="en-US" w:bidi="ar-SA"/>
+        </w:rPr>
+        <w:t xml:space="preserve"> ¶ÉiÉÑjÉåï]</w:t>
       </w:r>
     </w:p>
     <w:p>
@@ -21605,7 +21902,29 @@
           <w:szCs w:val="40"/>
           <w:lang w:val="it-IT" w:eastAsia="en-US" w:bidi="ar-SA"/>
         </w:rPr>
-        <w:t>[iÉÎxqÉ(aaÉç) xiÉÍqÉlÉç)</w:t>
+        <w:t>[iÉÎxqÉ</w:t>
+      </w:r>
+      <w:r>
+        <w:rPr>
+          <w:rFonts w:ascii="BRH Devanagari Extra" w:eastAsiaTheme="minorHAnsi" w:hAnsi="BRH Devanagari Extra" w:cs="BRH Devanagari"/>
+          <w:b/>
+          <w:color w:val="000000"/>
+          <w:sz w:val="36"/>
+          <w:szCs w:val="40"/>
+          <w:lang w:val="it-IT" w:eastAsia="en-US" w:bidi="ar-SA"/>
+        </w:rPr>
+        <w:t>ò</w:t>
+      </w:r>
+      <w:r>
+        <w:rPr>
+          <w:rFonts w:ascii="BRH Devanagari" w:eastAsiaTheme="minorHAnsi" w:hAnsi="BRH Devanagari" w:cs="BRH Devanagari"/>
+          <w:b/>
+          <w:color w:val="000000"/>
+          <w:sz w:val="40"/>
+          <w:szCs w:val="40"/>
+          <w:lang w:val="it-IT" w:eastAsia="en-US" w:bidi="ar-SA"/>
+        </w:rPr>
+        <w:t xml:space="preserve"> xiÉÍqÉlÉç)</w:t>
       </w:r>
     </w:p>
     <w:p>
@@ -21772,7 +22091,29 @@
           <w:szCs w:val="40"/>
           <w:lang w:val="it-IT" w:eastAsia="en-US" w:bidi="ar-SA"/>
         </w:rPr>
-        <w:t>[iÉÎxqÉ(aaÉç) xiÉÍqÉlÉç)</w:t>
+        <w:t>[iÉÎxqÉ</w:t>
+      </w:r>
+      <w:r>
+        <w:rPr>
+          <w:rFonts w:ascii="BRH Devanagari Extra" w:eastAsiaTheme="minorHAnsi" w:hAnsi="BRH Devanagari Extra" w:cs="BRH Devanagari"/>
+          <w:b/>
+          <w:color w:val="000000"/>
+          <w:sz w:val="36"/>
+          <w:szCs w:val="40"/>
+          <w:lang w:val="it-IT" w:eastAsia="en-US" w:bidi="ar-SA"/>
+        </w:rPr>
+        <w:t>ò</w:t>
+      </w:r>
+      <w:r>
+        <w:rPr>
+          <w:rFonts w:ascii="BRH Devanagari" w:eastAsiaTheme="minorHAnsi" w:hAnsi="BRH Devanagari" w:cs="BRH Devanagari"/>
+          <w:b/>
+          <w:color w:val="000000"/>
+          <w:sz w:val="40"/>
+          <w:szCs w:val="40"/>
+          <w:lang w:val="it-IT" w:eastAsia="en-US" w:bidi="ar-SA"/>
+        </w:rPr>
+        <w:t xml:space="preserve"> xiÉÍqÉlÉç)</w:t>
       </w:r>
     </w:p>
     <w:p>
@@ -25060,15 +25401,15 @@
       </w:r>
       <w:r>
         <w:rPr>
-          <w:rFonts w:ascii="BRH Devanagari" w:eastAsiaTheme="minorHAnsi" w:hAnsi="BRH Devanagari" w:cs="BRH Devanagari"/>
+          <w:rFonts w:ascii="BRH Devanagari Extra" w:eastAsiaTheme="minorHAnsi" w:hAnsi="BRH Devanagari Extra" w:cs="BRH Devanagari"/>
           <w:b/>
           <w:color w:val="000000"/>
-          <w:sz w:val="40"/>
+          <w:sz w:val="36"/>
           <w:szCs w:val="40"/>
           <w:highlight w:val="green"/>
           <w:lang w:val="it-IT" w:eastAsia="en-US" w:bidi="ar-SA"/>
         </w:rPr>
-        <w:t>(aaÉç)</w:t>
+        <w:t>ò</w:t>
       </w:r>
       <w:r>
         <w:rPr>
@@ -25332,15 +25673,15 @@
       </w:r>
       <w:r>
         <w:rPr>
-          <w:rFonts w:ascii="BRH Devanagari" w:eastAsiaTheme="minorHAnsi" w:hAnsi="BRH Devanagari" w:cs="BRH Devanagari"/>
+          <w:rFonts w:ascii="BRH Devanagari Extra" w:eastAsiaTheme="minorHAnsi" w:hAnsi="BRH Devanagari Extra" w:cs="BRH Devanagari"/>
           <w:b/>
           <w:color w:val="000000"/>
-          <w:sz w:val="40"/>
+          <w:sz w:val="36"/>
           <w:szCs w:val="40"/>
           <w:highlight w:val="green"/>
           <w:lang w:val="it-IT" w:eastAsia="en-US" w:bidi="ar-SA"/>
         </w:rPr>
-        <w:t>(aaÉç)</w:t>
+        <w:t>ò</w:t>
       </w:r>
       <w:r>
         <w:rPr>
@@ -30770,15 +31111,15 @@
       </w:r>
       <w:r>
         <w:rPr>
-          <w:rFonts w:ascii="BRH Devanagari" w:eastAsiaTheme="minorHAnsi" w:hAnsi="BRH Devanagari" w:cs="BRH Devanagari"/>
+          <w:rFonts w:ascii="BRH Devanagari Extra" w:eastAsiaTheme="minorHAnsi" w:hAnsi="BRH Devanagari Extra" w:cs="BRH Devanagari"/>
           <w:b/>
           <w:color w:val="000000"/>
-          <w:sz w:val="40"/>
+          <w:sz w:val="36"/>
           <w:szCs w:val="40"/>
           <w:highlight w:val="green"/>
           <w:lang w:val="it-IT" w:eastAsia="en-US" w:bidi="ar-SA"/>
         </w:rPr>
-        <w:t>(aaÉç)</w:t>
+        <w:t>ò</w:t>
       </w:r>
       <w:r>
         <w:rPr>
@@ -31468,15 +31809,15 @@
       </w:r>
       <w:r>
         <w:rPr>
-          <w:rFonts w:ascii="BRH Devanagari" w:eastAsiaTheme="minorHAnsi" w:hAnsi="BRH Devanagari" w:cs="BRH Devanagari"/>
+          <w:rFonts w:ascii="BRH Devanagari Extra" w:eastAsiaTheme="minorHAnsi" w:hAnsi="BRH Devanagari Extra" w:cs="BRH Devanagari"/>
           <w:b/>
           <w:color w:val="000000"/>
-          <w:sz w:val="40"/>
+          <w:sz w:val="36"/>
           <w:szCs w:val="40"/>
           <w:highlight w:val="green"/>
           <w:lang w:val="it-IT" w:eastAsia="en-US" w:bidi="ar-SA"/>
         </w:rPr>
-        <w:t>(aaÉç)</w:t>
+        <w:t>ò</w:t>
       </w:r>
       <w:r>
         <w:rPr>
@@ -32214,15 +32555,15 @@
       </w:r>
       <w:r>
         <w:rPr>
-          <w:rFonts w:ascii="BRH Devanagari" w:eastAsiaTheme="minorHAnsi" w:hAnsi="BRH Devanagari" w:cs="BRH Devanagari"/>
+          <w:rFonts w:ascii="BRH Devanagari Extra" w:eastAsiaTheme="minorHAnsi" w:hAnsi="BRH Devanagari Extra" w:cs="BRH Devanagari"/>
           <w:b/>
           <w:color w:val="000000"/>
-          <w:sz w:val="40"/>
+          <w:sz w:val="36"/>
           <w:szCs w:val="40"/>
           <w:highlight w:val="green"/>
           <w:lang w:val="it-IT" w:eastAsia="en-US" w:bidi="ar-SA"/>
         </w:rPr>
-        <w:t>(aaÉç)</w:t>
+        <w:t>ò</w:t>
       </w:r>
       <w:r>
         <w:rPr>
@@ -32663,15 +33004,15 @@
       </w:r>
       <w:r>
         <w:rPr>
-          <w:rFonts w:ascii="BRH Devanagari" w:eastAsiaTheme="minorHAnsi" w:hAnsi="BRH Devanagari" w:cs="BRH Devanagari"/>
+          <w:rFonts w:ascii="BRH Devanagari Extra" w:eastAsiaTheme="minorHAnsi" w:hAnsi="BRH Devanagari Extra" w:cs="BRH Devanagari"/>
           <w:b/>
           <w:color w:val="000000"/>
-          <w:sz w:val="40"/>
+          <w:sz w:val="36"/>
           <w:szCs w:val="40"/>
           <w:highlight w:val="green"/>
           <w:lang w:val="it-IT" w:eastAsia="en-US" w:bidi="ar-SA"/>
         </w:rPr>
-        <w:t>(aaÉç)</w:t>
+        <w:t>ò</w:t>
       </w:r>
       <w:r>
         <w:rPr>
@@ -36725,8 +37066,9 @@
           <w:szCs w:val="32"/>
           <w:lang w:val="en-US"/>
         </w:rPr>
-        <w:t>GD-46)(GD-73)</w:t>
-      </w:r>
+        <w:t>GD-</w:t>
+      </w:r>
+      <w:proofErr w:type="gramStart"/>
       <w:r>
         <w:rPr>
           <w:rFonts w:ascii="Arial" w:hAnsi="Arial" w:cs="Arial"/>
@@ -36735,7 +37077,50 @@
           <w:szCs w:val="32"/>
           <w:lang w:val="en-US"/>
         </w:rPr>
-        <w:t>(GD-50)</w:t>
+        <w:t>46)(</w:t>
+      </w:r>
+      <w:proofErr w:type="gramEnd"/>
+      <w:r>
+        <w:rPr>
+          <w:rFonts w:ascii="Arial" w:hAnsi="Arial" w:cs="Arial"/>
+          <w:bCs/>
+          <w:sz w:val="32"/>
+          <w:szCs w:val="32"/>
+          <w:lang w:val="en-US"/>
+        </w:rPr>
+        <w:t>GD-</w:t>
+      </w:r>
+      <w:proofErr w:type="gramStart"/>
+      <w:r>
+        <w:rPr>
+          <w:rFonts w:ascii="Arial" w:hAnsi="Arial" w:cs="Arial"/>
+          <w:bCs/>
+          <w:sz w:val="32"/>
+          <w:szCs w:val="32"/>
+          <w:lang w:val="en-US"/>
+        </w:rPr>
+        <w:t>73)</w:t>
+      </w:r>
+      <w:r>
+        <w:rPr>
+          <w:rFonts w:ascii="Arial" w:hAnsi="Arial" w:cs="Arial"/>
+          <w:bCs/>
+          <w:sz w:val="32"/>
+          <w:szCs w:val="32"/>
+          <w:lang w:val="en-US"/>
+        </w:rPr>
+        <w:t>(</w:t>
+      </w:r>
+      <w:proofErr w:type="gramEnd"/>
+      <w:r>
+        <w:rPr>
+          <w:rFonts w:ascii="Arial" w:hAnsi="Arial" w:cs="Arial"/>
+          <w:bCs/>
+          <w:sz w:val="32"/>
+          <w:szCs w:val="32"/>
+          <w:lang w:val="en-US"/>
+        </w:rPr>
+        <w:t>GD-50)</w:t>
       </w:r>
     </w:p>
     <w:p>
@@ -37832,6 +38217,7 @@
         </w:rPr>
         <w:t xml:space="preserve"> </w:t>
       </w:r>
+      <w:proofErr w:type="gramStart"/>
       <w:r>
         <w:rPr>
           <w:rFonts w:ascii="Times New Roman" w:eastAsiaTheme="minorHAnsi" w:hAnsi="Times New Roman" w:cs="Times New Roman"/>
@@ -37856,6 +38242,7 @@
         </w:rPr>
         <w:t xml:space="preserve"> wÉ</w:t>
       </w:r>
+      <w:proofErr w:type="gramEnd"/>
       <w:r>
         <w:rPr>
           <w:rFonts w:ascii="BRH Devanagari" w:eastAsiaTheme="minorHAnsi" w:hAnsi="BRH Devanagari" w:cs="BRH Devanagari"/>
@@ -39459,15 +39846,15 @@
       </w:r>
       <w:r>
         <w:rPr>
-          <w:rFonts w:ascii="BRH Devanagari" w:eastAsiaTheme="minorHAnsi" w:hAnsi="BRH Devanagari" w:cs="BRH Devanagari"/>
+          <w:rFonts w:ascii="BRH Devanagari Extra" w:eastAsiaTheme="minorHAnsi" w:hAnsi="BRH Devanagari Extra" w:cs="BRH Devanagari"/>
           <w:b/>
           <w:color w:val="000000"/>
-          <w:sz w:val="40"/>
+          <w:sz w:val="36"/>
           <w:szCs w:val="40"/>
           <w:highlight w:val="green"/>
           <w:lang w:eastAsia="en-US" w:bidi="ar-SA"/>
         </w:rPr>
-        <w:t>(aaÉç)</w:t>
+        <w:t>ò</w:t>
       </w:r>
       <w:r>
         <w:rPr>
@@ -40709,7 +41096,47 @@
           <w:szCs w:val="36"/>
           <w:lang w:eastAsia="en-US" w:bidi="hi-IN"/>
         </w:rPr>
-        <w:t xml:space="preserve">EýSèaÉÉý ÅÅUÉåþWûÌiÉ UÉåWû irÉÉåSèaÉÉýiÉÉ iÉÉåSèaÉÉýiÉÉ ÅÅUÉåþWûÌiÉý xÉÉqÉëÉÿerÉý(aqÉç)ý xÉÉqÉëÉÿerÉ(aqÉç) UÉåWûý irÉÉåSèaÉÉý iÉÉåSèaÉÉýiÉÉ ÅÅUÉåþWûÌiÉý xÉÉqÉëÉÿerÉqÉç | </w:t>
+        <w:t>EýSèaÉÉý ÅÅUÉåþWûÌiÉ UÉåWû irÉÉåSèaÉÉýiÉÉ iÉÉåSèaÉÉýiÉÉ ÅÅUÉåþWûÌiÉý xÉÉqÉëÉÿerÉý</w:t>
+      </w:r>
+      <w:r>
+        <w:rPr>
+          <w:rFonts w:ascii="BRH Devanagari Extra" w:eastAsiaTheme="minorHAnsi" w:hAnsi="BRH Devanagari Extra" w:cs="BRH Devanagari Extra"/>
+          <w:color w:val="FF0000"/>
+          <w:sz w:val="36"/>
+          <w:szCs w:val="36"/>
+          <w:lang w:eastAsia="en-US" w:bidi="hi-IN"/>
+        </w:rPr>
+        <w:t>óè</w:t>
+      </w:r>
+      <w:r>
+        <w:rPr>
+          <w:rFonts w:ascii="BRH Devanagari Extra" w:eastAsiaTheme="minorHAnsi" w:hAnsi="BRH Devanagari Extra" w:cs="BRH Devanagari Extra"/>
+          <w:color w:val="FF0000"/>
+          <w:sz w:val="36"/>
+          <w:szCs w:val="36"/>
+          <w:lang w:eastAsia="en-US" w:bidi="hi-IN"/>
+        </w:rPr>
+        <w:t>ý xÉÉqÉëÉÿerÉ</w:t>
+      </w:r>
+      <w:r>
+        <w:rPr>
+          <w:rFonts w:ascii="BRH Devanagari Extra" w:eastAsiaTheme="minorHAnsi" w:hAnsi="BRH Devanagari Extra" w:cs="BRH Devanagari Extra"/>
+          <w:color w:val="FF0000"/>
+          <w:sz w:val="36"/>
+          <w:szCs w:val="36"/>
+          <w:lang w:eastAsia="en-US" w:bidi="hi-IN"/>
+        </w:rPr>
+        <w:t>óè</w:t>
+      </w:r>
+      <w:r>
+        <w:rPr>
+          <w:rFonts w:ascii="BRH Devanagari Extra" w:eastAsiaTheme="minorHAnsi" w:hAnsi="BRH Devanagari Extra" w:cs="BRH Devanagari Extra"/>
+          <w:color w:val="FF0000"/>
+          <w:sz w:val="36"/>
+          <w:szCs w:val="36"/>
+          <w:lang w:eastAsia="en-US" w:bidi="hi-IN"/>
+        </w:rPr>
+        <w:t xml:space="preserve"> UÉåWûý irÉÉåSèaÉÉý iÉÉåSèaÉÉýiÉÉ ÅÅUÉåþWûÌiÉý xÉÉqÉëÉÿerÉqÉç | </w:t>
       </w:r>
     </w:p>
     <w:p>
@@ -40830,7 +41257,47 @@
           <w:szCs w:val="36"/>
           <w:lang w:eastAsia="en-US" w:bidi="hi-IN"/>
         </w:rPr>
-        <w:t xml:space="preserve">AÉ UÉåþWûÌiÉ UÉåWûý irÉÉUÉåþWûÌiÉý xÉÉqÉëÉÿerÉý(aqÉç)ý xÉÉqÉëÉÿerÉ(aqÉç) UÉåWûý irÉÉUÉåþWûÌiÉý xÉÉqÉëÉÿerÉqÉç | </w:t>
+        <w:t>AÉ UÉåþWûÌiÉ UÉåWûý irÉÉUÉåþWûÌiÉý xÉÉqÉëÉÿerÉý</w:t>
+      </w:r>
+      <w:r>
+        <w:rPr>
+          <w:rFonts w:ascii="BRH Devanagari Extra" w:eastAsiaTheme="minorHAnsi" w:hAnsi="BRH Devanagari Extra" w:cs="BRH Devanagari Extra"/>
+          <w:color w:val="FF0000"/>
+          <w:sz w:val="36"/>
+          <w:szCs w:val="36"/>
+          <w:lang w:eastAsia="en-US" w:bidi="hi-IN"/>
+        </w:rPr>
+        <w:t>óè</w:t>
+      </w:r>
+      <w:r>
+        <w:rPr>
+          <w:rFonts w:ascii="BRH Devanagari Extra" w:eastAsiaTheme="minorHAnsi" w:hAnsi="BRH Devanagari Extra" w:cs="BRH Devanagari Extra"/>
+          <w:color w:val="FF0000"/>
+          <w:sz w:val="36"/>
+          <w:szCs w:val="36"/>
+          <w:lang w:eastAsia="en-US" w:bidi="hi-IN"/>
+        </w:rPr>
+        <w:t>ý xÉÉqÉëÉÿerÉ</w:t>
+      </w:r>
+      <w:r>
+        <w:rPr>
+          <w:rFonts w:ascii="BRH Devanagari Extra" w:eastAsiaTheme="minorHAnsi" w:hAnsi="BRH Devanagari Extra" w:cs="BRH Devanagari Extra"/>
+          <w:color w:val="FF0000"/>
+          <w:sz w:val="36"/>
+          <w:szCs w:val="36"/>
+          <w:lang w:eastAsia="en-US" w:bidi="hi-IN"/>
+        </w:rPr>
+        <w:t>óè</w:t>
+      </w:r>
+      <w:r>
+        <w:rPr>
+          <w:rFonts w:ascii="BRH Devanagari Extra" w:eastAsiaTheme="minorHAnsi" w:hAnsi="BRH Devanagari Extra" w:cs="BRH Devanagari Extra"/>
+          <w:color w:val="FF0000"/>
+          <w:sz w:val="36"/>
+          <w:szCs w:val="36"/>
+          <w:lang w:eastAsia="en-US" w:bidi="hi-IN"/>
+        </w:rPr>
+        <w:t xml:space="preserve"> UÉåWûý irÉÉUÉåþWûÌiÉý xÉÉqÉëÉÿerÉqÉç | </w:t>
       </w:r>
     </w:p>
     <w:p>
@@ -40986,15 +41453,15 @@
       </w:r>
       <w:r>
         <w:rPr>
-          <w:rFonts w:ascii="BRH Devanagari" w:eastAsiaTheme="minorHAnsi" w:hAnsi="BRH Devanagari" w:cs="BRH Devanagari"/>
+          <w:rFonts w:ascii="BRH Devanagari Extra" w:eastAsiaTheme="minorHAnsi" w:hAnsi="BRH Devanagari Extra" w:cs="BRH Devanagari"/>
           <w:b/>
           <w:color w:val="000000"/>
-          <w:sz w:val="40"/>
+          <w:sz w:val="36"/>
           <w:szCs w:val="40"/>
           <w:highlight w:val="green"/>
           <w:lang w:eastAsia="en-US" w:bidi="ar-SA"/>
         </w:rPr>
-        <w:t>(aaÉç)</w:t>
+        <w:t>ò</w:t>
       </w:r>
       <w:r>
         <w:rPr>
@@ -41141,7 +41608,33 @@
           <w:lang w:val="en-US"/>
         </w:rPr>
         <w:br/>
-        <w:t>(JM-15)(JM-75)</w:t>
+        <w:t>(JM-</w:t>
+      </w:r>
+      <w:proofErr w:type="gramStart"/>
+      <w:r>
+        <w:rPr>
+          <w:rFonts w:ascii="Arial" w:hAnsi="Arial" w:cs="Arial"/>
+          <w:b/>
+          <w:bCs/>
+          <w:sz w:val="32"/>
+          <w:szCs w:val="32"/>
+          <w:highlight w:val="yellow"/>
+          <w:lang w:val="en-US"/>
+        </w:rPr>
+        <w:t>15)(</w:t>
+      </w:r>
+      <w:proofErr w:type="gramEnd"/>
+      <w:r>
+        <w:rPr>
+          <w:rFonts w:ascii="Arial" w:hAnsi="Arial" w:cs="Arial"/>
+          <w:b/>
+          <w:bCs/>
+          <w:sz w:val="32"/>
+          <w:szCs w:val="32"/>
+          <w:highlight w:val="yellow"/>
+          <w:lang w:val="en-US"/>
+        </w:rPr>
+        <w:t>JM-75)</w:t>
       </w:r>
     </w:p>
     <w:p>
@@ -41187,8 +41680,20 @@
           <w:szCs w:val="40"/>
           <w:lang w:eastAsia="en-US" w:bidi="hi-IN"/>
         </w:rPr>
-        <w:t>…¡ûUåprÉÉå AÌ…¡ûUåprÉÈ )</w:t>
-      </w:r>
+        <w:t>…¡ûUåprÉÉå AÌ…¡</w:t>
+      </w:r>
+      <w:proofErr w:type="gramStart"/>
+      <w:r>
+        <w:rPr>
+          <w:rFonts w:ascii="BRH Devanagari" w:eastAsiaTheme="minorHAnsi" w:hAnsi="BRH Devanagari" w:cs="BRH Devanagari"/>
+          <w:color w:val="FF0000"/>
+          <w:sz w:val="40"/>
+          <w:szCs w:val="40"/>
+          <w:lang w:eastAsia="en-US" w:bidi="hi-IN"/>
+        </w:rPr>
+        <w:t>ûUåprÉÈ )</w:t>
+      </w:r>
+      <w:proofErr w:type="gramEnd"/>
     </w:p>
     <w:p>
       <w:pPr>
@@ -42717,7 +43222,27 @@
           <w:szCs w:val="40"/>
           <w:lang w:eastAsia="en-US" w:bidi="hi-IN"/>
         </w:rPr>
-        <w:t xml:space="preserve">AýlÉýqÉý SýSèprÉÉåÿ(1ý) ÅSèprÉÉåþ ÅlÉqÉ SlÉqÉ SýSèprÉÈ xÉ(aqÉç) xÉqÉýSèprÉÉåþ ÅlÉqÉ SlÉqÉ SýSèprÉÈ xÉqÉç | </w:t>
+        <w:t>AýlÉýqÉý SýSèprÉÉåÿ(1ý) ÅSèprÉÉåþ ÅlÉqÉ SlÉqÉ SýSèprÉÈ xÉ</w:t>
+      </w:r>
+      <w:r>
+        <w:rPr>
+          <w:rFonts w:ascii="BRH Devanagari Extra" w:eastAsiaTheme="minorHAnsi" w:hAnsi="BRH Devanagari Extra" w:cs="BRH Devanagari Extra"/>
+          <w:color w:val="FF0000"/>
+          <w:sz w:val="36"/>
+          <w:szCs w:val="40"/>
+          <w:lang w:eastAsia="en-US" w:bidi="hi-IN"/>
+        </w:rPr>
+        <w:t>óè</w:t>
+      </w:r>
+      <w:r>
+        <w:rPr>
+          <w:rFonts w:ascii="BRH Devanagari Extra" w:eastAsiaTheme="minorHAnsi" w:hAnsi="BRH Devanagari Extra" w:cs="BRH Devanagari Extra"/>
+          <w:color w:val="FF0000"/>
+          <w:sz w:val="40"/>
+          <w:szCs w:val="40"/>
+          <w:lang w:eastAsia="en-US" w:bidi="hi-IN"/>
+        </w:rPr>
+        <w:t xml:space="preserve"> xÉqÉýSèprÉÉåþ ÅlÉqÉ SlÉqÉ SýSèprÉÈ xÉqÉç | </w:t>
       </w:r>
     </w:p>
     <w:p>
@@ -43726,7 +44251,18 @@
           <w:szCs w:val="40"/>
           <w:lang w:bidi="ar-SA"/>
         </w:rPr>
-        <w:t>×erÉÉ(</w:t>
+        <w:t>×</w:t>
+      </w:r>
+      <w:proofErr w:type="gramStart"/>
+      <w:r>
+        <w:rPr>
+          <w:rFonts w:ascii="BRH Devanagari Extra" w:hAnsi="BRH Devanagari Extra" w:cs="BRH Devanagari Extra"/>
+          <w:b/>
+          <w:sz w:val="40"/>
+          <w:szCs w:val="40"/>
+          <w:lang w:bidi="ar-SA"/>
+        </w:rPr>
+        <w:t>erÉÉ(</w:t>
       </w:r>
       <w:r>
         <w:rPr>
@@ -43746,7 +44282,18 @@
           <w:szCs w:val="40"/>
           <w:lang w:bidi="ar-SA"/>
         </w:rPr>
-        <w:t xml:space="preserve">)ÍqÉÌiÉþ - </w:t>
+        <w:t>)ÍqÉÌiÉþ</w:t>
+      </w:r>
+      <w:proofErr w:type="gramEnd"/>
+      <w:r>
+        <w:rPr>
+          <w:rFonts w:ascii="BRH Devanagari Extra" w:hAnsi="BRH Devanagari Extra" w:cs="BRH Devanagari Extra"/>
+          <w:b/>
+          <w:sz w:val="40"/>
+          <w:szCs w:val="40"/>
+          <w:lang w:bidi="ar-SA"/>
+        </w:rPr>
+        <w:t xml:space="preserve"> - </w:t>
       </w:r>
       <w:r>
         <w:rPr>
@@ -45661,7 +46208,47 @@
           <w:sz w:val="36"/>
           <w:szCs w:val="36"/>
         </w:rPr>
-        <w:t xml:space="preserve"> AaÉëå,  mÉÉuÉMüÉå ÅmÉïrÉÌiÉ,  CÌiÉ cÉ || </w:t>
+        <w:t xml:space="preserve"> </w:t>
+      </w:r>
+      <w:proofErr w:type="gramStart"/>
+      <w:r>
+        <w:rPr>
+          <w:rFonts w:ascii="BRH Devanagari" w:hAnsi="BRH Devanagari" w:cs="BRH Devanagari"/>
+          <w:color w:val="000000"/>
+          <w:sz w:val="36"/>
+          <w:szCs w:val="36"/>
+        </w:rPr>
+        <w:t>AaÉëå,  mÉÉuÉMüÉå</w:t>
+      </w:r>
+      <w:proofErr w:type="gramEnd"/>
+      <w:r>
+        <w:rPr>
+          <w:rFonts w:ascii="BRH Devanagari" w:hAnsi="BRH Devanagari" w:cs="BRH Devanagari"/>
+          <w:color w:val="000000"/>
+          <w:sz w:val="36"/>
+          <w:szCs w:val="36"/>
+        </w:rPr>
+        <w:t xml:space="preserve"> </w:t>
+      </w:r>
+      <w:proofErr w:type="gramStart"/>
+      <w:r>
+        <w:rPr>
+          <w:rFonts w:ascii="BRH Devanagari" w:hAnsi="BRH Devanagari" w:cs="BRH Devanagari"/>
+          <w:color w:val="000000"/>
+          <w:sz w:val="36"/>
+          <w:szCs w:val="36"/>
+        </w:rPr>
+        <w:t>ÅmÉïrÉÌiÉ,  CÌiÉ</w:t>
+      </w:r>
+      <w:proofErr w:type="gramEnd"/>
+      <w:r>
+        <w:rPr>
+          <w:rFonts w:ascii="BRH Devanagari" w:hAnsi="BRH Devanagari" w:cs="BRH Devanagari"/>
+          <w:color w:val="000000"/>
+          <w:sz w:val="36"/>
+          <w:szCs w:val="36"/>
+        </w:rPr>
+        <w:t xml:space="preserve"> cÉ || </w:t>
       </w:r>
     </w:p>
     <w:p>
@@ -47560,7 +48147,7 @@
 </file>
 
 <file path=word/endnotes.xml><?xml version="1.0" encoding="utf-8"?>
-<w:endnotes xmlns:wpc="http://schemas.microsoft.com/office/word/2010/wordprocessingCanvas" xmlns:cx="http://schemas.microsoft.com/office/drawing/2014/chartex" xmlns:cx1="http://schemas.microsoft.com/office/drawing/2015/9/8/chartex" xmlns:cx2="http://schemas.microsoft.com/office/drawing/2015/10/21/chartex" xmlns:cx3="http://schemas.microsoft.com/office/drawing/2016/5/9/chartex" xmlns:cx4="http://schemas.microsoft.com/office/drawing/2016/5/10/chartex" xmlns:cx5="http://schemas.microsoft.com/office/drawing/2016/5/11/chartex" xmlns:cx6="http://schemas.microsoft.com/office/drawing/2016/5/12/chartex" xmlns:cx7="http://schemas.microsoft.com/office/drawing/2016/5/13/chartex" xmlns:cx8="http://schemas.microsoft.com/office/drawing/2016/5/14/chartex" xmlns:mc="http://schemas.openxmlformats.org/markup-compatibility/2006" xmlns:aink="http://schemas.microsoft.com/office/drawing/2016/ink" xmlns:am3d="http://schemas.microsoft.com/office/drawing/2017/model3d" xmlns:o="urn:schemas-microsoft-com:office:office" xmlns:oel="http://schemas.microsoft.com/office/2019/extlst" xmlns:r="http://schemas.openxmlformats.org/officeDocument/2006/relationships" xmlns:m="http://schemas.openxmlformats.org/officeDocument/2006/math" xmlns:v="urn:schemas-microsoft-com:vml" xmlns:wp14="http://schemas.microsoft.com/office/word/2010/wordprocessingDrawing" xmlns:wp="http://schemas.openxmlformats.org/drawingml/2006/wordprocessingDrawing" xmlns:w10="urn:schemas-microsoft-com:office:word" xmlns:w="http://schemas.openxmlformats.org/wordprocessingml/2006/main" xmlns:w14="http://schemas.microsoft.com/office/word/2010/wordml" xmlns:w15="http://schemas.microsoft.com/office/word/2012/wordml" xmlns:w16cex="http://schemas.microsoft.com/office/word/2018/wordml/cex" xmlns:w16cid="http://schemas.microsoft.com/office/word/2016/wordml/cid" xmlns:w16="http://schemas.microsoft.com/office/word/2018/wordml" xmlns:w16du="http://schemas.microsoft.com/office/word/2023/wordml/word16du" xmlns:w16sdtdh="http://schemas.microsoft.com/office/word/2020/wordml/sdtdatahash" xmlns:w16se="http://schemas.microsoft.com/office/word/2015/wordml/symex" xmlns:wpg="http://schemas.microsoft.com/office/word/2010/wordprocessingGroup" xmlns:wpi="http://schemas.microsoft.com/office/word/2010/wordprocessingInk" xmlns:wne="http://schemas.microsoft.com/office/word/2006/wordml" xmlns:wps="http://schemas.microsoft.com/office/word/2010/wordprocessingShape" mc:Ignorable="w14 w15 w16se w16cid w16 w16cex w16sdtdh w16du wp14">
+<w:endnotes xmlns:wpc="http://schemas.microsoft.com/office/word/2010/wordprocessingCanvas" xmlns:cx="http://schemas.microsoft.com/office/drawing/2014/chartex" xmlns:cx1="http://schemas.microsoft.com/office/drawing/2015/9/8/chartex" xmlns:cx2="http://schemas.microsoft.com/office/drawing/2015/10/21/chartex" xmlns:cx3="http://schemas.microsoft.com/office/drawing/2016/5/9/chartex" xmlns:cx4="http://schemas.microsoft.com/office/drawing/2016/5/10/chartex" xmlns:cx5="http://schemas.microsoft.com/office/drawing/2016/5/11/chartex" xmlns:cx6="http://schemas.microsoft.com/office/drawing/2016/5/12/chartex" xmlns:cx7="http://schemas.microsoft.com/office/drawing/2016/5/13/chartex" xmlns:cx8="http://schemas.microsoft.com/office/drawing/2016/5/14/chartex" xmlns:mc="http://schemas.openxmlformats.org/markup-compatibility/2006" xmlns:aink="http://schemas.microsoft.com/office/drawing/2016/ink" xmlns:am3d="http://schemas.microsoft.com/office/drawing/2017/model3d" xmlns:o="urn:schemas-microsoft-com:office:office" xmlns:oel="http://schemas.microsoft.com/office/2019/extlst" xmlns:r="http://schemas.openxmlformats.org/officeDocument/2006/relationships" xmlns:m="http://schemas.openxmlformats.org/officeDocument/2006/math" xmlns:v="urn:schemas-microsoft-com:vml" xmlns:wp14="http://schemas.microsoft.com/office/word/2010/wordprocessingDrawing" xmlns:wp="http://schemas.openxmlformats.org/drawingml/2006/wordprocessingDrawing" xmlns:w10="urn:schemas-microsoft-com:office:word" xmlns:w="http://schemas.openxmlformats.org/wordprocessingml/2006/main" xmlns:w14="http://schemas.microsoft.com/office/word/2010/wordml" xmlns:w15="http://schemas.microsoft.com/office/word/2012/wordml" xmlns:w16cei="http://schemas.microsoft.com/office/word/2026/wordml/cei" xmlns:w16cex="http://schemas.microsoft.com/office/word/2018/wordml/cex" xmlns:w16cid="http://schemas.microsoft.com/office/word/2016/wordml/cid" xmlns:w16="http://schemas.microsoft.com/office/word/2018/wordml" xmlns:w16du="http://schemas.microsoft.com/office/word/2023/wordml/word16du" xmlns:w16sdtdh="http://schemas.microsoft.com/office/word/2020/wordml/sdtdatahash" xmlns:w16sdtfl="http://schemas.microsoft.com/office/word/2024/wordml/sdtformatlock" xmlns:w16se="http://schemas.microsoft.com/office/word/2015/wordml/symex" xmlns:wpg="http://schemas.microsoft.com/office/word/2010/wordprocessingGroup" xmlns:wpi="http://schemas.microsoft.com/office/word/2010/wordprocessingInk" xmlns:wne="http://schemas.microsoft.com/office/word/2006/wordml" xmlns:wps="http://schemas.microsoft.com/office/word/2010/wordprocessingShape" mc:Ignorable="w14 w15 w16se w16cid w16 w16cex w16sdtdh w16sdtfl w16du wp14">
   <w:endnote w:type="separator" w:id="-1">
     <w:p>
       <w:r>
@@ -47579,7 +48166,7 @@
 </file>
 
 <file path=word/footer1.xml><?xml version="1.0" encoding="utf-8"?>
-<w:ftr xmlns:wpc="http://schemas.microsoft.com/office/word/2010/wordprocessingCanvas" xmlns:cx="http://schemas.microsoft.com/office/drawing/2014/chartex" xmlns:cx1="http://schemas.microsoft.com/office/drawing/2015/9/8/chartex" xmlns:cx2="http://schemas.microsoft.com/office/drawing/2015/10/21/chartex" xmlns:cx3="http://schemas.microsoft.com/office/drawing/2016/5/9/chartex" xmlns:cx4="http://schemas.microsoft.com/office/drawing/2016/5/10/chartex" xmlns:cx5="http://schemas.microsoft.com/office/drawing/2016/5/11/chartex" xmlns:cx6="http://schemas.microsoft.com/office/drawing/2016/5/12/chartex" xmlns:cx7="http://schemas.microsoft.com/office/drawing/2016/5/13/chartex" xmlns:cx8="http://schemas.microsoft.com/office/drawing/2016/5/14/chartex" xmlns:mc="http://schemas.openxmlformats.org/markup-compatibility/2006" xmlns:aink="http://schemas.microsoft.com/office/drawing/2016/ink" xmlns:am3d="http://schemas.microsoft.com/office/drawing/2017/model3d" xmlns:o="urn:schemas-microsoft-com:office:office" xmlns:oel="http://schemas.microsoft.com/office/2019/extlst" xmlns:r="http://schemas.openxmlformats.org/officeDocument/2006/relationships" xmlns:m="http://schemas.openxmlformats.org/officeDocument/2006/math" xmlns:v="urn:schemas-microsoft-com:vml" xmlns:wp14="http://schemas.microsoft.com/office/word/2010/wordprocessingDrawing" xmlns:wp="http://schemas.openxmlformats.org/drawingml/2006/wordprocessingDrawing" xmlns:w10="urn:schemas-microsoft-com:office:word" xmlns:w="http://schemas.openxmlformats.org/wordprocessingml/2006/main" xmlns:w14="http://schemas.microsoft.com/office/word/2010/wordml" xmlns:w15="http://schemas.microsoft.com/office/word/2012/wordml" xmlns:w16cex="http://schemas.microsoft.com/office/word/2018/wordml/cex" xmlns:w16cid="http://schemas.microsoft.com/office/word/2016/wordml/cid" xmlns:w16="http://schemas.microsoft.com/office/word/2018/wordml" xmlns:w16du="http://schemas.microsoft.com/office/word/2023/wordml/word16du" xmlns:w16sdtdh="http://schemas.microsoft.com/office/word/2020/wordml/sdtdatahash" xmlns:w16se="http://schemas.microsoft.com/office/word/2015/wordml/symex" xmlns:wpg="http://schemas.microsoft.com/office/word/2010/wordprocessingGroup" xmlns:wpi="http://schemas.microsoft.com/office/word/2010/wordprocessingInk" xmlns:wne="http://schemas.microsoft.com/office/word/2006/wordml" xmlns:wps="http://schemas.microsoft.com/office/word/2010/wordprocessingShape" mc:Ignorable="w14 w15 w16se w16cid w16 w16cex w16sdtdh w16du wp14">
+<w:ftr xmlns:wpc="http://schemas.microsoft.com/office/word/2010/wordprocessingCanvas" xmlns:cx="http://schemas.microsoft.com/office/drawing/2014/chartex" xmlns:cx1="http://schemas.microsoft.com/office/drawing/2015/9/8/chartex" xmlns:cx2="http://schemas.microsoft.com/office/drawing/2015/10/21/chartex" xmlns:cx3="http://schemas.microsoft.com/office/drawing/2016/5/9/chartex" xmlns:cx4="http://schemas.microsoft.com/office/drawing/2016/5/10/chartex" xmlns:cx5="http://schemas.microsoft.com/office/drawing/2016/5/11/chartex" xmlns:cx6="http://schemas.microsoft.com/office/drawing/2016/5/12/chartex" xmlns:cx7="http://schemas.microsoft.com/office/drawing/2016/5/13/chartex" xmlns:cx8="http://schemas.microsoft.com/office/drawing/2016/5/14/chartex" xmlns:mc="http://schemas.openxmlformats.org/markup-compatibility/2006" xmlns:aink="http://schemas.microsoft.com/office/drawing/2016/ink" xmlns:am3d="http://schemas.microsoft.com/office/drawing/2017/model3d" xmlns:o="urn:schemas-microsoft-com:office:office" xmlns:oel="http://schemas.microsoft.com/office/2019/extlst" xmlns:r="http://schemas.openxmlformats.org/officeDocument/2006/relationships" xmlns:m="http://schemas.openxmlformats.org/officeDocument/2006/math" xmlns:v="urn:schemas-microsoft-com:vml" xmlns:wp14="http://schemas.microsoft.com/office/word/2010/wordprocessingDrawing" xmlns:wp="http://schemas.openxmlformats.org/drawingml/2006/wordprocessingDrawing" xmlns:w10="urn:schemas-microsoft-com:office:word" xmlns:w="http://schemas.openxmlformats.org/wordprocessingml/2006/main" xmlns:w14="http://schemas.microsoft.com/office/word/2010/wordml" xmlns:w15="http://schemas.microsoft.com/office/word/2012/wordml" xmlns:w16cei="http://schemas.microsoft.com/office/word/2026/wordml/cei" xmlns:w16cex="http://schemas.microsoft.com/office/word/2018/wordml/cex" xmlns:w16cid="http://schemas.microsoft.com/office/word/2016/wordml/cid" xmlns:w16="http://schemas.microsoft.com/office/word/2018/wordml" xmlns:w16du="http://schemas.microsoft.com/office/word/2023/wordml/word16du" xmlns:w16sdtdh="http://schemas.microsoft.com/office/word/2020/wordml/sdtdatahash" xmlns:w16sdtfl="http://schemas.microsoft.com/office/word/2024/wordml/sdtformatlock" xmlns:w16se="http://schemas.microsoft.com/office/word/2015/wordml/symex" xmlns:wpg="http://schemas.microsoft.com/office/word/2010/wordprocessingGroup" xmlns:wpi="http://schemas.microsoft.com/office/word/2010/wordprocessingInk" xmlns:wne="http://schemas.microsoft.com/office/word/2006/wordml" xmlns:wps="http://schemas.microsoft.com/office/word/2010/wordprocessingShape" mc:Ignorable="w14 w15 w16se w16cid w16 w16cex w16sdtdh w16sdtfl w16du wp14">
   <w:p>
     <w:pPr>
       <w:pBdr>
@@ -47755,7 +48342,7 @@
 </file>
 
 <file path=word/footer2.xml><?xml version="1.0" encoding="utf-8"?>
-<w:ftr xmlns:wpc="http://schemas.microsoft.com/office/word/2010/wordprocessingCanvas" xmlns:cx="http://schemas.microsoft.com/office/drawing/2014/chartex" xmlns:cx1="http://schemas.microsoft.com/office/drawing/2015/9/8/chartex" xmlns:cx2="http://schemas.microsoft.com/office/drawing/2015/10/21/chartex" xmlns:cx3="http://schemas.microsoft.com/office/drawing/2016/5/9/chartex" xmlns:cx4="http://schemas.microsoft.com/office/drawing/2016/5/10/chartex" xmlns:cx5="http://schemas.microsoft.com/office/drawing/2016/5/11/chartex" xmlns:cx6="http://schemas.microsoft.com/office/drawing/2016/5/12/chartex" xmlns:cx7="http://schemas.microsoft.com/office/drawing/2016/5/13/chartex" xmlns:cx8="http://schemas.microsoft.com/office/drawing/2016/5/14/chartex" xmlns:mc="http://schemas.openxmlformats.org/markup-compatibility/2006" xmlns:aink="http://schemas.microsoft.com/office/drawing/2016/ink" xmlns:am3d="http://schemas.microsoft.com/office/drawing/2017/model3d" xmlns:o="urn:schemas-microsoft-com:office:office" xmlns:oel="http://schemas.microsoft.com/office/2019/extlst" xmlns:r="http://schemas.openxmlformats.org/officeDocument/2006/relationships" xmlns:m="http://schemas.openxmlformats.org/officeDocument/2006/math" xmlns:v="urn:schemas-microsoft-com:vml" xmlns:wp14="http://schemas.microsoft.com/office/word/2010/wordprocessingDrawing" xmlns:wp="http://schemas.openxmlformats.org/drawingml/2006/wordprocessingDrawing" xmlns:w10="urn:schemas-microsoft-com:office:word" xmlns:w="http://schemas.openxmlformats.org/wordprocessingml/2006/main" xmlns:w14="http://schemas.microsoft.com/office/word/2010/wordml" xmlns:w15="http://schemas.microsoft.com/office/word/2012/wordml" xmlns:w16cex="http://schemas.microsoft.com/office/word/2018/wordml/cex" xmlns:w16cid="http://schemas.microsoft.com/office/word/2016/wordml/cid" xmlns:w16="http://schemas.microsoft.com/office/word/2018/wordml" xmlns:w16du="http://schemas.microsoft.com/office/word/2023/wordml/word16du" xmlns:w16sdtdh="http://schemas.microsoft.com/office/word/2020/wordml/sdtdatahash" xmlns:w16se="http://schemas.microsoft.com/office/word/2015/wordml/symex" xmlns:wpg="http://schemas.microsoft.com/office/word/2010/wordprocessingGroup" xmlns:wpi="http://schemas.microsoft.com/office/word/2010/wordprocessingInk" xmlns:wne="http://schemas.microsoft.com/office/word/2006/wordml" xmlns:wps="http://schemas.microsoft.com/office/word/2010/wordprocessingShape" mc:Ignorable="w14 w15 w16se w16cid w16 w16cex w16sdtdh w16du wp14">
+<w:ftr xmlns:wpc="http://schemas.microsoft.com/office/word/2010/wordprocessingCanvas" xmlns:cx="http://schemas.microsoft.com/office/drawing/2014/chartex" xmlns:cx1="http://schemas.microsoft.com/office/drawing/2015/9/8/chartex" xmlns:cx2="http://schemas.microsoft.com/office/drawing/2015/10/21/chartex" xmlns:cx3="http://schemas.microsoft.com/office/drawing/2016/5/9/chartex" xmlns:cx4="http://schemas.microsoft.com/office/drawing/2016/5/10/chartex" xmlns:cx5="http://schemas.microsoft.com/office/drawing/2016/5/11/chartex" xmlns:cx6="http://schemas.microsoft.com/office/drawing/2016/5/12/chartex" xmlns:cx7="http://schemas.microsoft.com/office/drawing/2016/5/13/chartex" xmlns:cx8="http://schemas.microsoft.com/office/drawing/2016/5/14/chartex" xmlns:mc="http://schemas.openxmlformats.org/markup-compatibility/2006" xmlns:aink="http://schemas.microsoft.com/office/drawing/2016/ink" xmlns:am3d="http://schemas.microsoft.com/office/drawing/2017/model3d" xmlns:o="urn:schemas-microsoft-com:office:office" xmlns:oel="http://schemas.microsoft.com/office/2019/extlst" xmlns:r="http://schemas.openxmlformats.org/officeDocument/2006/relationships" xmlns:m="http://schemas.openxmlformats.org/officeDocument/2006/math" xmlns:v="urn:schemas-microsoft-com:vml" xmlns:wp14="http://schemas.microsoft.com/office/word/2010/wordprocessingDrawing" xmlns:wp="http://schemas.openxmlformats.org/drawingml/2006/wordprocessingDrawing" xmlns:w10="urn:schemas-microsoft-com:office:word" xmlns:w="http://schemas.openxmlformats.org/wordprocessingml/2006/main" xmlns:w14="http://schemas.microsoft.com/office/word/2010/wordml" xmlns:w15="http://schemas.microsoft.com/office/word/2012/wordml" xmlns:w16cei="http://schemas.microsoft.com/office/word/2026/wordml/cei" xmlns:w16cex="http://schemas.microsoft.com/office/word/2018/wordml/cex" xmlns:w16cid="http://schemas.microsoft.com/office/word/2016/wordml/cid" xmlns:w16="http://schemas.microsoft.com/office/word/2018/wordml" xmlns:w16du="http://schemas.microsoft.com/office/word/2023/wordml/word16du" xmlns:w16sdtdh="http://schemas.microsoft.com/office/word/2020/wordml/sdtdatahash" xmlns:w16sdtfl="http://schemas.microsoft.com/office/word/2024/wordml/sdtformatlock" xmlns:w16se="http://schemas.microsoft.com/office/word/2015/wordml/symex" xmlns:wpg="http://schemas.microsoft.com/office/word/2010/wordprocessingGroup" xmlns:wpi="http://schemas.microsoft.com/office/word/2010/wordprocessingInk" xmlns:wne="http://schemas.microsoft.com/office/word/2006/wordml" xmlns:wps="http://schemas.microsoft.com/office/word/2010/wordprocessingShape" mc:Ignorable="w14 w15 w16se w16cid w16 w16cex w16sdtdh w16sdtfl w16du wp14">
   <w:p>
     <w:pPr>
       <w:pBdr>
@@ -47928,7 +48515,7 @@
 </file>
 
 <file path=word/footer3.xml><?xml version="1.0" encoding="utf-8"?>
-<w:ftr xmlns:wpc="http://schemas.microsoft.com/office/word/2010/wordprocessingCanvas" xmlns:cx="http://schemas.microsoft.com/office/drawing/2014/chartex" xmlns:cx1="http://schemas.microsoft.com/office/drawing/2015/9/8/chartex" xmlns:cx2="http://schemas.microsoft.com/office/drawing/2015/10/21/chartex" xmlns:cx3="http://schemas.microsoft.com/office/drawing/2016/5/9/chartex" xmlns:cx4="http://schemas.microsoft.com/office/drawing/2016/5/10/chartex" xmlns:cx5="http://schemas.microsoft.com/office/drawing/2016/5/11/chartex" xmlns:cx6="http://schemas.microsoft.com/office/drawing/2016/5/12/chartex" xmlns:cx7="http://schemas.microsoft.com/office/drawing/2016/5/13/chartex" xmlns:cx8="http://schemas.microsoft.com/office/drawing/2016/5/14/chartex" xmlns:mc="http://schemas.openxmlformats.org/markup-compatibility/2006" xmlns:aink="http://schemas.microsoft.com/office/drawing/2016/ink" xmlns:am3d="http://schemas.microsoft.com/office/drawing/2017/model3d" xmlns:o="urn:schemas-microsoft-com:office:office" xmlns:oel="http://schemas.microsoft.com/office/2019/extlst" xmlns:r="http://schemas.openxmlformats.org/officeDocument/2006/relationships" xmlns:m="http://schemas.openxmlformats.org/officeDocument/2006/math" xmlns:v="urn:schemas-microsoft-com:vml" xmlns:wp14="http://schemas.microsoft.com/office/word/2010/wordprocessingDrawing" xmlns:wp="http://schemas.openxmlformats.org/drawingml/2006/wordprocessingDrawing" xmlns:w10="urn:schemas-microsoft-com:office:word" xmlns:w="http://schemas.openxmlformats.org/wordprocessingml/2006/main" xmlns:w14="http://schemas.microsoft.com/office/word/2010/wordml" xmlns:w15="http://schemas.microsoft.com/office/word/2012/wordml" xmlns:w16cex="http://schemas.microsoft.com/office/word/2018/wordml/cex" xmlns:w16cid="http://schemas.microsoft.com/office/word/2016/wordml/cid" xmlns:w16="http://schemas.microsoft.com/office/word/2018/wordml" xmlns:w16du="http://schemas.microsoft.com/office/word/2023/wordml/word16du" xmlns:w16sdtdh="http://schemas.microsoft.com/office/word/2020/wordml/sdtdatahash" xmlns:w16se="http://schemas.microsoft.com/office/word/2015/wordml/symex" xmlns:wpg="http://schemas.microsoft.com/office/word/2010/wordprocessingGroup" xmlns:wpi="http://schemas.microsoft.com/office/word/2010/wordprocessingInk" xmlns:wne="http://schemas.microsoft.com/office/word/2006/wordml" xmlns:wps="http://schemas.microsoft.com/office/word/2010/wordprocessingShape" mc:Ignorable="w14 w15 w16se w16cid w16 w16cex w16sdtdh w16du wp14">
+<w:ftr xmlns:wpc="http://schemas.microsoft.com/office/word/2010/wordprocessingCanvas" xmlns:cx="http://schemas.microsoft.com/office/drawing/2014/chartex" xmlns:cx1="http://schemas.microsoft.com/office/drawing/2015/9/8/chartex" xmlns:cx2="http://schemas.microsoft.com/office/drawing/2015/10/21/chartex" xmlns:cx3="http://schemas.microsoft.com/office/drawing/2016/5/9/chartex" xmlns:cx4="http://schemas.microsoft.com/office/drawing/2016/5/10/chartex" xmlns:cx5="http://schemas.microsoft.com/office/drawing/2016/5/11/chartex" xmlns:cx6="http://schemas.microsoft.com/office/drawing/2016/5/12/chartex" xmlns:cx7="http://schemas.microsoft.com/office/drawing/2016/5/13/chartex" xmlns:cx8="http://schemas.microsoft.com/office/drawing/2016/5/14/chartex" xmlns:mc="http://schemas.openxmlformats.org/markup-compatibility/2006" xmlns:aink="http://schemas.microsoft.com/office/drawing/2016/ink" xmlns:am3d="http://schemas.microsoft.com/office/drawing/2017/model3d" xmlns:o="urn:schemas-microsoft-com:office:office" xmlns:oel="http://schemas.microsoft.com/office/2019/extlst" xmlns:r="http://schemas.openxmlformats.org/officeDocument/2006/relationships" xmlns:m="http://schemas.openxmlformats.org/officeDocument/2006/math" xmlns:v="urn:schemas-microsoft-com:vml" xmlns:wp14="http://schemas.microsoft.com/office/word/2010/wordprocessingDrawing" xmlns:wp="http://schemas.openxmlformats.org/drawingml/2006/wordprocessingDrawing" xmlns:w10="urn:schemas-microsoft-com:office:word" xmlns:w="http://schemas.openxmlformats.org/wordprocessingml/2006/main" xmlns:w14="http://schemas.microsoft.com/office/word/2010/wordml" xmlns:w15="http://schemas.microsoft.com/office/word/2012/wordml" xmlns:w16cei="http://schemas.microsoft.com/office/word/2026/wordml/cei" xmlns:w16cex="http://schemas.microsoft.com/office/word/2018/wordml/cex" xmlns:w16cid="http://schemas.microsoft.com/office/word/2016/wordml/cid" xmlns:w16="http://schemas.microsoft.com/office/word/2018/wordml" xmlns:w16du="http://schemas.microsoft.com/office/word/2023/wordml/word16du" xmlns:w16sdtdh="http://schemas.microsoft.com/office/word/2020/wordml/sdtdatahash" xmlns:w16sdtfl="http://schemas.microsoft.com/office/word/2024/wordml/sdtformatlock" xmlns:w16se="http://schemas.microsoft.com/office/word/2015/wordml/symex" xmlns:wpg="http://schemas.microsoft.com/office/word/2010/wordprocessingGroup" xmlns:wpi="http://schemas.microsoft.com/office/word/2010/wordprocessingInk" xmlns:wne="http://schemas.microsoft.com/office/word/2006/wordml" xmlns:wps="http://schemas.microsoft.com/office/word/2010/wordprocessingShape" mc:Ignorable="w14 w15 w16se w16cid w16 w16cex w16sdtdh w16sdtfl w16du wp14">
   <w:p>
     <w:pPr>
       <w:pBdr>
@@ -48059,7 +48646,7 @@
 </file>
 
 <file path=word/footnotes.xml><?xml version="1.0" encoding="utf-8"?>
-<w:footnotes xmlns:wpc="http://schemas.microsoft.com/office/word/2010/wordprocessingCanvas" xmlns:cx="http://schemas.microsoft.com/office/drawing/2014/chartex" xmlns:cx1="http://schemas.microsoft.com/office/drawing/2015/9/8/chartex" xmlns:cx2="http://schemas.microsoft.com/office/drawing/2015/10/21/chartex" xmlns:cx3="http://schemas.microsoft.com/office/drawing/2016/5/9/chartex" xmlns:cx4="http://schemas.microsoft.com/office/drawing/2016/5/10/chartex" xmlns:cx5="http://schemas.microsoft.com/office/drawing/2016/5/11/chartex" xmlns:cx6="http://schemas.microsoft.com/office/drawing/2016/5/12/chartex" xmlns:cx7="http://schemas.microsoft.com/office/drawing/2016/5/13/chartex" xmlns:cx8="http://schemas.microsoft.com/office/drawing/2016/5/14/chartex" xmlns:mc="http://schemas.openxmlformats.org/markup-compatibility/2006" xmlns:aink="http://schemas.microsoft.com/office/drawing/2016/ink" xmlns:am3d="http://schemas.microsoft.com/office/drawing/2017/model3d" xmlns:o="urn:schemas-microsoft-com:office:office" xmlns:oel="http://schemas.microsoft.com/office/2019/extlst" xmlns:r="http://schemas.openxmlformats.org/officeDocument/2006/relationships" xmlns:m="http://schemas.openxmlformats.org/officeDocument/2006/math" xmlns:v="urn:schemas-microsoft-com:vml" xmlns:wp14="http://schemas.microsoft.com/office/word/2010/wordprocessingDrawing" xmlns:wp="http://schemas.openxmlformats.org/drawingml/2006/wordprocessingDrawing" xmlns:w10="urn:schemas-microsoft-com:office:word" xmlns:w="http://schemas.openxmlformats.org/wordprocessingml/2006/main" xmlns:w14="http://schemas.microsoft.com/office/word/2010/wordml" xmlns:w15="http://schemas.microsoft.com/office/word/2012/wordml" xmlns:w16cex="http://schemas.microsoft.com/office/word/2018/wordml/cex" xmlns:w16cid="http://schemas.microsoft.com/office/word/2016/wordml/cid" xmlns:w16="http://schemas.microsoft.com/office/word/2018/wordml" xmlns:w16du="http://schemas.microsoft.com/office/word/2023/wordml/word16du" xmlns:w16sdtdh="http://schemas.microsoft.com/office/word/2020/wordml/sdtdatahash" xmlns:w16se="http://schemas.microsoft.com/office/word/2015/wordml/symex" xmlns:wpg="http://schemas.microsoft.com/office/word/2010/wordprocessingGroup" xmlns:wpi="http://schemas.microsoft.com/office/word/2010/wordprocessingInk" xmlns:wne="http://schemas.microsoft.com/office/word/2006/wordml" xmlns:wps="http://schemas.microsoft.com/office/word/2010/wordprocessingShape" mc:Ignorable="w14 w15 w16se w16cid w16 w16cex w16sdtdh w16du wp14">
+<w:footnotes xmlns:wpc="http://schemas.microsoft.com/office/word/2010/wordprocessingCanvas" xmlns:cx="http://schemas.microsoft.com/office/drawing/2014/chartex" xmlns:cx1="http://schemas.microsoft.com/office/drawing/2015/9/8/chartex" xmlns:cx2="http://schemas.microsoft.com/office/drawing/2015/10/21/chartex" xmlns:cx3="http://schemas.microsoft.com/office/drawing/2016/5/9/chartex" xmlns:cx4="http://schemas.microsoft.com/office/drawing/2016/5/10/chartex" xmlns:cx5="http://schemas.microsoft.com/office/drawing/2016/5/11/chartex" xmlns:cx6="http://schemas.microsoft.com/office/drawing/2016/5/12/chartex" xmlns:cx7="http://schemas.microsoft.com/office/drawing/2016/5/13/chartex" xmlns:cx8="http://schemas.microsoft.com/office/drawing/2016/5/14/chartex" xmlns:mc="http://schemas.openxmlformats.org/markup-compatibility/2006" xmlns:aink="http://schemas.microsoft.com/office/drawing/2016/ink" xmlns:am3d="http://schemas.microsoft.com/office/drawing/2017/model3d" xmlns:o="urn:schemas-microsoft-com:office:office" xmlns:oel="http://schemas.microsoft.com/office/2019/extlst" xmlns:r="http://schemas.openxmlformats.org/officeDocument/2006/relationships" xmlns:m="http://schemas.openxmlformats.org/officeDocument/2006/math" xmlns:v="urn:schemas-microsoft-com:vml" xmlns:wp14="http://schemas.microsoft.com/office/word/2010/wordprocessingDrawing" xmlns:wp="http://schemas.openxmlformats.org/drawingml/2006/wordprocessingDrawing" xmlns:w10="urn:schemas-microsoft-com:office:word" xmlns:w="http://schemas.openxmlformats.org/wordprocessingml/2006/main" xmlns:w14="http://schemas.microsoft.com/office/word/2010/wordml" xmlns:w15="http://schemas.microsoft.com/office/word/2012/wordml" xmlns:w16cei="http://schemas.microsoft.com/office/word/2026/wordml/cei" xmlns:w16cex="http://schemas.microsoft.com/office/word/2018/wordml/cex" xmlns:w16cid="http://schemas.microsoft.com/office/word/2016/wordml/cid" xmlns:w16="http://schemas.microsoft.com/office/word/2018/wordml" xmlns:w16du="http://schemas.microsoft.com/office/word/2023/wordml/word16du" xmlns:w16sdtdh="http://schemas.microsoft.com/office/word/2020/wordml/sdtdatahash" xmlns:w16sdtfl="http://schemas.microsoft.com/office/word/2024/wordml/sdtformatlock" xmlns:w16se="http://schemas.microsoft.com/office/word/2015/wordml/symex" xmlns:wpg="http://schemas.microsoft.com/office/word/2010/wordprocessingGroup" xmlns:wpi="http://schemas.microsoft.com/office/word/2010/wordprocessingInk" xmlns:wne="http://schemas.microsoft.com/office/word/2006/wordml" xmlns:wps="http://schemas.microsoft.com/office/word/2010/wordprocessingShape" mc:Ignorable="w14 w15 w16se w16cid w16 w16cex w16sdtdh w16sdtfl w16du wp14">
   <w:footnote w:type="separator" w:id="-1">
     <w:p>
       <w:r>
@@ -48078,7 +48665,7 @@
 </file>
 
 <file path=word/header1.xml><?xml version="1.0" encoding="utf-8"?>
-<w:hdr xmlns:wpc="http://schemas.microsoft.com/office/word/2010/wordprocessingCanvas" xmlns:cx="http://schemas.microsoft.com/office/drawing/2014/chartex" xmlns:cx1="http://schemas.microsoft.com/office/drawing/2015/9/8/chartex" xmlns:cx2="http://schemas.microsoft.com/office/drawing/2015/10/21/chartex" xmlns:cx3="http://schemas.microsoft.com/office/drawing/2016/5/9/chartex" xmlns:cx4="http://schemas.microsoft.com/office/drawing/2016/5/10/chartex" xmlns:cx5="http://schemas.microsoft.com/office/drawing/2016/5/11/chartex" xmlns:cx6="http://schemas.microsoft.com/office/drawing/2016/5/12/chartex" xmlns:cx7="http://schemas.microsoft.com/office/drawing/2016/5/13/chartex" xmlns:cx8="http://schemas.microsoft.com/office/drawing/2016/5/14/chartex" xmlns:mc="http://schemas.openxmlformats.org/markup-compatibility/2006" xmlns:aink="http://schemas.microsoft.com/office/drawing/2016/ink" xmlns:am3d="http://schemas.microsoft.com/office/drawing/2017/model3d" xmlns:o="urn:schemas-microsoft-com:office:office" xmlns:oel="http://schemas.microsoft.com/office/2019/extlst" xmlns:r="http://schemas.openxmlformats.org/officeDocument/2006/relationships" xmlns:m="http://schemas.openxmlformats.org/officeDocument/2006/math" xmlns:v="urn:schemas-microsoft-com:vml" xmlns:wp14="http://schemas.microsoft.com/office/word/2010/wordprocessingDrawing" xmlns:wp="http://schemas.openxmlformats.org/drawingml/2006/wordprocessingDrawing" xmlns:w10="urn:schemas-microsoft-com:office:word" xmlns:w="http://schemas.openxmlformats.org/wordprocessingml/2006/main" xmlns:w14="http://schemas.microsoft.com/office/word/2010/wordml" xmlns:w15="http://schemas.microsoft.com/office/word/2012/wordml" xmlns:w16cex="http://schemas.microsoft.com/office/word/2018/wordml/cex" xmlns:w16cid="http://schemas.microsoft.com/office/word/2016/wordml/cid" xmlns:w16="http://schemas.microsoft.com/office/word/2018/wordml" xmlns:w16du="http://schemas.microsoft.com/office/word/2023/wordml/word16du" xmlns:w16sdtdh="http://schemas.microsoft.com/office/word/2020/wordml/sdtdatahash" xmlns:w16se="http://schemas.microsoft.com/office/word/2015/wordml/symex" xmlns:wpg="http://schemas.microsoft.com/office/word/2010/wordprocessingGroup" xmlns:wpi="http://schemas.microsoft.com/office/word/2010/wordprocessingInk" xmlns:wne="http://schemas.microsoft.com/office/word/2006/wordml" xmlns:wps="http://schemas.microsoft.com/office/word/2010/wordprocessingShape" mc:Ignorable="w14 w15 w16se w16cid w16 w16cex w16sdtdh w16du wp14">
+<w:hdr xmlns:wpc="http://schemas.microsoft.com/office/word/2010/wordprocessingCanvas" xmlns:cx="http://schemas.microsoft.com/office/drawing/2014/chartex" xmlns:cx1="http://schemas.microsoft.com/office/drawing/2015/9/8/chartex" xmlns:cx2="http://schemas.microsoft.com/office/drawing/2015/10/21/chartex" xmlns:cx3="http://schemas.microsoft.com/office/drawing/2016/5/9/chartex" xmlns:cx4="http://schemas.microsoft.com/office/drawing/2016/5/10/chartex" xmlns:cx5="http://schemas.microsoft.com/office/drawing/2016/5/11/chartex" xmlns:cx6="http://schemas.microsoft.com/office/drawing/2016/5/12/chartex" xmlns:cx7="http://schemas.microsoft.com/office/drawing/2016/5/13/chartex" xmlns:cx8="http://schemas.microsoft.com/office/drawing/2016/5/14/chartex" xmlns:mc="http://schemas.openxmlformats.org/markup-compatibility/2006" xmlns:aink="http://schemas.microsoft.com/office/drawing/2016/ink" xmlns:am3d="http://schemas.microsoft.com/office/drawing/2017/model3d" xmlns:o="urn:schemas-microsoft-com:office:office" xmlns:oel="http://schemas.microsoft.com/office/2019/extlst" xmlns:r="http://schemas.openxmlformats.org/officeDocument/2006/relationships" xmlns:m="http://schemas.openxmlformats.org/officeDocument/2006/math" xmlns:v="urn:schemas-microsoft-com:vml" xmlns:wp14="http://schemas.microsoft.com/office/word/2010/wordprocessingDrawing" xmlns:wp="http://schemas.openxmlformats.org/drawingml/2006/wordprocessingDrawing" xmlns:w10="urn:schemas-microsoft-com:office:word" xmlns:w="http://schemas.openxmlformats.org/wordprocessingml/2006/main" xmlns:w14="http://schemas.microsoft.com/office/word/2010/wordml" xmlns:w15="http://schemas.microsoft.com/office/word/2012/wordml" xmlns:w16cei="http://schemas.microsoft.com/office/word/2026/wordml/cei" xmlns:w16cex="http://schemas.microsoft.com/office/word/2018/wordml/cex" xmlns:w16cid="http://schemas.microsoft.com/office/word/2016/wordml/cid" xmlns:w16="http://schemas.microsoft.com/office/word/2018/wordml" xmlns:w16du="http://schemas.microsoft.com/office/word/2023/wordml/word16du" xmlns:w16sdtdh="http://schemas.microsoft.com/office/word/2020/wordml/sdtdatahash" xmlns:w16sdtfl="http://schemas.microsoft.com/office/word/2024/wordml/sdtformatlock" xmlns:w16se="http://schemas.microsoft.com/office/word/2015/wordml/symex" xmlns:wpg="http://schemas.microsoft.com/office/word/2010/wordprocessingGroup" xmlns:wpi="http://schemas.microsoft.com/office/word/2010/wordprocessingInk" xmlns:wne="http://schemas.microsoft.com/office/word/2006/wordml" xmlns:wps="http://schemas.microsoft.com/office/word/2010/wordprocessingShape" mc:Ignorable="w14 w15 w16se w16cid w16 w16cex w16sdtdh w16sdtfl w16du wp14">
   <w:p>
     <w:pPr>
       <w:pBdr>
@@ -48113,7 +48700,7 @@
 </file>
 
 <file path=word/header10.xml><?xml version="1.0" encoding="utf-8"?>
-<w:hdr xmlns:wpc="http://schemas.microsoft.com/office/word/2010/wordprocessingCanvas" xmlns:cx="http://schemas.microsoft.com/office/drawing/2014/chartex" xmlns:cx1="http://schemas.microsoft.com/office/drawing/2015/9/8/chartex" xmlns:cx2="http://schemas.microsoft.com/office/drawing/2015/10/21/chartex" xmlns:cx3="http://schemas.microsoft.com/office/drawing/2016/5/9/chartex" xmlns:cx4="http://schemas.microsoft.com/office/drawing/2016/5/10/chartex" xmlns:cx5="http://schemas.microsoft.com/office/drawing/2016/5/11/chartex" xmlns:cx6="http://schemas.microsoft.com/office/drawing/2016/5/12/chartex" xmlns:cx7="http://schemas.microsoft.com/office/drawing/2016/5/13/chartex" xmlns:cx8="http://schemas.microsoft.com/office/drawing/2016/5/14/chartex" xmlns:mc="http://schemas.openxmlformats.org/markup-compatibility/2006" xmlns:aink="http://schemas.microsoft.com/office/drawing/2016/ink" xmlns:am3d="http://schemas.microsoft.com/office/drawing/2017/model3d" xmlns:o="urn:schemas-microsoft-com:office:office" xmlns:oel="http://schemas.microsoft.com/office/2019/extlst" xmlns:r="http://schemas.openxmlformats.org/officeDocument/2006/relationships" xmlns:m="http://schemas.openxmlformats.org/officeDocument/2006/math" xmlns:v="urn:schemas-microsoft-com:vml" xmlns:wp14="http://schemas.microsoft.com/office/word/2010/wordprocessingDrawing" xmlns:wp="http://schemas.openxmlformats.org/drawingml/2006/wordprocessingDrawing" xmlns:w10="urn:schemas-microsoft-com:office:word" xmlns:w="http://schemas.openxmlformats.org/wordprocessingml/2006/main" xmlns:w14="http://schemas.microsoft.com/office/word/2010/wordml" xmlns:w15="http://schemas.microsoft.com/office/word/2012/wordml" xmlns:w16cex="http://schemas.microsoft.com/office/word/2018/wordml/cex" xmlns:w16cid="http://schemas.microsoft.com/office/word/2016/wordml/cid" xmlns:w16="http://schemas.microsoft.com/office/word/2018/wordml" xmlns:w16du="http://schemas.microsoft.com/office/word/2023/wordml/word16du" xmlns:w16sdtdh="http://schemas.microsoft.com/office/word/2020/wordml/sdtdatahash" xmlns:w16se="http://schemas.microsoft.com/office/word/2015/wordml/symex" xmlns:wpg="http://schemas.microsoft.com/office/word/2010/wordprocessingGroup" xmlns:wpi="http://schemas.microsoft.com/office/word/2010/wordprocessingInk" xmlns:wne="http://schemas.microsoft.com/office/word/2006/wordml" xmlns:wps="http://schemas.microsoft.com/office/word/2010/wordprocessingShape" mc:Ignorable="w14 w15 w16se w16cid w16 w16cex w16sdtdh w16du wp14">
+<w:hdr xmlns:wpc="http://schemas.microsoft.com/office/word/2010/wordprocessingCanvas" xmlns:cx="http://schemas.microsoft.com/office/drawing/2014/chartex" xmlns:cx1="http://schemas.microsoft.com/office/drawing/2015/9/8/chartex" xmlns:cx2="http://schemas.microsoft.com/office/drawing/2015/10/21/chartex" xmlns:cx3="http://schemas.microsoft.com/office/drawing/2016/5/9/chartex" xmlns:cx4="http://schemas.microsoft.com/office/drawing/2016/5/10/chartex" xmlns:cx5="http://schemas.microsoft.com/office/drawing/2016/5/11/chartex" xmlns:cx6="http://schemas.microsoft.com/office/drawing/2016/5/12/chartex" xmlns:cx7="http://schemas.microsoft.com/office/drawing/2016/5/13/chartex" xmlns:cx8="http://schemas.microsoft.com/office/drawing/2016/5/14/chartex" xmlns:mc="http://schemas.openxmlformats.org/markup-compatibility/2006" xmlns:aink="http://schemas.microsoft.com/office/drawing/2016/ink" xmlns:am3d="http://schemas.microsoft.com/office/drawing/2017/model3d" xmlns:o="urn:schemas-microsoft-com:office:office" xmlns:oel="http://schemas.microsoft.com/office/2019/extlst" xmlns:r="http://schemas.openxmlformats.org/officeDocument/2006/relationships" xmlns:m="http://schemas.openxmlformats.org/officeDocument/2006/math" xmlns:v="urn:schemas-microsoft-com:vml" xmlns:wp14="http://schemas.microsoft.com/office/word/2010/wordprocessingDrawing" xmlns:wp="http://schemas.openxmlformats.org/drawingml/2006/wordprocessingDrawing" xmlns:w10="urn:schemas-microsoft-com:office:word" xmlns:w="http://schemas.openxmlformats.org/wordprocessingml/2006/main" xmlns:w14="http://schemas.microsoft.com/office/word/2010/wordml" xmlns:w15="http://schemas.microsoft.com/office/word/2012/wordml" xmlns:w16cei="http://schemas.microsoft.com/office/word/2026/wordml/cei" xmlns:w16cex="http://schemas.microsoft.com/office/word/2018/wordml/cex" xmlns:w16cid="http://schemas.microsoft.com/office/word/2016/wordml/cid" xmlns:w16="http://schemas.microsoft.com/office/word/2018/wordml" xmlns:w16du="http://schemas.microsoft.com/office/word/2023/wordml/word16du" xmlns:w16sdtdh="http://schemas.microsoft.com/office/word/2020/wordml/sdtdatahash" xmlns:w16sdtfl="http://schemas.microsoft.com/office/word/2024/wordml/sdtformatlock" xmlns:w16se="http://schemas.microsoft.com/office/word/2015/wordml/symex" xmlns:wpg="http://schemas.microsoft.com/office/word/2010/wordprocessingGroup" xmlns:wpi="http://schemas.microsoft.com/office/word/2010/wordprocessingInk" xmlns:wne="http://schemas.microsoft.com/office/word/2006/wordml" xmlns:wps="http://schemas.microsoft.com/office/word/2010/wordprocessingShape" mc:Ignorable="w14 w15 w16se w16cid w16 w16cex w16sdtdh w16sdtfl w16du wp14">
   <w:p>
     <w:pPr>
       <w:widowControl w:val="0"/>
@@ -48224,7 +48811,7 @@
 </file>
 
 <file path=word/header11.xml><?xml version="1.0" encoding="utf-8"?>
-<w:hdr xmlns:wpc="http://schemas.microsoft.com/office/word/2010/wordprocessingCanvas" xmlns:cx="http://schemas.microsoft.com/office/drawing/2014/chartex" xmlns:cx1="http://schemas.microsoft.com/office/drawing/2015/9/8/chartex" xmlns:cx2="http://schemas.microsoft.com/office/drawing/2015/10/21/chartex" xmlns:cx3="http://schemas.microsoft.com/office/drawing/2016/5/9/chartex" xmlns:cx4="http://schemas.microsoft.com/office/drawing/2016/5/10/chartex" xmlns:cx5="http://schemas.microsoft.com/office/drawing/2016/5/11/chartex" xmlns:cx6="http://schemas.microsoft.com/office/drawing/2016/5/12/chartex" xmlns:cx7="http://schemas.microsoft.com/office/drawing/2016/5/13/chartex" xmlns:cx8="http://schemas.microsoft.com/office/drawing/2016/5/14/chartex" xmlns:mc="http://schemas.openxmlformats.org/markup-compatibility/2006" xmlns:aink="http://schemas.microsoft.com/office/drawing/2016/ink" xmlns:am3d="http://schemas.microsoft.com/office/drawing/2017/model3d" xmlns:o="urn:schemas-microsoft-com:office:office" xmlns:oel="http://schemas.microsoft.com/office/2019/extlst" xmlns:r="http://schemas.openxmlformats.org/officeDocument/2006/relationships" xmlns:m="http://schemas.openxmlformats.org/officeDocument/2006/math" xmlns:v="urn:schemas-microsoft-com:vml" xmlns:wp14="http://schemas.microsoft.com/office/word/2010/wordprocessingDrawing" xmlns:wp="http://schemas.openxmlformats.org/drawingml/2006/wordprocessingDrawing" xmlns:w10="urn:schemas-microsoft-com:office:word" xmlns:w="http://schemas.openxmlformats.org/wordprocessingml/2006/main" xmlns:w14="http://schemas.microsoft.com/office/word/2010/wordml" xmlns:w15="http://schemas.microsoft.com/office/word/2012/wordml" xmlns:w16cex="http://schemas.microsoft.com/office/word/2018/wordml/cex" xmlns:w16cid="http://schemas.microsoft.com/office/word/2016/wordml/cid" xmlns:w16="http://schemas.microsoft.com/office/word/2018/wordml" xmlns:w16du="http://schemas.microsoft.com/office/word/2023/wordml/word16du" xmlns:w16sdtdh="http://schemas.microsoft.com/office/word/2020/wordml/sdtdatahash" xmlns:w16se="http://schemas.microsoft.com/office/word/2015/wordml/symex" xmlns:wpg="http://schemas.microsoft.com/office/word/2010/wordprocessingGroup" xmlns:wpi="http://schemas.microsoft.com/office/word/2010/wordprocessingInk" xmlns:wne="http://schemas.microsoft.com/office/word/2006/wordml" xmlns:wps="http://schemas.microsoft.com/office/word/2010/wordprocessingShape" mc:Ignorable="w14 w15 w16se w16cid w16 w16cex w16sdtdh w16du wp14">
+<w:hdr xmlns:wpc="http://schemas.microsoft.com/office/word/2010/wordprocessingCanvas" xmlns:cx="http://schemas.microsoft.com/office/drawing/2014/chartex" xmlns:cx1="http://schemas.microsoft.com/office/drawing/2015/9/8/chartex" xmlns:cx2="http://schemas.microsoft.com/office/drawing/2015/10/21/chartex" xmlns:cx3="http://schemas.microsoft.com/office/drawing/2016/5/9/chartex" xmlns:cx4="http://schemas.microsoft.com/office/drawing/2016/5/10/chartex" xmlns:cx5="http://schemas.microsoft.com/office/drawing/2016/5/11/chartex" xmlns:cx6="http://schemas.microsoft.com/office/drawing/2016/5/12/chartex" xmlns:cx7="http://schemas.microsoft.com/office/drawing/2016/5/13/chartex" xmlns:cx8="http://schemas.microsoft.com/office/drawing/2016/5/14/chartex" xmlns:mc="http://schemas.openxmlformats.org/markup-compatibility/2006" xmlns:aink="http://schemas.microsoft.com/office/drawing/2016/ink" xmlns:am3d="http://schemas.microsoft.com/office/drawing/2017/model3d" xmlns:o="urn:schemas-microsoft-com:office:office" xmlns:oel="http://schemas.microsoft.com/office/2019/extlst" xmlns:r="http://schemas.openxmlformats.org/officeDocument/2006/relationships" xmlns:m="http://schemas.openxmlformats.org/officeDocument/2006/math" xmlns:v="urn:schemas-microsoft-com:vml" xmlns:wp14="http://schemas.microsoft.com/office/word/2010/wordprocessingDrawing" xmlns:wp="http://schemas.openxmlformats.org/drawingml/2006/wordprocessingDrawing" xmlns:w10="urn:schemas-microsoft-com:office:word" xmlns:w="http://schemas.openxmlformats.org/wordprocessingml/2006/main" xmlns:w14="http://schemas.microsoft.com/office/word/2010/wordml" xmlns:w15="http://schemas.microsoft.com/office/word/2012/wordml" xmlns:w16cei="http://schemas.microsoft.com/office/word/2026/wordml/cei" xmlns:w16cex="http://schemas.microsoft.com/office/word/2018/wordml/cex" xmlns:w16cid="http://schemas.microsoft.com/office/word/2016/wordml/cid" xmlns:w16="http://schemas.microsoft.com/office/word/2018/wordml" xmlns:w16du="http://schemas.microsoft.com/office/word/2023/wordml/word16du" xmlns:w16sdtdh="http://schemas.microsoft.com/office/word/2020/wordml/sdtdatahash" xmlns:w16sdtfl="http://schemas.microsoft.com/office/word/2024/wordml/sdtformatlock" xmlns:w16se="http://schemas.microsoft.com/office/word/2015/wordml/symex" xmlns:wpg="http://schemas.microsoft.com/office/word/2010/wordprocessingGroup" xmlns:wpi="http://schemas.microsoft.com/office/word/2010/wordprocessingInk" xmlns:wne="http://schemas.microsoft.com/office/word/2006/wordml" xmlns:wps="http://schemas.microsoft.com/office/word/2010/wordprocessingShape" mc:Ignorable="w14 w15 w16se w16cid w16 w16cex w16sdtdh w16sdtfl w16du wp14">
   <w:p>
     <w:pPr>
       <w:widowControl w:val="0"/>
@@ -48336,7 +48923,7 @@
 </file>
 
 <file path=word/header12.xml><?xml version="1.0" encoding="utf-8"?>
-<w:hdr xmlns:wpc="http://schemas.microsoft.com/office/word/2010/wordprocessingCanvas" xmlns:cx="http://schemas.microsoft.com/office/drawing/2014/chartex" xmlns:cx1="http://schemas.microsoft.com/office/drawing/2015/9/8/chartex" xmlns:cx2="http://schemas.microsoft.com/office/drawing/2015/10/21/chartex" xmlns:cx3="http://schemas.microsoft.com/office/drawing/2016/5/9/chartex" xmlns:cx4="http://schemas.microsoft.com/office/drawing/2016/5/10/chartex" xmlns:cx5="http://schemas.microsoft.com/office/drawing/2016/5/11/chartex" xmlns:cx6="http://schemas.microsoft.com/office/drawing/2016/5/12/chartex" xmlns:cx7="http://schemas.microsoft.com/office/drawing/2016/5/13/chartex" xmlns:cx8="http://schemas.microsoft.com/office/drawing/2016/5/14/chartex" xmlns:mc="http://schemas.openxmlformats.org/markup-compatibility/2006" xmlns:aink="http://schemas.microsoft.com/office/drawing/2016/ink" xmlns:am3d="http://schemas.microsoft.com/office/drawing/2017/model3d" xmlns:o="urn:schemas-microsoft-com:office:office" xmlns:oel="http://schemas.microsoft.com/office/2019/extlst" xmlns:r="http://schemas.openxmlformats.org/officeDocument/2006/relationships" xmlns:m="http://schemas.openxmlformats.org/officeDocument/2006/math" xmlns:v="urn:schemas-microsoft-com:vml" xmlns:wp14="http://schemas.microsoft.com/office/word/2010/wordprocessingDrawing" xmlns:wp="http://schemas.openxmlformats.org/drawingml/2006/wordprocessingDrawing" xmlns:w10="urn:schemas-microsoft-com:office:word" xmlns:w="http://schemas.openxmlformats.org/wordprocessingml/2006/main" xmlns:w14="http://schemas.microsoft.com/office/word/2010/wordml" xmlns:w15="http://schemas.microsoft.com/office/word/2012/wordml" xmlns:w16cex="http://schemas.microsoft.com/office/word/2018/wordml/cex" xmlns:w16cid="http://schemas.microsoft.com/office/word/2016/wordml/cid" xmlns:w16="http://schemas.microsoft.com/office/word/2018/wordml" xmlns:w16du="http://schemas.microsoft.com/office/word/2023/wordml/word16du" xmlns:w16sdtdh="http://schemas.microsoft.com/office/word/2020/wordml/sdtdatahash" xmlns:w16se="http://schemas.microsoft.com/office/word/2015/wordml/symex" xmlns:wpg="http://schemas.microsoft.com/office/word/2010/wordprocessingGroup" xmlns:wpi="http://schemas.microsoft.com/office/word/2010/wordprocessingInk" xmlns:wne="http://schemas.microsoft.com/office/word/2006/wordml" xmlns:wps="http://schemas.microsoft.com/office/word/2010/wordprocessingShape" mc:Ignorable="w14 w15 w16se w16cid w16 w16cex w16sdtdh w16du wp14">
+<w:hdr xmlns:wpc="http://schemas.microsoft.com/office/word/2010/wordprocessingCanvas" xmlns:cx="http://schemas.microsoft.com/office/drawing/2014/chartex" xmlns:cx1="http://schemas.microsoft.com/office/drawing/2015/9/8/chartex" xmlns:cx2="http://schemas.microsoft.com/office/drawing/2015/10/21/chartex" xmlns:cx3="http://schemas.microsoft.com/office/drawing/2016/5/9/chartex" xmlns:cx4="http://schemas.microsoft.com/office/drawing/2016/5/10/chartex" xmlns:cx5="http://schemas.microsoft.com/office/drawing/2016/5/11/chartex" xmlns:cx6="http://schemas.microsoft.com/office/drawing/2016/5/12/chartex" xmlns:cx7="http://schemas.microsoft.com/office/drawing/2016/5/13/chartex" xmlns:cx8="http://schemas.microsoft.com/office/drawing/2016/5/14/chartex" xmlns:mc="http://schemas.openxmlformats.org/markup-compatibility/2006" xmlns:aink="http://schemas.microsoft.com/office/drawing/2016/ink" xmlns:am3d="http://schemas.microsoft.com/office/drawing/2017/model3d" xmlns:o="urn:schemas-microsoft-com:office:office" xmlns:oel="http://schemas.microsoft.com/office/2019/extlst" xmlns:r="http://schemas.openxmlformats.org/officeDocument/2006/relationships" xmlns:m="http://schemas.openxmlformats.org/officeDocument/2006/math" xmlns:v="urn:schemas-microsoft-com:vml" xmlns:wp14="http://schemas.microsoft.com/office/word/2010/wordprocessingDrawing" xmlns:wp="http://schemas.openxmlformats.org/drawingml/2006/wordprocessingDrawing" xmlns:w10="urn:schemas-microsoft-com:office:word" xmlns:w="http://schemas.openxmlformats.org/wordprocessingml/2006/main" xmlns:w14="http://schemas.microsoft.com/office/word/2010/wordml" xmlns:w15="http://schemas.microsoft.com/office/word/2012/wordml" xmlns:w16cei="http://schemas.microsoft.com/office/word/2026/wordml/cei" xmlns:w16cex="http://schemas.microsoft.com/office/word/2018/wordml/cex" xmlns:w16cid="http://schemas.microsoft.com/office/word/2016/wordml/cid" xmlns:w16="http://schemas.microsoft.com/office/word/2018/wordml" xmlns:w16du="http://schemas.microsoft.com/office/word/2023/wordml/word16du" xmlns:w16sdtdh="http://schemas.microsoft.com/office/word/2020/wordml/sdtdatahash" xmlns:w16sdtfl="http://schemas.microsoft.com/office/word/2024/wordml/sdtformatlock" xmlns:w16se="http://schemas.microsoft.com/office/word/2015/wordml/symex" xmlns:wpg="http://schemas.microsoft.com/office/word/2010/wordprocessingGroup" xmlns:wpi="http://schemas.microsoft.com/office/word/2010/wordprocessingInk" xmlns:wne="http://schemas.microsoft.com/office/word/2006/wordml" xmlns:wps="http://schemas.microsoft.com/office/word/2010/wordprocessingShape" mc:Ignorable="w14 w15 w16se w16cid w16 w16cex w16sdtdh w16sdtfl w16du wp14">
   <w:p>
     <w:pPr>
       <w:widowControl w:val="0"/>
@@ -48446,7 +49033,7 @@
 </file>
 
 <file path=word/header13.xml><?xml version="1.0" encoding="utf-8"?>
-<w:hdr xmlns:wpc="http://schemas.microsoft.com/office/word/2010/wordprocessingCanvas" xmlns:cx="http://schemas.microsoft.com/office/drawing/2014/chartex" xmlns:cx1="http://schemas.microsoft.com/office/drawing/2015/9/8/chartex" xmlns:cx2="http://schemas.microsoft.com/office/drawing/2015/10/21/chartex" xmlns:cx3="http://schemas.microsoft.com/office/drawing/2016/5/9/chartex" xmlns:cx4="http://schemas.microsoft.com/office/drawing/2016/5/10/chartex" xmlns:cx5="http://schemas.microsoft.com/office/drawing/2016/5/11/chartex" xmlns:cx6="http://schemas.microsoft.com/office/drawing/2016/5/12/chartex" xmlns:cx7="http://schemas.microsoft.com/office/drawing/2016/5/13/chartex" xmlns:cx8="http://schemas.microsoft.com/office/drawing/2016/5/14/chartex" xmlns:mc="http://schemas.openxmlformats.org/markup-compatibility/2006" xmlns:aink="http://schemas.microsoft.com/office/drawing/2016/ink" xmlns:am3d="http://schemas.microsoft.com/office/drawing/2017/model3d" xmlns:o="urn:schemas-microsoft-com:office:office" xmlns:oel="http://schemas.microsoft.com/office/2019/extlst" xmlns:r="http://schemas.openxmlformats.org/officeDocument/2006/relationships" xmlns:m="http://schemas.openxmlformats.org/officeDocument/2006/math" xmlns:v="urn:schemas-microsoft-com:vml" xmlns:wp14="http://schemas.microsoft.com/office/word/2010/wordprocessingDrawing" xmlns:wp="http://schemas.openxmlformats.org/drawingml/2006/wordprocessingDrawing" xmlns:w10="urn:schemas-microsoft-com:office:word" xmlns:w="http://schemas.openxmlformats.org/wordprocessingml/2006/main" xmlns:w14="http://schemas.microsoft.com/office/word/2010/wordml" xmlns:w15="http://schemas.microsoft.com/office/word/2012/wordml" xmlns:w16cex="http://schemas.microsoft.com/office/word/2018/wordml/cex" xmlns:w16cid="http://schemas.microsoft.com/office/word/2016/wordml/cid" xmlns:w16="http://schemas.microsoft.com/office/word/2018/wordml" xmlns:w16du="http://schemas.microsoft.com/office/word/2023/wordml/word16du" xmlns:w16sdtdh="http://schemas.microsoft.com/office/word/2020/wordml/sdtdatahash" xmlns:w16se="http://schemas.microsoft.com/office/word/2015/wordml/symex" xmlns:wpg="http://schemas.microsoft.com/office/word/2010/wordprocessingGroup" xmlns:wpi="http://schemas.microsoft.com/office/word/2010/wordprocessingInk" xmlns:wne="http://schemas.microsoft.com/office/word/2006/wordml" xmlns:wps="http://schemas.microsoft.com/office/word/2010/wordprocessingShape" mc:Ignorable="w14 w15 w16se w16cid w16 w16cex w16sdtdh w16du wp14">
+<w:hdr xmlns:wpc="http://schemas.microsoft.com/office/word/2010/wordprocessingCanvas" xmlns:cx="http://schemas.microsoft.com/office/drawing/2014/chartex" xmlns:cx1="http://schemas.microsoft.com/office/drawing/2015/9/8/chartex" xmlns:cx2="http://schemas.microsoft.com/office/drawing/2015/10/21/chartex" xmlns:cx3="http://schemas.microsoft.com/office/drawing/2016/5/9/chartex" xmlns:cx4="http://schemas.microsoft.com/office/drawing/2016/5/10/chartex" xmlns:cx5="http://schemas.microsoft.com/office/drawing/2016/5/11/chartex" xmlns:cx6="http://schemas.microsoft.com/office/drawing/2016/5/12/chartex" xmlns:cx7="http://schemas.microsoft.com/office/drawing/2016/5/13/chartex" xmlns:cx8="http://schemas.microsoft.com/office/drawing/2016/5/14/chartex" xmlns:mc="http://schemas.openxmlformats.org/markup-compatibility/2006" xmlns:aink="http://schemas.microsoft.com/office/drawing/2016/ink" xmlns:am3d="http://schemas.microsoft.com/office/drawing/2017/model3d" xmlns:o="urn:schemas-microsoft-com:office:office" xmlns:oel="http://schemas.microsoft.com/office/2019/extlst" xmlns:r="http://schemas.openxmlformats.org/officeDocument/2006/relationships" xmlns:m="http://schemas.openxmlformats.org/officeDocument/2006/math" xmlns:v="urn:schemas-microsoft-com:vml" xmlns:wp14="http://schemas.microsoft.com/office/word/2010/wordprocessingDrawing" xmlns:wp="http://schemas.openxmlformats.org/drawingml/2006/wordprocessingDrawing" xmlns:w10="urn:schemas-microsoft-com:office:word" xmlns:w="http://schemas.openxmlformats.org/wordprocessingml/2006/main" xmlns:w14="http://schemas.microsoft.com/office/word/2010/wordml" xmlns:w15="http://schemas.microsoft.com/office/word/2012/wordml" xmlns:w16cei="http://schemas.microsoft.com/office/word/2026/wordml/cei" xmlns:w16cex="http://schemas.microsoft.com/office/word/2018/wordml/cex" xmlns:w16cid="http://schemas.microsoft.com/office/word/2016/wordml/cid" xmlns:w16="http://schemas.microsoft.com/office/word/2018/wordml" xmlns:w16du="http://schemas.microsoft.com/office/word/2023/wordml/word16du" xmlns:w16sdtdh="http://schemas.microsoft.com/office/word/2020/wordml/sdtdatahash" xmlns:w16sdtfl="http://schemas.microsoft.com/office/word/2024/wordml/sdtformatlock" xmlns:w16se="http://schemas.microsoft.com/office/word/2015/wordml/symex" xmlns:wpg="http://schemas.microsoft.com/office/word/2010/wordprocessingGroup" xmlns:wpi="http://schemas.microsoft.com/office/word/2010/wordprocessingInk" xmlns:wne="http://schemas.microsoft.com/office/word/2006/wordml" xmlns:wps="http://schemas.microsoft.com/office/word/2010/wordprocessingShape" mc:Ignorable="w14 w15 w16se w16cid w16 w16cex w16sdtdh w16sdtfl w16du wp14">
   <w:p>
     <w:pPr>
       <w:widowControl w:val="0"/>
@@ -48579,7 +49166,7 @@
 </file>
 
 <file path=word/header14.xml><?xml version="1.0" encoding="utf-8"?>
-<w:hdr xmlns:wpc="http://schemas.microsoft.com/office/word/2010/wordprocessingCanvas" xmlns:cx="http://schemas.microsoft.com/office/drawing/2014/chartex" xmlns:cx1="http://schemas.microsoft.com/office/drawing/2015/9/8/chartex" xmlns:cx2="http://schemas.microsoft.com/office/drawing/2015/10/21/chartex" xmlns:cx3="http://schemas.microsoft.com/office/drawing/2016/5/9/chartex" xmlns:cx4="http://schemas.microsoft.com/office/drawing/2016/5/10/chartex" xmlns:cx5="http://schemas.microsoft.com/office/drawing/2016/5/11/chartex" xmlns:cx6="http://schemas.microsoft.com/office/drawing/2016/5/12/chartex" xmlns:cx7="http://schemas.microsoft.com/office/drawing/2016/5/13/chartex" xmlns:cx8="http://schemas.microsoft.com/office/drawing/2016/5/14/chartex" xmlns:mc="http://schemas.openxmlformats.org/markup-compatibility/2006" xmlns:aink="http://schemas.microsoft.com/office/drawing/2016/ink" xmlns:am3d="http://schemas.microsoft.com/office/drawing/2017/model3d" xmlns:o="urn:schemas-microsoft-com:office:office" xmlns:oel="http://schemas.microsoft.com/office/2019/extlst" xmlns:r="http://schemas.openxmlformats.org/officeDocument/2006/relationships" xmlns:m="http://schemas.openxmlformats.org/officeDocument/2006/math" xmlns:v="urn:schemas-microsoft-com:vml" xmlns:wp14="http://schemas.microsoft.com/office/word/2010/wordprocessingDrawing" xmlns:wp="http://schemas.openxmlformats.org/drawingml/2006/wordprocessingDrawing" xmlns:w10="urn:schemas-microsoft-com:office:word" xmlns:w="http://schemas.openxmlformats.org/wordprocessingml/2006/main" xmlns:w14="http://schemas.microsoft.com/office/word/2010/wordml" xmlns:w15="http://schemas.microsoft.com/office/word/2012/wordml" xmlns:w16cex="http://schemas.microsoft.com/office/word/2018/wordml/cex" xmlns:w16cid="http://schemas.microsoft.com/office/word/2016/wordml/cid" xmlns:w16="http://schemas.microsoft.com/office/word/2018/wordml" xmlns:w16du="http://schemas.microsoft.com/office/word/2023/wordml/word16du" xmlns:w16sdtdh="http://schemas.microsoft.com/office/word/2020/wordml/sdtdatahash" xmlns:w16se="http://schemas.microsoft.com/office/word/2015/wordml/symex" xmlns:wpg="http://schemas.microsoft.com/office/word/2010/wordprocessingGroup" xmlns:wpi="http://schemas.microsoft.com/office/word/2010/wordprocessingInk" xmlns:wne="http://schemas.microsoft.com/office/word/2006/wordml" xmlns:wps="http://schemas.microsoft.com/office/word/2010/wordprocessingShape" mc:Ignorable="w14 w15 w16se w16cid w16 w16cex w16sdtdh w16du wp14">
+<w:hdr xmlns:wpc="http://schemas.microsoft.com/office/word/2010/wordprocessingCanvas" xmlns:cx="http://schemas.microsoft.com/office/drawing/2014/chartex" xmlns:cx1="http://schemas.microsoft.com/office/drawing/2015/9/8/chartex" xmlns:cx2="http://schemas.microsoft.com/office/drawing/2015/10/21/chartex" xmlns:cx3="http://schemas.microsoft.com/office/drawing/2016/5/9/chartex" xmlns:cx4="http://schemas.microsoft.com/office/drawing/2016/5/10/chartex" xmlns:cx5="http://schemas.microsoft.com/office/drawing/2016/5/11/chartex" xmlns:cx6="http://schemas.microsoft.com/office/drawing/2016/5/12/chartex" xmlns:cx7="http://schemas.microsoft.com/office/drawing/2016/5/13/chartex" xmlns:cx8="http://schemas.microsoft.com/office/drawing/2016/5/14/chartex" xmlns:mc="http://schemas.openxmlformats.org/markup-compatibility/2006" xmlns:aink="http://schemas.microsoft.com/office/drawing/2016/ink" xmlns:am3d="http://schemas.microsoft.com/office/drawing/2017/model3d" xmlns:o="urn:schemas-microsoft-com:office:office" xmlns:oel="http://schemas.microsoft.com/office/2019/extlst" xmlns:r="http://schemas.openxmlformats.org/officeDocument/2006/relationships" xmlns:m="http://schemas.openxmlformats.org/officeDocument/2006/math" xmlns:v="urn:schemas-microsoft-com:vml" xmlns:wp14="http://schemas.microsoft.com/office/word/2010/wordprocessingDrawing" xmlns:wp="http://schemas.openxmlformats.org/drawingml/2006/wordprocessingDrawing" xmlns:w10="urn:schemas-microsoft-com:office:word" xmlns:w="http://schemas.openxmlformats.org/wordprocessingml/2006/main" xmlns:w14="http://schemas.microsoft.com/office/word/2010/wordml" xmlns:w15="http://schemas.microsoft.com/office/word/2012/wordml" xmlns:w16cei="http://schemas.microsoft.com/office/word/2026/wordml/cei" xmlns:w16cex="http://schemas.microsoft.com/office/word/2018/wordml/cex" xmlns:w16cid="http://schemas.microsoft.com/office/word/2016/wordml/cid" xmlns:w16="http://schemas.microsoft.com/office/word/2018/wordml" xmlns:w16du="http://schemas.microsoft.com/office/word/2023/wordml/word16du" xmlns:w16sdtdh="http://schemas.microsoft.com/office/word/2020/wordml/sdtdatahash" xmlns:w16sdtfl="http://schemas.microsoft.com/office/word/2024/wordml/sdtformatlock" xmlns:w16se="http://schemas.microsoft.com/office/word/2015/wordml/symex" xmlns:wpg="http://schemas.microsoft.com/office/word/2010/wordprocessingGroup" xmlns:wpi="http://schemas.microsoft.com/office/word/2010/wordprocessingInk" xmlns:wne="http://schemas.microsoft.com/office/word/2006/wordml" xmlns:wps="http://schemas.microsoft.com/office/word/2010/wordprocessingShape" mc:Ignorable="w14 w15 w16se w16cid w16 w16cex w16sdtdh w16sdtfl w16du wp14">
   <w:p>
     <w:pPr>
       <w:widowControl w:val="0"/>
@@ -48689,7 +49276,7 @@
 </file>
 
 <file path=word/header15.xml><?xml version="1.0" encoding="utf-8"?>
-<w:hdr xmlns:wpc="http://schemas.microsoft.com/office/word/2010/wordprocessingCanvas" xmlns:cx="http://schemas.microsoft.com/office/drawing/2014/chartex" xmlns:cx1="http://schemas.microsoft.com/office/drawing/2015/9/8/chartex" xmlns:cx2="http://schemas.microsoft.com/office/drawing/2015/10/21/chartex" xmlns:cx3="http://schemas.microsoft.com/office/drawing/2016/5/9/chartex" xmlns:cx4="http://schemas.microsoft.com/office/drawing/2016/5/10/chartex" xmlns:cx5="http://schemas.microsoft.com/office/drawing/2016/5/11/chartex" xmlns:cx6="http://schemas.microsoft.com/office/drawing/2016/5/12/chartex" xmlns:cx7="http://schemas.microsoft.com/office/drawing/2016/5/13/chartex" xmlns:cx8="http://schemas.microsoft.com/office/drawing/2016/5/14/chartex" xmlns:mc="http://schemas.openxmlformats.org/markup-compatibility/2006" xmlns:aink="http://schemas.microsoft.com/office/drawing/2016/ink" xmlns:am3d="http://schemas.microsoft.com/office/drawing/2017/model3d" xmlns:o="urn:schemas-microsoft-com:office:office" xmlns:oel="http://schemas.microsoft.com/office/2019/extlst" xmlns:r="http://schemas.openxmlformats.org/officeDocument/2006/relationships" xmlns:m="http://schemas.openxmlformats.org/officeDocument/2006/math" xmlns:v="urn:schemas-microsoft-com:vml" xmlns:wp14="http://schemas.microsoft.com/office/word/2010/wordprocessingDrawing" xmlns:wp="http://schemas.openxmlformats.org/drawingml/2006/wordprocessingDrawing" xmlns:w10="urn:schemas-microsoft-com:office:word" xmlns:w="http://schemas.openxmlformats.org/wordprocessingml/2006/main" xmlns:w14="http://schemas.microsoft.com/office/word/2010/wordml" xmlns:w15="http://schemas.microsoft.com/office/word/2012/wordml" xmlns:w16cex="http://schemas.microsoft.com/office/word/2018/wordml/cex" xmlns:w16cid="http://schemas.microsoft.com/office/word/2016/wordml/cid" xmlns:w16="http://schemas.microsoft.com/office/word/2018/wordml" xmlns:w16du="http://schemas.microsoft.com/office/word/2023/wordml/word16du" xmlns:w16sdtdh="http://schemas.microsoft.com/office/word/2020/wordml/sdtdatahash" xmlns:w16se="http://schemas.microsoft.com/office/word/2015/wordml/symex" xmlns:wpg="http://schemas.microsoft.com/office/word/2010/wordprocessingGroup" xmlns:wpi="http://schemas.microsoft.com/office/word/2010/wordprocessingInk" xmlns:wne="http://schemas.microsoft.com/office/word/2006/wordml" xmlns:wps="http://schemas.microsoft.com/office/word/2010/wordprocessingShape" mc:Ignorable="w14 w15 w16se w16cid w16 w16cex w16sdtdh w16du wp14">
+<w:hdr xmlns:wpc="http://schemas.microsoft.com/office/word/2010/wordprocessingCanvas" xmlns:cx="http://schemas.microsoft.com/office/drawing/2014/chartex" xmlns:cx1="http://schemas.microsoft.com/office/drawing/2015/9/8/chartex" xmlns:cx2="http://schemas.microsoft.com/office/drawing/2015/10/21/chartex" xmlns:cx3="http://schemas.microsoft.com/office/drawing/2016/5/9/chartex" xmlns:cx4="http://schemas.microsoft.com/office/drawing/2016/5/10/chartex" xmlns:cx5="http://schemas.microsoft.com/office/drawing/2016/5/11/chartex" xmlns:cx6="http://schemas.microsoft.com/office/drawing/2016/5/12/chartex" xmlns:cx7="http://schemas.microsoft.com/office/drawing/2016/5/13/chartex" xmlns:cx8="http://schemas.microsoft.com/office/drawing/2016/5/14/chartex" xmlns:mc="http://schemas.openxmlformats.org/markup-compatibility/2006" xmlns:aink="http://schemas.microsoft.com/office/drawing/2016/ink" xmlns:am3d="http://schemas.microsoft.com/office/drawing/2017/model3d" xmlns:o="urn:schemas-microsoft-com:office:office" xmlns:oel="http://schemas.microsoft.com/office/2019/extlst" xmlns:r="http://schemas.openxmlformats.org/officeDocument/2006/relationships" xmlns:m="http://schemas.openxmlformats.org/officeDocument/2006/math" xmlns:v="urn:schemas-microsoft-com:vml" xmlns:wp14="http://schemas.microsoft.com/office/word/2010/wordprocessingDrawing" xmlns:wp="http://schemas.openxmlformats.org/drawingml/2006/wordprocessingDrawing" xmlns:w10="urn:schemas-microsoft-com:office:word" xmlns:w="http://schemas.openxmlformats.org/wordprocessingml/2006/main" xmlns:w14="http://schemas.microsoft.com/office/word/2010/wordml" xmlns:w15="http://schemas.microsoft.com/office/word/2012/wordml" xmlns:w16cei="http://schemas.microsoft.com/office/word/2026/wordml/cei" xmlns:w16cex="http://schemas.microsoft.com/office/word/2018/wordml/cex" xmlns:w16cid="http://schemas.microsoft.com/office/word/2016/wordml/cid" xmlns:w16="http://schemas.microsoft.com/office/word/2018/wordml" xmlns:w16du="http://schemas.microsoft.com/office/word/2023/wordml/word16du" xmlns:w16sdtdh="http://schemas.microsoft.com/office/word/2020/wordml/sdtdatahash" xmlns:w16sdtfl="http://schemas.microsoft.com/office/word/2024/wordml/sdtformatlock" xmlns:w16se="http://schemas.microsoft.com/office/word/2015/wordml/symex" xmlns:wpg="http://schemas.microsoft.com/office/word/2010/wordprocessingGroup" xmlns:wpi="http://schemas.microsoft.com/office/word/2010/wordprocessingInk" xmlns:wne="http://schemas.microsoft.com/office/word/2006/wordml" xmlns:wps="http://schemas.microsoft.com/office/word/2010/wordprocessingShape" mc:Ignorable="w14 w15 w16se w16cid w16 w16cex w16sdtdh w16sdtfl w16du wp14">
   <w:p>
     <w:pPr>
       <w:widowControl w:val="0"/>
@@ -48822,7 +49409,7 @@
 </file>
 
 <file path=word/header16.xml><?xml version="1.0" encoding="utf-8"?>
-<w:hdr xmlns:wpc="http://schemas.microsoft.com/office/word/2010/wordprocessingCanvas" xmlns:cx="http://schemas.microsoft.com/office/drawing/2014/chartex" xmlns:cx1="http://schemas.microsoft.com/office/drawing/2015/9/8/chartex" xmlns:cx2="http://schemas.microsoft.com/office/drawing/2015/10/21/chartex" xmlns:cx3="http://schemas.microsoft.com/office/drawing/2016/5/9/chartex" xmlns:cx4="http://schemas.microsoft.com/office/drawing/2016/5/10/chartex" xmlns:cx5="http://schemas.microsoft.com/office/drawing/2016/5/11/chartex" xmlns:cx6="http://schemas.microsoft.com/office/drawing/2016/5/12/chartex" xmlns:cx7="http://schemas.microsoft.com/office/drawing/2016/5/13/chartex" xmlns:cx8="http://schemas.microsoft.com/office/drawing/2016/5/14/chartex" xmlns:mc="http://schemas.openxmlformats.org/markup-compatibility/2006" xmlns:aink="http://schemas.microsoft.com/office/drawing/2016/ink" xmlns:am3d="http://schemas.microsoft.com/office/drawing/2017/model3d" xmlns:o="urn:schemas-microsoft-com:office:office" xmlns:oel="http://schemas.microsoft.com/office/2019/extlst" xmlns:r="http://schemas.openxmlformats.org/officeDocument/2006/relationships" xmlns:m="http://schemas.openxmlformats.org/officeDocument/2006/math" xmlns:v="urn:schemas-microsoft-com:vml" xmlns:wp14="http://schemas.microsoft.com/office/word/2010/wordprocessingDrawing" xmlns:wp="http://schemas.openxmlformats.org/drawingml/2006/wordprocessingDrawing" xmlns:w10="urn:schemas-microsoft-com:office:word" xmlns:w="http://schemas.openxmlformats.org/wordprocessingml/2006/main" xmlns:w14="http://schemas.microsoft.com/office/word/2010/wordml" xmlns:w15="http://schemas.microsoft.com/office/word/2012/wordml" xmlns:w16cex="http://schemas.microsoft.com/office/word/2018/wordml/cex" xmlns:w16cid="http://schemas.microsoft.com/office/word/2016/wordml/cid" xmlns:w16="http://schemas.microsoft.com/office/word/2018/wordml" xmlns:w16du="http://schemas.microsoft.com/office/word/2023/wordml/word16du" xmlns:w16sdtdh="http://schemas.microsoft.com/office/word/2020/wordml/sdtdatahash" xmlns:w16se="http://schemas.microsoft.com/office/word/2015/wordml/symex" xmlns:wpg="http://schemas.microsoft.com/office/word/2010/wordprocessingGroup" xmlns:wpi="http://schemas.microsoft.com/office/word/2010/wordprocessingInk" xmlns:wne="http://schemas.microsoft.com/office/word/2006/wordml" xmlns:wps="http://schemas.microsoft.com/office/word/2010/wordprocessingShape" mc:Ignorable="w14 w15 w16se w16cid w16 w16cex w16sdtdh w16du wp14">
+<w:hdr xmlns:wpc="http://schemas.microsoft.com/office/word/2010/wordprocessingCanvas" xmlns:cx="http://schemas.microsoft.com/office/drawing/2014/chartex" xmlns:cx1="http://schemas.microsoft.com/office/drawing/2015/9/8/chartex" xmlns:cx2="http://schemas.microsoft.com/office/drawing/2015/10/21/chartex" xmlns:cx3="http://schemas.microsoft.com/office/drawing/2016/5/9/chartex" xmlns:cx4="http://schemas.microsoft.com/office/drawing/2016/5/10/chartex" xmlns:cx5="http://schemas.microsoft.com/office/drawing/2016/5/11/chartex" xmlns:cx6="http://schemas.microsoft.com/office/drawing/2016/5/12/chartex" xmlns:cx7="http://schemas.microsoft.com/office/drawing/2016/5/13/chartex" xmlns:cx8="http://schemas.microsoft.com/office/drawing/2016/5/14/chartex" xmlns:mc="http://schemas.openxmlformats.org/markup-compatibility/2006" xmlns:aink="http://schemas.microsoft.com/office/drawing/2016/ink" xmlns:am3d="http://schemas.microsoft.com/office/drawing/2017/model3d" xmlns:o="urn:schemas-microsoft-com:office:office" xmlns:oel="http://schemas.microsoft.com/office/2019/extlst" xmlns:r="http://schemas.openxmlformats.org/officeDocument/2006/relationships" xmlns:m="http://schemas.openxmlformats.org/officeDocument/2006/math" xmlns:v="urn:schemas-microsoft-com:vml" xmlns:wp14="http://schemas.microsoft.com/office/word/2010/wordprocessingDrawing" xmlns:wp="http://schemas.openxmlformats.org/drawingml/2006/wordprocessingDrawing" xmlns:w10="urn:schemas-microsoft-com:office:word" xmlns:w="http://schemas.openxmlformats.org/wordprocessingml/2006/main" xmlns:w14="http://schemas.microsoft.com/office/word/2010/wordml" xmlns:w15="http://schemas.microsoft.com/office/word/2012/wordml" xmlns:w16cei="http://schemas.microsoft.com/office/word/2026/wordml/cei" xmlns:w16cex="http://schemas.microsoft.com/office/word/2018/wordml/cex" xmlns:w16cid="http://schemas.microsoft.com/office/word/2016/wordml/cid" xmlns:w16="http://schemas.microsoft.com/office/word/2018/wordml" xmlns:w16du="http://schemas.microsoft.com/office/word/2023/wordml/word16du" xmlns:w16sdtdh="http://schemas.microsoft.com/office/word/2020/wordml/sdtdatahash" xmlns:w16sdtfl="http://schemas.microsoft.com/office/word/2024/wordml/sdtformatlock" xmlns:w16se="http://schemas.microsoft.com/office/word/2015/wordml/symex" xmlns:wpg="http://schemas.microsoft.com/office/word/2010/wordprocessingGroup" xmlns:wpi="http://schemas.microsoft.com/office/word/2010/wordprocessingInk" xmlns:wne="http://schemas.microsoft.com/office/word/2006/wordml" xmlns:wps="http://schemas.microsoft.com/office/word/2010/wordprocessingShape" mc:Ignorable="w14 w15 w16se w16cid w16 w16cex w16sdtdh w16sdtfl w16du wp14">
   <w:p>
     <w:pPr>
       <w:widowControl w:val="0"/>
@@ -48975,7 +49562,7 @@
 </file>
 
 <file path=word/header17.xml><?xml version="1.0" encoding="utf-8"?>
-<w:hdr xmlns:wpc="http://schemas.microsoft.com/office/word/2010/wordprocessingCanvas" xmlns:cx="http://schemas.microsoft.com/office/drawing/2014/chartex" xmlns:cx1="http://schemas.microsoft.com/office/drawing/2015/9/8/chartex" xmlns:cx2="http://schemas.microsoft.com/office/drawing/2015/10/21/chartex" xmlns:cx3="http://schemas.microsoft.com/office/drawing/2016/5/9/chartex" xmlns:cx4="http://schemas.microsoft.com/office/drawing/2016/5/10/chartex" xmlns:cx5="http://schemas.microsoft.com/office/drawing/2016/5/11/chartex" xmlns:cx6="http://schemas.microsoft.com/office/drawing/2016/5/12/chartex" xmlns:cx7="http://schemas.microsoft.com/office/drawing/2016/5/13/chartex" xmlns:cx8="http://schemas.microsoft.com/office/drawing/2016/5/14/chartex" xmlns:mc="http://schemas.openxmlformats.org/markup-compatibility/2006" xmlns:aink="http://schemas.microsoft.com/office/drawing/2016/ink" xmlns:am3d="http://schemas.microsoft.com/office/drawing/2017/model3d" xmlns:o="urn:schemas-microsoft-com:office:office" xmlns:oel="http://schemas.microsoft.com/office/2019/extlst" xmlns:r="http://schemas.openxmlformats.org/officeDocument/2006/relationships" xmlns:m="http://schemas.openxmlformats.org/officeDocument/2006/math" xmlns:v="urn:schemas-microsoft-com:vml" xmlns:wp14="http://schemas.microsoft.com/office/word/2010/wordprocessingDrawing" xmlns:wp="http://schemas.openxmlformats.org/drawingml/2006/wordprocessingDrawing" xmlns:w10="urn:schemas-microsoft-com:office:word" xmlns:w="http://schemas.openxmlformats.org/wordprocessingml/2006/main" xmlns:w14="http://schemas.microsoft.com/office/word/2010/wordml" xmlns:w15="http://schemas.microsoft.com/office/word/2012/wordml" xmlns:w16cex="http://schemas.microsoft.com/office/word/2018/wordml/cex" xmlns:w16cid="http://schemas.microsoft.com/office/word/2016/wordml/cid" xmlns:w16="http://schemas.microsoft.com/office/word/2018/wordml" xmlns:w16du="http://schemas.microsoft.com/office/word/2023/wordml/word16du" xmlns:w16sdtdh="http://schemas.microsoft.com/office/word/2020/wordml/sdtdatahash" xmlns:w16se="http://schemas.microsoft.com/office/word/2015/wordml/symex" xmlns:wpg="http://schemas.microsoft.com/office/word/2010/wordprocessingGroup" xmlns:wpi="http://schemas.microsoft.com/office/word/2010/wordprocessingInk" xmlns:wne="http://schemas.microsoft.com/office/word/2006/wordml" xmlns:wps="http://schemas.microsoft.com/office/word/2010/wordprocessingShape" mc:Ignorable="w14 w15 w16se w16cid w16 w16cex w16sdtdh w16du wp14">
+<w:hdr xmlns:wpc="http://schemas.microsoft.com/office/word/2010/wordprocessingCanvas" xmlns:cx="http://schemas.microsoft.com/office/drawing/2014/chartex" xmlns:cx1="http://schemas.microsoft.com/office/drawing/2015/9/8/chartex" xmlns:cx2="http://schemas.microsoft.com/office/drawing/2015/10/21/chartex" xmlns:cx3="http://schemas.microsoft.com/office/drawing/2016/5/9/chartex" xmlns:cx4="http://schemas.microsoft.com/office/drawing/2016/5/10/chartex" xmlns:cx5="http://schemas.microsoft.com/office/drawing/2016/5/11/chartex" xmlns:cx6="http://schemas.microsoft.com/office/drawing/2016/5/12/chartex" xmlns:cx7="http://schemas.microsoft.com/office/drawing/2016/5/13/chartex" xmlns:cx8="http://schemas.microsoft.com/office/drawing/2016/5/14/chartex" xmlns:mc="http://schemas.openxmlformats.org/markup-compatibility/2006" xmlns:aink="http://schemas.microsoft.com/office/drawing/2016/ink" xmlns:am3d="http://schemas.microsoft.com/office/drawing/2017/model3d" xmlns:o="urn:schemas-microsoft-com:office:office" xmlns:oel="http://schemas.microsoft.com/office/2019/extlst" xmlns:r="http://schemas.openxmlformats.org/officeDocument/2006/relationships" xmlns:m="http://schemas.openxmlformats.org/officeDocument/2006/math" xmlns:v="urn:schemas-microsoft-com:vml" xmlns:wp14="http://schemas.microsoft.com/office/word/2010/wordprocessingDrawing" xmlns:wp="http://schemas.openxmlformats.org/drawingml/2006/wordprocessingDrawing" xmlns:w10="urn:schemas-microsoft-com:office:word" xmlns:w="http://schemas.openxmlformats.org/wordprocessingml/2006/main" xmlns:w14="http://schemas.microsoft.com/office/word/2010/wordml" xmlns:w15="http://schemas.microsoft.com/office/word/2012/wordml" xmlns:w16cei="http://schemas.microsoft.com/office/word/2026/wordml/cei" xmlns:w16cex="http://schemas.microsoft.com/office/word/2018/wordml/cex" xmlns:w16cid="http://schemas.microsoft.com/office/word/2016/wordml/cid" xmlns:w16="http://schemas.microsoft.com/office/word/2018/wordml" xmlns:w16du="http://schemas.microsoft.com/office/word/2023/wordml/word16du" xmlns:w16sdtdh="http://schemas.microsoft.com/office/word/2020/wordml/sdtdatahash" xmlns:w16sdtfl="http://schemas.microsoft.com/office/word/2024/wordml/sdtformatlock" xmlns:w16se="http://schemas.microsoft.com/office/word/2015/wordml/symex" xmlns:wpg="http://schemas.microsoft.com/office/word/2010/wordprocessingGroup" xmlns:wpi="http://schemas.microsoft.com/office/word/2010/wordprocessingInk" xmlns:wne="http://schemas.microsoft.com/office/word/2006/wordml" xmlns:wps="http://schemas.microsoft.com/office/word/2010/wordprocessingShape" mc:Ignorable="w14 w15 w16se w16cid w16 w16cex w16sdtdh w16sdtfl w16du wp14">
   <w:p>
     <w:pPr>
       <w:widowControl w:val="0"/>
@@ -49129,7 +49716,7 @@
 </file>
 
 <file path=word/header2.xml><?xml version="1.0" encoding="utf-8"?>
-<w:hdr xmlns:wpc="http://schemas.microsoft.com/office/word/2010/wordprocessingCanvas" xmlns:cx="http://schemas.microsoft.com/office/drawing/2014/chartex" xmlns:cx1="http://schemas.microsoft.com/office/drawing/2015/9/8/chartex" xmlns:cx2="http://schemas.microsoft.com/office/drawing/2015/10/21/chartex" xmlns:cx3="http://schemas.microsoft.com/office/drawing/2016/5/9/chartex" xmlns:cx4="http://schemas.microsoft.com/office/drawing/2016/5/10/chartex" xmlns:cx5="http://schemas.microsoft.com/office/drawing/2016/5/11/chartex" xmlns:cx6="http://schemas.microsoft.com/office/drawing/2016/5/12/chartex" xmlns:cx7="http://schemas.microsoft.com/office/drawing/2016/5/13/chartex" xmlns:cx8="http://schemas.microsoft.com/office/drawing/2016/5/14/chartex" xmlns:mc="http://schemas.openxmlformats.org/markup-compatibility/2006" xmlns:aink="http://schemas.microsoft.com/office/drawing/2016/ink" xmlns:am3d="http://schemas.microsoft.com/office/drawing/2017/model3d" xmlns:o="urn:schemas-microsoft-com:office:office" xmlns:oel="http://schemas.microsoft.com/office/2019/extlst" xmlns:r="http://schemas.openxmlformats.org/officeDocument/2006/relationships" xmlns:m="http://schemas.openxmlformats.org/officeDocument/2006/math" xmlns:v="urn:schemas-microsoft-com:vml" xmlns:wp14="http://schemas.microsoft.com/office/word/2010/wordprocessingDrawing" xmlns:wp="http://schemas.openxmlformats.org/drawingml/2006/wordprocessingDrawing" xmlns:w10="urn:schemas-microsoft-com:office:word" xmlns:w="http://schemas.openxmlformats.org/wordprocessingml/2006/main" xmlns:w14="http://schemas.microsoft.com/office/word/2010/wordml" xmlns:w15="http://schemas.microsoft.com/office/word/2012/wordml" xmlns:w16cex="http://schemas.microsoft.com/office/word/2018/wordml/cex" xmlns:w16cid="http://schemas.microsoft.com/office/word/2016/wordml/cid" xmlns:w16="http://schemas.microsoft.com/office/word/2018/wordml" xmlns:w16du="http://schemas.microsoft.com/office/word/2023/wordml/word16du" xmlns:w16sdtdh="http://schemas.microsoft.com/office/word/2020/wordml/sdtdatahash" xmlns:w16se="http://schemas.microsoft.com/office/word/2015/wordml/symex" xmlns:wpg="http://schemas.microsoft.com/office/word/2010/wordprocessingGroup" xmlns:wpi="http://schemas.microsoft.com/office/word/2010/wordprocessingInk" xmlns:wne="http://schemas.microsoft.com/office/word/2006/wordml" xmlns:wps="http://schemas.microsoft.com/office/word/2010/wordprocessingShape" mc:Ignorable="w14 w15 w16se w16cid w16 w16cex w16sdtdh w16du wp14">
+<w:hdr xmlns:wpc="http://schemas.microsoft.com/office/word/2010/wordprocessingCanvas" xmlns:cx="http://schemas.microsoft.com/office/drawing/2014/chartex" xmlns:cx1="http://schemas.microsoft.com/office/drawing/2015/9/8/chartex" xmlns:cx2="http://schemas.microsoft.com/office/drawing/2015/10/21/chartex" xmlns:cx3="http://schemas.microsoft.com/office/drawing/2016/5/9/chartex" xmlns:cx4="http://schemas.microsoft.com/office/drawing/2016/5/10/chartex" xmlns:cx5="http://schemas.microsoft.com/office/drawing/2016/5/11/chartex" xmlns:cx6="http://schemas.microsoft.com/office/drawing/2016/5/12/chartex" xmlns:cx7="http://schemas.microsoft.com/office/drawing/2016/5/13/chartex" xmlns:cx8="http://schemas.microsoft.com/office/drawing/2016/5/14/chartex" xmlns:mc="http://schemas.openxmlformats.org/markup-compatibility/2006" xmlns:aink="http://schemas.microsoft.com/office/drawing/2016/ink" xmlns:am3d="http://schemas.microsoft.com/office/drawing/2017/model3d" xmlns:o="urn:schemas-microsoft-com:office:office" xmlns:oel="http://schemas.microsoft.com/office/2019/extlst" xmlns:r="http://schemas.openxmlformats.org/officeDocument/2006/relationships" xmlns:m="http://schemas.openxmlformats.org/officeDocument/2006/math" xmlns:v="urn:schemas-microsoft-com:vml" xmlns:wp14="http://schemas.microsoft.com/office/word/2010/wordprocessingDrawing" xmlns:wp="http://schemas.openxmlformats.org/drawingml/2006/wordprocessingDrawing" xmlns:w10="urn:schemas-microsoft-com:office:word" xmlns:w="http://schemas.openxmlformats.org/wordprocessingml/2006/main" xmlns:w14="http://schemas.microsoft.com/office/word/2010/wordml" xmlns:w15="http://schemas.microsoft.com/office/word/2012/wordml" xmlns:w16cei="http://schemas.microsoft.com/office/word/2026/wordml/cei" xmlns:w16cex="http://schemas.microsoft.com/office/word/2018/wordml/cex" xmlns:w16cid="http://schemas.microsoft.com/office/word/2016/wordml/cid" xmlns:w16="http://schemas.microsoft.com/office/word/2018/wordml" xmlns:w16du="http://schemas.microsoft.com/office/word/2023/wordml/word16du" xmlns:w16sdtdh="http://schemas.microsoft.com/office/word/2020/wordml/sdtdatahash" xmlns:w16sdtfl="http://schemas.microsoft.com/office/word/2024/wordml/sdtformatlock" xmlns:w16se="http://schemas.microsoft.com/office/word/2015/wordml/symex" xmlns:wpg="http://schemas.microsoft.com/office/word/2010/wordprocessingGroup" xmlns:wpi="http://schemas.microsoft.com/office/word/2010/wordprocessingInk" xmlns:wne="http://schemas.microsoft.com/office/word/2006/wordml" xmlns:wps="http://schemas.microsoft.com/office/word/2010/wordprocessingShape" mc:Ignorable="w14 w15 w16se w16cid w16 w16cex w16sdtdh w16sdtfl w16du wp14">
   <w:p>
     <w:pPr>
       <w:pStyle w:val="Header"/>
@@ -49156,7 +49743,7 @@
 </file>
 
 <file path=word/header3.xml><?xml version="1.0" encoding="utf-8"?>
-<w:hdr xmlns:wpc="http://schemas.microsoft.com/office/word/2010/wordprocessingCanvas" xmlns:cx="http://schemas.microsoft.com/office/drawing/2014/chartex" xmlns:cx1="http://schemas.microsoft.com/office/drawing/2015/9/8/chartex" xmlns:cx2="http://schemas.microsoft.com/office/drawing/2015/10/21/chartex" xmlns:cx3="http://schemas.microsoft.com/office/drawing/2016/5/9/chartex" xmlns:cx4="http://schemas.microsoft.com/office/drawing/2016/5/10/chartex" xmlns:cx5="http://schemas.microsoft.com/office/drawing/2016/5/11/chartex" xmlns:cx6="http://schemas.microsoft.com/office/drawing/2016/5/12/chartex" xmlns:cx7="http://schemas.microsoft.com/office/drawing/2016/5/13/chartex" xmlns:cx8="http://schemas.microsoft.com/office/drawing/2016/5/14/chartex" xmlns:mc="http://schemas.openxmlformats.org/markup-compatibility/2006" xmlns:aink="http://schemas.microsoft.com/office/drawing/2016/ink" xmlns:am3d="http://schemas.microsoft.com/office/drawing/2017/model3d" xmlns:o="urn:schemas-microsoft-com:office:office" xmlns:oel="http://schemas.microsoft.com/office/2019/extlst" xmlns:r="http://schemas.openxmlformats.org/officeDocument/2006/relationships" xmlns:m="http://schemas.openxmlformats.org/officeDocument/2006/math" xmlns:v="urn:schemas-microsoft-com:vml" xmlns:wp14="http://schemas.microsoft.com/office/word/2010/wordprocessingDrawing" xmlns:wp="http://schemas.openxmlformats.org/drawingml/2006/wordprocessingDrawing" xmlns:w10="urn:schemas-microsoft-com:office:word" xmlns:w="http://schemas.openxmlformats.org/wordprocessingml/2006/main" xmlns:w14="http://schemas.microsoft.com/office/word/2010/wordml" xmlns:w15="http://schemas.microsoft.com/office/word/2012/wordml" xmlns:w16cex="http://schemas.microsoft.com/office/word/2018/wordml/cex" xmlns:w16cid="http://schemas.microsoft.com/office/word/2016/wordml/cid" xmlns:w16="http://schemas.microsoft.com/office/word/2018/wordml" xmlns:w16du="http://schemas.microsoft.com/office/word/2023/wordml/word16du" xmlns:w16sdtdh="http://schemas.microsoft.com/office/word/2020/wordml/sdtdatahash" xmlns:w16se="http://schemas.microsoft.com/office/word/2015/wordml/symex" xmlns:wpg="http://schemas.microsoft.com/office/word/2010/wordprocessingGroup" xmlns:wpi="http://schemas.microsoft.com/office/word/2010/wordprocessingInk" xmlns:wne="http://schemas.microsoft.com/office/word/2006/wordml" xmlns:wps="http://schemas.microsoft.com/office/word/2010/wordprocessingShape" mc:Ignorable="w14 w15 w16se w16cid w16 w16cex w16sdtdh w16du wp14">
+<w:hdr xmlns:wpc="http://schemas.microsoft.com/office/word/2010/wordprocessingCanvas" xmlns:cx="http://schemas.microsoft.com/office/drawing/2014/chartex" xmlns:cx1="http://schemas.microsoft.com/office/drawing/2015/9/8/chartex" xmlns:cx2="http://schemas.microsoft.com/office/drawing/2015/10/21/chartex" xmlns:cx3="http://schemas.microsoft.com/office/drawing/2016/5/9/chartex" xmlns:cx4="http://schemas.microsoft.com/office/drawing/2016/5/10/chartex" xmlns:cx5="http://schemas.microsoft.com/office/drawing/2016/5/11/chartex" xmlns:cx6="http://schemas.microsoft.com/office/drawing/2016/5/12/chartex" xmlns:cx7="http://schemas.microsoft.com/office/drawing/2016/5/13/chartex" xmlns:cx8="http://schemas.microsoft.com/office/drawing/2016/5/14/chartex" xmlns:mc="http://schemas.openxmlformats.org/markup-compatibility/2006" xmlns:aink="http://schemas.microsoft.com/office/drawing/2016/ink" xmlns:am3d="http://schemas.microsoft.com/office/drawing/2017/model3d" xmlns:o="urn:schemas-microsoft-com:office:office" xmlns:oel="http://schemas.microsoft.com/office/2019/extlst" xmlns:r="http://schemas.openxmlformats.org/officeDocument/2006/relationships" xmlns:m="http://schemas.openxmlformats.org/officeDocument/2006/math" xmlns:v="urn:schemas-microsoft-com:vml" xmlns:wp14="http://schemas.microsoft.com/office/word/2010/wordprocessingDrawing" xmlns:wp="http://schemas.openxmlformats.org/drawingml/2006/wordprocessingDrawing" xmlns:w10="urn:schemas-microsoft-com:office:word" xmlns:w="http://schemas.openxmlformats.org/wordprocessingml/2006/main" xmlns:w14="http://schemas.microsoft.com/office/word/2010/wordml" xmlns:w15="http://schemas.microsoft.com/office/word/2012/wordml" xmlns:w16cei="http://schemas.microsoft.com/office/word/2026/wordml/cei" xmlns:w16cex="http://schemas.microsoft.com/office/word/2018/wordml/cex" xmlns:w16cid="http://schemas.microsoft.com/office/word/2016/wordml/cid" xmlns:w16="http://schemas.microsoft.com/office/word/2018/wordml" xmlns:w16du="http://schemas.microsoft.com/office/word/2023/wordml/word16du" xmlns:w16sdtdh="http://schemas.microsoft.com/office/word/2020/wordml/sdtdatahash" xmlns:w16sdtfl="http://schemas.microsoft.com/office/word/2024/wordml/sdtformatlock" xmlns:w16se="http://schemas.microsoft.com/office/word/2015/wordml/symex" xmlns:wpg="http://schemas.microsoft.com/office/word/2010/wordprocessingGroup" xmlns:wpi="http://schemas.microsoft.com/office/word/2010/wordprocessingInk" xmlns:wne="http://schemas.microsoft.com/office/word/2006/wordml" xmlns:wps="http://schemas.microsoft.com/office/word/2010/wordprocessingShape" mc:Ignorable="w14 w15 w16se w16cid w16 w16cex w16sdtdh w16sdtfl w16du wp14">
   <w:p>
     <w:pPr>
       <w:pStyle w:val="Header"/>
@@ -49196,7 +49783,7 @@
 </file>
 
 <file path=word/header4.xml><?xml version="1.0" encoding="utf-8"?>
-<w:hdr xmlns:wpc="http://schemas.microsoft.com/office/word/2010/wordprocessingCanvas" xmlns:cx="http://schemas.microsoft.com/office/drawing/2014/chartex" xmlns:cx1="http://schemas.microsoft.com/office/drawing/2015/9/8/chartex" xmlns:cx2="http://schemas.microsoft.com/office/drawing/2015/10/21/chartex" xmlns:cx3="http://schemas.microsoft.com/office/drawing/2016/5/9/chartex" xmlns:cx4="http://schemas.microsoft.com/office/drawing/2016/5/10/chartex" xmlns:cx5="http://schemas.microsoft.com/office/drawing/2016/5/11/chartex" xmlns:cx6="http://schemas.microsoft.com/office/drawing/2016/5/12/chartex" xmlns:cx7="http://schemas.microsoft.com/office/drawing/2016/5/13/chartex" xmlns:cx8="http://schemas.microsoft.com/office/drawing/2016/5/14/chartex" xmlns:mc="http://schemas.openxmlformats.org/markup-compatibility/2006" xmlns:aink="http://schemas.microsoft.com/office/drawing/2016/ink" xmlns:am3d="http://schemas.microsoft.com/office/drawing/2017/model3d" xmlns:o="urn:schemas-microsoft-com:office:office" xmlns:oel="http://schemas.microsoft.com/office/2019/extlst" xmlns:r="http://schemas.openxmlformats.org/officeDocument/2006/relationships" xmlns:m="http://schemas.openxmlformats.org/officeDocument/2006/math" xmlns:v="urn:schemas-microsoft-com:vml" xmlns:wp14="http://schemas.microsoft.com/office/word/2010/wordprocessingDrawing" xmlns:wp="http://schemas.openxmlformats.org/drawingml/2006/wordprocessingDrawing" xmlns:w10="urn:schemas-microsoft-com:office:word" xmlns:w="http://schemas.openxmlformats.org/wordprocessingml/2006/main" xmlns:w14="http://schemas.microsoft.com/office/word/2010/wordml" xmlns:w15="http://schemas.microsoft.com/office/word/2012/wordml" xmlns:w16cex="http://schemas.microsoft.com/office/word/2018/wordml/cex" xmlns:w16cid="http://schemas.microsoft.com/office/word/2016/wordml/cid" xmlns:w16="http://schemas.microsoft.com/office/word/2018/wordml" xmlns:w16du="http://schemas.microsoft.com/office/word/2023/wordml/word16du" xmlns:w16sdtdh="http://schemas.microsoft.com/office/word/2020/wordml/sdtdatahash" xmlns:w16se="http://schemas.microsoft.com/office/word/2015/wordml/symex" xmlns:wpg="http://schemas.microsoft.com/office/word/2010/wordprocessingGroup" xmlns:wpi="http://schemas.microsoft.com/office/word/2010/wordprocessingInk" xmlns:wne="http://schemas.microsoft.com/office/word/2006/wordml" xmlns:wps="http://schemas.microsoft.com/office/word/2010/wordprocessingShape" mc:Ignorable="w14 w15 w16se w16cid w16 w16cex w16sdtdh w16du wp14">
+<w:hdr xmlns:wpc="http://schemas.microsoft.com/office/word/2010/wordprocessingCanvas" xmlns:cx="http://schemas.microsoft.com/office/drawing/2014/chartex" xmlns:cx1="http://schemas.microsoft.com/office/drawing/2015/9/8/chartex" xmlns:cx2="http://schemas.microsoft.com/office/drawing/2015/10/21/chartex" xmlns:cx3="http://schemas.microsoft.com/office/drawing/2016/5/9/chartex" xmlns:cx4="http://schemas.microsoft.com/office/drawing/2016/5/10/chartex" xmlns:cx5="http://schemas.microsoft.com/office/drawing/2016/5/11/chartex" xmlns:cx6="http://schemas.microsoft.com/office/drawing/2016/5/12/chartex" xmlns:cx7="http://schemas.microsoft.com/office/drawing/2016/5/13/chartex" xmlns:cx8="http://schemas.microsoft.com/office/drawing/2016/5/14/chartex" xmlns:mc="http://schemas.openxmlformats.org/markup-compatibility/2006" xmlns:aink="http://schemas.microsoft.com/office/drawing/2016/ink" xmlns:am3d="http://schemas.microsoft.com/office/drawing/2017/model3d" xmlns:o="urn:schemas-microsoft-com:office:office" xmlns:oel="http://schemas.microsoft.com/office/2019/extlst" xmlns:r="http://schemas.openxmlformats.org/officeDocument/2006/relationships" xmlns:m="http://schemas.openxmlformats.org/officeDocument/2006/math" xmlns:v="urn:schemas-microsoft-com:vml" xmlns:wp14="http://schemas.microsoft.com/office/word/2010/wordprocessingDrawing" xmlns:wp="http://schemas.openxmlformats.org/drawingml/2006/wordprocessingDrawing" xmlns:w10="urn:schemas-microsoft-com:office:word" xmlns:w="http://schemas.openxmlformats.org/wordprocessingml/2006/main" xmlns:w14="http://schemas.microsoft.com/office/word/2010/wordml" xmlns:w15="http://schemas.microsoft.com/office/word/2012/wordml" xmlns:w16cei="http://schemas.microsoft.com/office/word/2026/wordml/cei" xmlns:w16cex="http://schemas.microsoft.com/office/word/2018/wordml/cex" xmlns:w16cid="http://schemas.microsoft.com/office/word/2016/wordml/cid" xmlns:w16="http://schemas.microsoft.com/office/word/2018/wordml" xmlns:w16du="http://schemas.microsoft.com/office/word/2023/wordml/word16du" xmlns:w16sdtdh="http://schemas.microsoft.com/office/word/2020/wordml/sdtdatahash" xmlns:w16sdtfl="http://schemas.microsoft.com/office/word/2024/wordml/sdtformatlock" xmlns:w16se="http://schemas.microsoft.com/office/word/2015/wordml/symex" xmlns:wpg="http://schemas.microsoft.com/office/word/2010/wordprocessingGroup" xmlns:wpi="http://schemas.microsoft.com/office/word/2010/wordprocessingInk" xmlns:wne="http://schemas.microsoft.com/office/word/2006/wordml" xmlns:wps="http://schemas.microsoft.com/office/word/2010/wordprocessingShape" mc:Ignorable="w14 w15 w16se w16cid w16 w16cex w16sdtdh w16sdtfl w16du wp14">
   <w:p>
     <w:pPr>
       <w:pStyle w:val="Header"/>
@@ -49223,7 +49810,7 @@
 </file>
 
 <file path=word/header5.xml><?xml version="1.0" encoding="utf-8"?>
-<w:hdr xmlns:wpc="http://schemas.microsoft.com/office/word/2010/wordprocessingCanvas" xmlns:cx="http://schemas.microsoft.com/office/drawing/2014/chartex" xmlns:cx1="http://schemas.microsoft.com/office/drawing/2015/9/8/chartex" xmlns:cx2="http://schemas.microsoft.com/office/drawing/2015/10/21/chartex" xmlns:cx3="http://schemas.microsoft.com/office/drawing/2016/5/9/chartex" xmlns:cx4="http://schemas.microsoft.com/office/drawing/2016/5/10/chartex" xmlns:cx5="http://schemas.microsoft.com/office/drawing/2016/5/11/chartex" xmlns:cx6="http://schemas.microsoft.com/office/drawing/2016/5/12/chartex" xmlns:cx7="http://schemas.microsoft.com/office/drawing/2016/5/13/chartex" xmlns:cx8="http://schemas.microsoft.com/office/drawing/2016/5/14/chartex" xmlns:mc="http://schemas.openxmlformats.org/markup-compatibility/2006" xmlns:aink="http://schemas.microsoft.com/office/drawing/2016/ink" xmlns:am3d="http://schemas.microsoft.com/office/drawing/2017/model3d" xmlns:o="urn:schemas-microsoft-com:office:office" xmlns:oel="http://schemas.microsoft.com/office/2019/extlst" xmlns:r="http://schemas.openxmlformats.org/officeDocument/2006/relationships" xmlns:m="http://schemas.openxmlformats.org/officeDocument/2006/math" xmlns:v="urn:schemas-microsoft-com:vml" xmlns:wp14="http://schemas.microsoft.com/office/word/2010/wordprocessingDrawing" xmlns:wp="http://schemas.openxmlformats.org/drawingml/2006/wordprocessingDrawing" xmlns:w10="urn:schemas-microsoft-com:office:word" xmlns:w="http://schemas.openxmlformats.org/wordprocessingml/2006/main" xmlns:w14="http://schemas.microsoft.com/office/word/2010/wordml" xmlns:w15="http://schemas.microsoft.com/office/word/2012/wordml" xmlns:w16cex="http://schemas.microsoft.com/office/word/2018/wordml/cex" xmlns:w16cid="http://schemas.microsoft.com/office/word/2016/wordml/cid" xmlns:w16="http://schemas.microsoft.com/office/word/2018/wordml" xmlns:w16du="http://schemas.microsoft.com/office/word/2023/wordml/word16du" xmlns:w16sdtdh="http://schemas.microsoft.com/office/word/2020/wordml/sdtdatahash" xmlns:w16se="http://schemas.microsoft.com/office/word/2015/wordml/symex" xmlns:wpg="http://schemas.microsoft.com/office/word/2010/wordprocessingGroup" xmlns:wpi="http://schemas.microsoft.com/office/word/2010/wordprocessingInk" xmlns:wne="http://schemas.microsoft.com/office/word/2006/wordml" xmlns:wps="http://schemas.microsoft.com/office/word/2010/wordprocessingShape" mc:Ignorable="w14 w15 w16se w16cid w16 w16cex w16sdtdh w16du wp14">
+<w:hdr xmlns:wpc="http://schemas.microsoft.com/office/word/2010/wordprocessingCanvas" xmlns:cx="http://schemas.microsoft.com/office/drawing/2014/chartex" xmlns:cx1="http://schemas.microsoft.com/office/drawing/2015/9/8/chartex" xmlns:cx2="http://schemas.microsoft.com/office/drawing/2015/10/21/chartex" xmlns:cx3="http://schemas.microsoft.com/office/drawing/2016/5/9/chartex" xmlns:cx4="http://schemas.microsoft.com/office/drawing/2016/5/10/chartex" xmlns:cx5="http://schemas.microsoft.com/office/drawing/2016/5/11/chartex" xmlns:cx6="http://schemas.microsoft.com/office/drawing/2016/5/12/chartex" xmlns:cx7="http://schemas.microsoft.com/office/drawing/2016/5/13/chartex" xmlns:cx8="http://schemas.microsoft.com/office/drawing/2016/5/14/chartex" xmlns:mc="http://schemas.openxmlformats.org/markup-compatibility/2006" xmlns:aink="http://schemas.microsoft.com/office/drawing/2016/ink" xmlns:am3d="http://schemas.microsoft.com/office/drawing/2017/model3d" xmlns:o="urn:schemas-microsoft-com:office:office" xmlns:oel="http://schemas.microsoft.com/office/2019/extlst" xmlns:r="http://schemas.openxmlformats.org/officeDocument/2006/relationships" xmlns:m="http://schemas.openxmlformats.org/officeDocument/2006/math" xmlns:v="urn:schemas-microsoft-com:vml" xmlns:wp14="http://schemas.microsoft.com/office/word/2010/wordprocessingDrawing" xmlns:wp="http://schemas.openxmlformats.org/drawingml/2006/wordprocessingDrawing" xmlns:w10="urn:schemas-microsoft-com:office:word" xmlns:w="http://schemas.openxmlformats.org/wordprocessingml/2006/main" xmlns:w14="http://schemas.microsoft.com/office/word/2010/wordml" xmlns:w15="http://schemas.microsoft.com/office/word/2012/wordml" xmlns:w16cei="http://schemas.microsoft.com/office/word/2026/wordml/cei" xmlns:w16cex="http://schemas.microsoft.com/office/word/2018/wordml/cex" xmlns:w16cid="http://schemas.microsoft.com/office/word/2016/wordml/cid" xmlns:w16="http://schemas.microsoft.com/office/word/2018/wordml" xmlns:w16du="http://schemas.microsoft.com/office/word/2023/wordml/word16du" xmlns:w16sdtdh="http://schemas.microsoft.com/office/word/2020/wordml/sdtdatahash" xmlns:w16sdtfl="http://schemas.microsoft.com/office/word/2024/wordml/sdtformatlock" xmlns:w16se="http://schemas.microsoft.com/office/word/2015/wordml/symex" xmlns:wpg="http://schemas.microsoft.com/office/word/2010/wordprocessingGroup" xmlns:wpi="http://schemas.microsoft.com/office/word/2010/wordprocessingInk" xmlns:wne="http://schemas.microsoft.com/office/word/2006/wordml" xmlns:wps="http://schemas.microsoft.com/office/word/2010/wordprocessingShape" mc:Ignorable="w14 w15 w16se w16cid w16 w16cex w16sdtdh w16sdtfl w16du wp14">
   <w:p>
     <w:pPr>
       <w:pStyle w:val="Header"/>
@@ -49250,7 +49837,7 @@
 </file>
 
 <file path=word/header6.xml><?xml version="1.0" encoding="utf-8"?>
-<w:hdr xmlns:wpc="http://schemas.microsoft.com/office/word/2010/wordprocessingCanvas" xmlns:cx="http://schemas.microsoft.com/office/drawing/2014/chartex" xmlns:cx1="http://schemas.microsoft.com/office/drawing/2015/9/8/chartex" xmlns:cx2="http://schemas.microsoft.com/office/drawing/2015/10/21/chartex" xmlns:cx3="http://schemas.microsoft.com/office/drawing/2016/5/9/chartex" xmlns:cx4="http://schemas.microsoft.com/office/drawing/2016/5/10/chartex" xmlns:cx5="http://schemas.microsoft.com/office/drawing/2016/5/11/chartex" xmlns:cx6="http://schemas.microsoft.com/office/drawing/2016/5/12/chartex" xmlns:cx7="http://schemas.microsoft.com/office/drawing/2016/5/13/chartex" xmlns:cx8="http://schemas.microsoft.com/office/drawing/2016/5/14/chartex" xmlns:mc="http://schemas.openxmlformats.org/markup-compatibility/2006" xmlns:aink="http://schemas.microsoft.com/office/drawing/2016/ink" xmlns:am3d="http://schemas.microsoft.com/office/drawing/2017/model3d" xmlns:o="urn:schemas-microsoft-com:office:office" xmlns:oel="http://schemas.microsoft.com/office/2019/extlst" xmlns:r="http://schemas.openxmlformats.org/officeDocument/2006/relationships" xmlns:m="http://schemas.openxmlformats.org/officeDocument/2006/math" xmlns:v="urn:schemas-microsoft-com:vml" xmlns:wp14="http://schemas.microsoft.com/office/word/2010/wordprocessingDrawing" xmlns:wp="http://schemas.openxmlformats.org/drawingml/2006/wordprocessingDrawing" xmlns:w10="urn:schemas-microsoft-com:office:word" xmlns:w="http://schemas.openxmlformats.org/wordprocessingml/2006/main" xmlns:w14="http://schemas.microsoft.com/office/word/2010/wordml" xmlns:w15="http://schemas.microsoft.com/office/word/2012/wordml" xmlns:w16cex="http://schemas.microsoft.com/office/word/2018/wordml/cex" xmlns:w16cid="http://schemas.microsoft.com/office/word/2016/wordml/cid" xmlns:w16="http://schemas.microsoft.com/office/word/2018/wordml" xmlns:w16du="http://schemas.microsoft.com/office/word/2023/wordml/word16du" xmlns:w16sdtdh="http://schemas.microsoft.com/office/word/2020/wordml/sdtdatahash" xmlns:w16se="http://schemas.microsoft.com/office/word/2015/wordml/symex" xmlns:wpg="http://schemas.microsoft.com/office/word/2010/wordprocessingGroup" xmlns:wpi="http://schemas.microsoft.com/office/word/2010/wordprocessingInk" xmlns:wne="http://schemas.microsoft.com/office/word/2006/wordml" xmlns:wps="http://schemas.microsoft.com/office/word/2010/wordprocessingShape" mc:Ignorable="w14 w15 w16se w16cid w16 w16cex w16sdtdh w16du wp14">
+<w:hdr xmlns:wpc="http://schemas.microsoft.com/office/word/2010/wordprocessingCanvas" xmlns:cx="http://schemas.microsoft.com/office/drawing/2014/chartex" xmlns:cx1="http://schemas.microsoft.com/office/drawing/2015/9/8/chartex" xmlns:cx2="http://schemas.microsoft.com/office/drawing/2015/10/21/chartex" xmlns:cx3="http://schemas.microsoft.com/office/drawing/2016/5/9/chartex" xmlns:cx4="http://schemas.microsoft.com/office/drawing/2016/5/10/chartex" xmlns:cx5="http://schemas.microsoft.com/office/drawing/2016/5/11/chartex" xmlns:cx6="http://schemas.microsoft.com/office/drawing/2016/5/12/chartex" xmlns:cx7="http://schemas.microsoft.com/office/drawing/2016/5/13/chartex" xmlns:cx8="http://schemas.microsoft.com/office/drawing/2016/5/14/chartex" xmlns:mc="http://schemas.openxmlformats.org/markup-compatibility/2006" xmlns:aink="http://schemas.microsoft.com/office/drawing/2016/ink" xmlns:am3d="http://schemas.microsoft.com/office/drawing/2017/model3d" xmlns:o="urn:schemas-microsoft-com:office:office" xmlns:oel="http://schemas.microsoft.com/office/2019/extlst" xmlns:r="http://schemas.openxmlformats.org/officeDocument/2006/relationships" xmlns:m="http://schemas.openxmlformats.org/officeDocument/2006/math" xmlns:v="urn:schemas-microsoft-com:vml" xmlns:wp14="http://schemas.microsoft.com/office/word/2010/wordprocessingDrawing" xmlns:wp="http://schemas.openxmlformats.org/drawingml/2006/wordprocessingDrawing" xmlns:w10="urn:schemas-microsoft-com:office:word" xmlns:w="http://schemas.openxmlformats.org/wordprocessingml/2006/main" xmlns:w14="http://schemas.microsoft.com/office/word/2010/wordml" xmlns:w15="http://schemas.microsoft.com/office/word/2012/wordml" xmlns:w16cei="http://schemas.microsoft.com/office/word/2026/wordml/cei" xmlns:w16cex="http://schemas.microsoft.com/office/word/2018/wordml/cex" xmlns:w16cid="http://schemas.microsoft.com/office/word/2016/wordml/cid" xmlns:w16="http://schemas.microsoft.com/office/word/2018/wordml" xmlns:w16du="http://schemas.microsoft.com/office/word/2023/wordml/word16du" xmlns:w16sdtdh="http://schemas.microsoft.com/office/word/2020/wordml/sdtdatahash" xmlns:w16sdtfl="http://schemas.microsoft.com/office/word/2024/wordml/sdtformatlock" xmlns:w16se="http://schemas.microsoft.com/office/word/2015/wordml/symex" xmlns:wpg="http://schemas.microsoft.com/office/word/2010/wordprocessingGroup" xmlns:wpi="http://schemas.microsoft.com/office/word/2010/wordprocessingInk" xmlns:wne="http://schemas.microsoft.com/office/word/2006/wordml" xmlns:wps="http://schemas.microsoft.com/office/word/2010/wordprocessingShape" mc:Ignorable="w14 w15 w16se w16cid w16 w16cex w16sdtdh w16sdtfl w16du wp14">
   <w:p>
     <w:pPr>
       <w:widowControl w:val="0"/>
@@ -49319,7 +49906,7 @@
 </file>
 
 <file path=word/header7.xml><?xml version="1.0" encoding="utf-8"?>
-<w:hdr xmlns:wpc="http://schemas.microsoft.com/office/word/2010/wordprocessingCanvas" xmlns:cx="http://schemas.microsoft.com/office/drawing/2014/chartex" xmlns:cx1="http://schemas.microsoft.com/office/drawing/2015/9/8/chartex" xmlns:cx2="http://schemas.microsoft.com/office/drawing/2015/10/21/chartex" xmlns:cx3="http://schemas.microsoft.com/office/drawing/2016/5/9/chartex" xmlns:cx4="http://schemas.microsoft.com/office/drawing/2016/5/10/chartex" xmlns:cx5="http://schemas.microsoft.com/office/drawing/2016/5/11/chartex" xmlns:cx6="http://schemas.microsoft.com/office/drawing/2016/5/12/chartex" xmlns:cx7="http://schemas.microsoft.com/office/drawing/2016/5/13/chartex" xmlns:cx8="http://schemas.microsoft.com/office/drawing/2016/5/14/chartex" xmlns:mc="http://schemas.openxmlformats.org/markup-compatibility/2006" xmlns:aink="http://schemas.microsoft.com/office/drawing/2016/ink" xmlns:am3d="http://schemas.microsoft.com/office/drawing/2017/model3d" xmlns:o="urn:schemas-microsoft-com:office:office" xmlns:oel="http://schemas.microsoft.com/office/2019/extlst" xmlns:r="http://schemas.openxmlformats.org/officeDocument/2006/relationships" xmlns:m="http://schemas.openxmlformats.org/officeDocument/2006/math" xmlns:v="urn:schemas-microsoft-com:vml" xmlns:wp14="http://schemas.microsoft.com/office/word/2010/wordprocessingDrawing" xmlns:wp="http://schemas.openxmlformats.org/drawingml/2006/wordprocessingDrawing" xmlns:w10="urn:schemas-microsoft-com:office:word" xmlns:w="http://schemas.openxmlformats.org/wordprocessingml/2006/main" xmlns:w14="http://schemas.microsoft.com/office/word/2010/wordml" xmlns:w15="http://schemas.microsoft.com/office/word/2012/wordml" xmlns:w16cex="http://schemas.microsoft.com/office/word/2018/wordml/cex" xmlns:w16cid="http://schemas.microsoft.com/office/word/2016/wordml/cid" xmlns:w16="http://schemas.microsoft.com/office/word/2018/wordml" xmlns:w16du="http://schemas.microsoft.com/office/word/2023/wordml/word16du" xmlns:w16sdtdh="http://schemas.microsoft.com/office/word/2020/wordml/sdtdatahash" xmlns:w16se="http://schemas.microsoft.com/office/word/2015/wordml/symex" xmlns:wpg="http://schemas.microsoft.com/office/word/2010/wordprocessingGroup" xmlns:wpi="http://schemas.microsoft.com/office/word/2010/wordprocessingInk" xmlns:wne="http://schemas.microsoft.com/office/word/2006/wordml" xmlns:wps="http://schemas.microsoft.com/office/word/2010/wordprocessingShape" mc:Ignorable="w14 w15 w16se w16cid w16 w16cex w16sdtdh w16du wp14">
+<w:hdr xmlns:wpc="http://schemas.microsoft.com/office/word/2010/wordprocessingCanvas" xmlns:cx="http://schemas.microsoft.com/office/drawing/2014/chartex" xmlns:cx1="http://schemas.microsoft.com/office/drawing/2015/9/8/chartex" xmlns:cx2="http://schemas.microsoft.com/office/drawing/2015/10/21/chartex" xmlns:cx3="http://schemas.microsoft.com/office/drawing/2016/5/9/chartex" xmlns:cx4="http://schemas.microsoft.com/office/drawing/2016/5/10/chartex" xmlns:cx5="http://schemas.microsoft.com/office/drawing/2016/5/11/chartex" xmlns:cx6="http://schemas.microsoft.com/office/drawing/2016/5/12/chartex" xmlns:cx7="http://schemas.microsoft.com/office/drawing/2016/5/13/chartex" xmlns:cx8="http://schemas.microsoft.com/office/drawing/2016/5/14/chartex" xmlns:mc="http://schemas.openxmlformats.org/markup-compatibility/2006" xmlns:aink="http://schemas.microsoft.com/office/drawing/2016/ink" xmlns:am3d="http://schemas.microsoft.com/office/drawing/2017/model3d" xmlns:o="urn:schemas-microsoft-com:office:office" xmlns:oel="http://schemas.microsoft.com/office/2019/extlst" xmlns:r="http://schemas.openxmlformats.org/officeDocument/2006/relationships" xmlns:m="http://schemas.openxmlformats.org/officeDocument/2006/math" xmlns:v="urn:schemas-microsoft-com:vml" xmlns:wp14="http://schemas.microsoft.com/office/word/2010/wordprocessingDrawing" xmlns:wp="http://schemas.openxmlformats.org/drawingml/2006/wordprocessingDrawing" xmlns:w10="urn:schemas-microsoft-com:office:word" xmlns:w="http://schemas.openxmlformats.org/wordprocessingml/2006/main" xmlns:w14="http://schemas.microsoft.com/office/word/2010/wordml" xmlns:w15="http://schemas.microsoft.com/office/word/2012/wordml" xmlns:w16cei="http://schemas.microsoft.com/office/word/2026/wordml/cei" xmlns:w16cex="http://schemas.microsoft.com/office/word/2018/wordml/cex" xmlns:w16cid="http://schemas.microsoft.com/office/word/2016/wordml/cid" xmlns:w16="http://schemas.microsoft.com/office/word/2018/wordml" xmlns:w16du="http://schemas.microsoft.com/office/word/2023/wordml/word16du" xmlns:w16sdtdh="http://schemas.microsoft.com/office/word/2020/wordml/sdtdatahash" xmlns:w16sdtfl="http://schemas.microsoft.com/office/word/2024/wordml/sdtformatlock" xmlns:w16se="http://schemas.microsoft.com/office/word/2015/wordml/symex" xmlns:wpg="http://schemas.microsoft.com/office/word/2010/wordprocessingGroup" xmlns:wpi="http://schemas.microsoft.com/office/word/2010/wordprocessingInk" xmlns:wne="http://schemas.microsoft.com/office/word/2006/wordml" xmlns:wps="http://schemas.microsoft.com/office/word/2010/wordprocessingShape" mc:Ignorable="w14 w15 w16se w16cid w16 w16cex w16sdtdh w16sdtfl w16du wp14">
   <w:p>
     <w:pPr>
       <w:widowControl w:val="0"/>
@@ -49397,7 +49984,7 @@
 </file>
 
 <file path=word/header8.xml><?xml version="1.0" encoding="utf-8"?>
-<w:hdr xmlns:wpc="http://schemas.microsoft.com/office/word/2010/wordprocessingCanvas" xmlns:cx="http://schemas.microsoft.com/office/drawing/2014/chartex" xmlns:cx1="http://schemas.microsoft.com/office/drawing/2015/9/8/chartex" xmlns:cx2="http://schemas.microsoft.com/office/drawing/2015/10/21/chartex" xmlns:cx3="http://schemas.microsoft.com/office/drawing/2016/5/9/chartex" xmlns:cx4="http://schemas.microsoft.com/office/drawing/2016/5/10/chartex" xmlns:cx5="http://schemas.microsoft.com/office/drawing/2016/5/11/chartex" xmlns:cx6="http://schemas.microsoft.com/office/drawing/2016/5/12/chartex" xmlns:cx7="http://schemas.microsoft.com/office/drawing/2016/5/13/chartex" xmlns:cx8="http://schemas.microsoft.com/office/drawing/2016/5/14/chartex" xmlns:mc="http://schemas.openxmlformats.org/markup-compatibility/2006" xmlns:aink="http://schemas.microsoft.com/office/drawing/2016/ink" xmlns:am3d="http://schemas.microsoft.com/office/drawing/2017/model3d" xmlns:o="urn:schemas-microsoft-com:office:office" xmlns:oel="http://schemas.microsoft.com/office/2019/extlst" xmlns:r="http://schemas.openxmlformats.org/officeDocument/2006/relationships" xmlns:m="http://schemas.openxmlformats.org/officeDocument/2006/math" xmlns:v="urn:schemas-microsoft-com:vml" xmlns:wp14="http://schemas.microsoft.com/office/word/2010/wordprocessingDrawing" xmlns:wp="http://schemas.openxmlformats.org/drawingml/2006/wordprocessingDrawing" xmlns:w10="urn:schemas-microsoft-com:office:word" xmlns:w="http://schemas.openxmlformats.org/wordprocessingml/2006/main" xmlns:w14="http://schemas.microsoft.com/office/word/2010/wordml" xmlns:w15="http://schemas.microsoft.com/office/word/2012/wordml" xmlns:w16cex="http://schemas.microsoft.com/office/word/2018/wordml/cex" xmlns:w16cid="http://schemas.microsoft.com/office/word/2016/wordml/cid" xmlns:w16="http://schemas.microsoft.com/office/word/2018/wordml" xmlns:w16du="http://schemas.microsoft.com/office/word/2023/wordml/word16du" xmlns:w16sdtdh="http://schemas.microsoft.com/office/word/2020/wordml/sdtdatahash" xmlns:w16se="http://schemas.microsoft.com/office/word/2015/wordml/symex" xmlns:wpg="http://schemas.microsoft.com/office/word/2010/wordprocessingGroup" xmlns:wpi="http://schemas.microsoft.com/office/word/2010/wordprocessingInk" xmlns:wne="http://schemas.microsoft.com/office/word/2006/wordml" xmlns:wps="http://schemas.microsoft.com/office/word/2010/wordprocessingShape" mc:Ignorable="w14 w15 w16se w16cid w16 w16cex w16sdtdh w16du wp14">
+<w:hdr xmlns:wpc="http://schemas.microsoft.com/office/word/2010/wordprocessingCanvas" xmlns:cx="http://schemas.microsoft.com/office/drawing/2014/chartex" xmlns:cx1="http://schemas.microsoft.com/office/drawing/2015/9/8/chartex" xmlns:cx2="http://schemas.microsoft.com/office/drawing/2015/10/21/chartex" xmlns:cx3="http://schemas.microsoft.com/office/drawing/2016/5/9/chartex" xmlns:cx4="http://schemas.microsoft.com/office/drawing/2016/5/10/chartex" xmlns:cx5="http://schemas.microsoft.com/office/drawing/2016/5/11/chartex" xmlns:cx6="http://schemas.microsoft.com/office/drawing/2016/5/12/chartex" xmlns:cx7="http://schemas.microsoft.com/office/drawing/2016/5/13/chartex" xmlns:cx8="http://schemas.microsoft.com/office/drawing/2016/5/14/chartex" xmlns:mc="http://schemas.openxmlformats.org/markup-compatibility/2006" xmlns:aink="http://schemas.microsoft.com/office/drawing/2016/ink" xmlns:am3d="http://schemas.microsoft.com/office/drawing/2017/model3d" xmlns:o="urn:schemas-microsoft-com:office:office" xmlns:oel="http://schemas.microsoft.com/office/2019/extlst" xmlns:r="http://schemas.openxmlformats.org/officeDocument/2006/relationships" xmlns:m="http://schemas.openxmlformats.org/officeDocument/2006/math" xmlns:v="urn:schemas-microsoft-com:vml" xmlns:wp14="http://schemas.microsoft.com/office/word/2010/wordprocessingDrawing" xmlns:wp="http://schemas.openxmlformats.org/drawingml/2006/wordprocessingDrawing" xmlns:w10="urn:schemas-microsoft-com:office:word" xmlns:w="http://schemas.openxmlformats.org/wordprocessingml/2006/main" xmlns:w14="http://schemas.microsoft.com/office/word/2010/wordml" xmlns:w15="http://schemas.microsoft.com/office/word/2012/wordml" xmlns:w16cei="http://schemas.microsoft.com/office/word/2026/wordml/cei" xmlns:w16cex="http://schemas.microsoft.com/office/word/2018/wordml/cex" xmlns:w16cid="http://schemas.microsoft.com/office/word/2016/wordml/cid" xmlns:w16="http://schemas.microsoft.com/office/word/2018/wordml" xmlns:w16du="http://schemas.microsoft.com/office/word/2023/wordml/word16du" xmlns:w16sdtdh="http://schemas.microsoft.com/office/word/2020/wordml/sdtdatahash" xmlns:w16sdtfl="http://schemas.microsoft.com/office/word/2024/wordml/sdtformatlock" xmlns:w16se="http://schemas.microsoft.com/office/word/2015/wordml/symex" xmlns:wpg="http://schemas.microsoft.com/office/word/2010/wordprocessingGroup" xmlns:wpi="http://schemas.microsoft.com/office/word/2010/wordprocessingInk" xmlns:wne="http://schemas.microsoft.com/office/word/2006/wordml" xmlns:wps="http://schemas.microsoft.com/office/word/2010/wordprocessingShape" mc:Ignorable="w14 w15 w16se w16cid w16 w16cex w16sdtdh w16sdtfl w16du wp14">
   <w:p>
     <w:pPr>
       <w:widowControl w:val="0"/>
@@ -49488,7 +50075,7 @@
 </file>
 
 <file path=word/header9.xml><?xml version="1.0" encoding="utf-8"?>
-<w:hdr xmlns:wpc="http://schemas.microsoft.com/office/word/2010/wordprocessingCanvas" xmlns:cx="http://schemas.microsoft.com/office/drawing/2014/chartex" xmlns:cx1="http://schemas.microsoft.com/office/drawing/2015/9/8/chartex" xmlns:cx2="http://schemas.microsoft.com/office/drawing/2015/10/21/chartex" xmlns:cx3="http://schemas.microsoft.com/office/drawing/2016/5/9/chartex" xmlns:cx4="http://schemas.microsoft.com/office/drawing/2016/5/10/chartex" xmlns:cx5="http://schemas.microsoft.com/office/drawing/2016/5/11/chartex" xmlns:cx6="http://schemas.microsoft.com/office/drawing/2016/5/12/chartex" xmlns:cx7="http://schemas.microsoft.com/office/drawing/2016/5/13/chartex" xmlns:cx8="http://schemas.microsoft.com/office/drawing/2016/5/14/chartex" xmlns:mc="http://schemas.openxmlformats.org/markup-compatibility/2006" xmlns:aink="http://schemas.microsoft.com/office/drawing/2016/ink" xmlns:am3d="http://schemas.microsoft.com/office/drawing/2017/model3d" xmlns:o="urn:schemas-microsoft-com:office:office" xmlns:oel="http://schemas.microsoft.com/office/2019/extlst" xmlns:r="http://schemas.openxmlformats.org/officeDocument/2006/relationships" xmlns:m="http://schemas.openxmlformats.org/officeDocument/2006/math" xmlns:v="urn:schemas-microsoft-com:vml" xmlns:wp14="http://schemas.microsoft.com/office/word/2010/wordprocessingDrawing" xmlns:wp="http://schemas.openxmlformats.org/drawingml/2006/wordprocessingDrawing" xmlns:w10="urn:schemas-microsoft-com:office:word" xmlns:w="http://schemas.openxmlformats.org/wordprocessingml/2006/main" xmlns:w14="http://schemas.microsoft.com/office/word/2010/wordml" xmlns:w15="http://schemas.microsoft.com/office/word/2012/wordml" xmlns:w16cex="http://schemas.microsoft.com/office/word/2018/wordml/cex" xmlns:w16cid="http://schemas.microsoft.com/office/word/2016/wordml/cid" xmlns:w16="http://schemas.microsoft.com/office/word/2018/wordml" xmlns:w16du="http://schemas.microsoft.com/office/word/2023/wordml/word16du" xmlns:w16sdtdh="http://schemas.microsoft.com/office/word/2020/wordml/sdtdatahash" xmlns:w16se="http://schemas.microsoft.com/office/word/2015/wordml/symex" xmlns:wpg="http://schemas.microsoft.com/office/word/2010/wordprocessingGroup" xmlns:wpi="http://schemas.microsoft.com/office/word/2010/wordprocessingInk" xmlns:wne="http://schemas.microsoft.com/office/word/2006/wordml" xmlns:wps="http://schemas.microsoft.com/office/word/2010/wordprocessingShape" mc:Ignorable="w14 w15 w16se w16cid w16 w16cex w16sdtdh w16du wp14">
+<w:hdr xmlns:wpc="http://schemas.microsoft.com/office/word/2010/wordprocessingCanvas" xmlns:cx="http://schemas.microsoft.com/office/drawing/2014/chartex" xmlns:cx1="http://schemas.microsoft.com/office/drawing/2015/9/8/chartex" xmlns:cx2="http://schemas.microsoft.com/office/drawing/2015/10/21/chartex" xmlns:cx3="http://schemas.microsoft.com/office/drawing/2016/5/9/chartex" xmlns:cx4="http://schemas.microsoft.com/office/drawing/2016/5/10/chartex" xmlns:cx5="http://schemas.microsoft.com/office/drawing/2016/5/11/chartex" xmlns:cx6="http://schemas.microsoft.com/office/drawing/2016/5/12/chartex" xmlns:cx7="http://schemas.microsoft.com/office/drawing/2016/5/13/chartex" xmlns:cx8="http://schemas.microsoft.com/office/drawing/2016/5/14/chartex" xmlns:mc="http://schemas.openxmlformats.org/markup-compatibility/2006" xmlns:aink="http://schemas.microsoft.com/office/drawing/2016/ink" xmlns:am3d="http://schemas.microsoft.com/office/drawing/2017/model3d" xmlns:o="urn:schemas-microsoft-com:office:office" xmlns:oel="http://schemas.microsoft.com/office/2019/extlst" xmlns:r="http://schemas.openxmlformats.org/officeDocument/2006/relationships" xmlns:m="http://schemas.openxmlformats.org/officeDocument/2006/math" xmlns:v="urn:schemas-microsoft-com:vml" xmlns:wp14="http://schemas.microsoft.com/office/word/2010/wordprocessingDrawing" xmlns:wp="http://schemas.openxmlformats.org/drawingml/2006/wordprocessingDrawing" xmlns:w10="urn:schemas-microsoft-com:office:word" xmlns:w="http://schemas.openxmlformats.org/wordprocessingml/2006/main" xmlns:w14="http://schemas.microsoft.com/office/word/2010/wordml" xmlns:w15="http://schemas.microsoft.com/office/word/2012/wordml" xmlns:w16cei="http://schemas.microsoft.com/office/word/2026/wordml/cei" xmlns:w16cex="http://schemas.microsoft.com/office/word/2018/wordml/cex" xmlns:w16cid="http://schemas.microsoft.com/office/word/2016/wordml/cid" xmlns:w16="http://schemas.microsoft.com/office/word/2018/wordml" xmlns:w16du="http://schemas.microsoft.com/office/word/2023/wordml/word16du" xmlns:w16sdtdh="http://schemas.microsoft.com/office/word/2020/wordml/sdtdatahash" xmlns:w16sdtfl="http://schemas.microsoft.com/office/word/2024/wordml/sdtformatlock" xmlns:w16se="http://schemas.microsoft.com/office/word/2015/wordml/symex" xmlns:wpg="http://schemas.microsoft.com/office/word/2010/wordprocessingGroup" xmlns:wpi="http://schemas.microsoft.com/office/word/2010/wordprocessingInk" xmlns:wne="http://schemas.microsoft.com/office/word/2006/wordml" xmlns:wps="http://schemas.microsoft.com/office/word/2010/wordprocessingShape" mc:Ignorable="w14 w15 w16se w16cid w16 w16cex w16sdtdh w16sdtfl w16du wp14">
   <w:p>
     <w:pPr>
       <w:widowControl w:val="0"/>
@@ -49588,7 +50175,7 @@
 </file>
 
 <file path=word/numbering.xml><?xml version="1.0" encoding="utf-8"?>
-<w:numbering xmlns:wpc="http://schemas.microsoft.com/office/word/2010/wordprocessingCanvas" xmlns:cx="http://schemas.microsoft.com/office/drawing/2014/chartex" xmlns:cx1="http://schemas.microsoft.com/office/drawing/2015/9/8/chartex" xmlns:cx2="http://schemas.microsoft.com/office/drawing/2015/10/21/chartex" xmlns:cx3="http://schemas.microsoft.com/office/drawing/2016/5/9/chartex" xmlns:cx4="http://schemas.microsoft.com/office/drawing/2016/5/10/chartex" xmlns:cx5="http://schemas.microsoft.com/office/drawing/2016/5/11/chartex" xmlns:cx6="http://schemas.microsoft.com/office/drawing/2016/5/12/chartex" xmlns:cx7="http://schemas.microsoft.com/office/drawing/2016/5/13/chartex" xmlns:cx8="http://schemas.microsoft.com/office/drawing/2016/5/14/chartex" xmlns:mc="http://schemas.openxmlformats.org/markup-compatibility/2006" xmlns:aink="http://schemas.microsoft.com/office/drawing/2016/ink" xmlns:am3d="http://schemas.microsoft.com/office/drawing/2017/model3d" xmlns:o="urn:schemas-microsoft-com:office:office" xmlns:oel="http://schemas.microsoft.com/office/2019/extlst" xmlns:r="http://schemas.openxmlformats.org/officeDocument/2006/relationships" xmlns:m="http://schemas.openxmlformats.org/officeDocument/2006/math" xmlns:v="urn:schemas-microsoft-com:vml" xmlns:wp14="http://schemas.microsoft.com/office/word/2010/wordprocessingDrawing" xmlns:wp="http://schemas.openxmlformats.org/drawingml/2006/wordprocessingDrawing" xmlns:w10="urn:schemas-microsoft-com:office:word" xmlns:w="http://schemas.openxmlformats.org/wordprocessingml/2006/main" xmlns:w14="http://schemas.microsoft.com/office/word/2010/wordml" xmlns:w15="http://schemas.microsoft.com/office/word/2012/wordml" xmlns:w16cex="http://schemas.microsoft.com/office/word/2018/wordml/cex" xmlns:w16cid="http://schemas.microsoft.com/office/word/2016/wordml/cid" xmlns:w16="http://schemas.microsoft.com/office/word/2018/wordml" xmlns:w16du="http://schemas.microsoft.com/office/word/2023/wordml/word16du" xmlns:w16sdtdh="http://schemas.microsoft.com/office/word/2020/wordml/sdtdatahash" xmlns:w16se="http://schemas.microsoft.com/office/word/2015/wordml/symex" xmlns:wpg="http://schemas.microsoft.com/office/word/2010/wordprocessingGroup" xmlns:wpi="http://schemas.microsoft.com/office/word/2010/wordprocessingInk" xmlns:wne="http://schemas.microsoft.com/office/word/2006/wordml" xmlns:wps="http://schemas.microsoft.com/office/word/2010/wordprocessingShape" mc:Ignorable="w14 w15 w16se w16cid w16 w16cex w16sdtdh w16du wp14">
+<w:numbering xmlns:wpc="http://schemas.microsoft.com/office/word/2010/wordprocessingCanvas" xmlns:cx="http://schemas.microsoft.com/office/drawing/2014/chartex" xmlns:cx1="http://schemas.microsoft.com/office/drawing/2015/9/8/chartex" xmlns:cx2="http://schemas.microsoft.com/office/drawing/2015/10/21/chartex" xmlns:cx3="http://schemas.microsoft.com/office/drawing/2016/5/9/chartex" xmlns:cx4="http://schemas.microsoft.com/office/drawing/2016/5/10/chartex" xmlns:cx5="http://schemas.microsoft.com/office/drawing/2016/5/11/chartex" xmlns:cx6="http://schemas.microsoft.com/office/drawing/2016/5/12/chartex" xmlns:cx7="http://schemas.microsoft.com/office/drawing/2016/5/13/chartex" xmlns:cx8="http://schemas.microsoft.com/office/drawing/2016/5/14/chartex" xmlns:mc="http://schemas.openxmlformats.org/markup-compatibility/2006" xmlns:aink="http://schemas.microsoft.com/office/drawing/2016/ink" xmlns:am3d="http://schemas.microsoft.com/office/drawing/2017/model3d" xmlns:o="urn:schemas-microsoft-com:office:office" xmlns:oel="http://schemas.microsoft.com/office/2019/extlst" xmlns:r="http://schemas.openxmlformats.org/officeDocument/2006/relationships" xmlns:m="http://schemas.openxmlformats.org/officeDocument/2006/math" xmlns:v="urn:schemas-microsoft-com:vml" xmlns:wp14="http://schemas.microsoft.com/office/word/2010/wordprocessingDrawing" xmlns:wp="http://schemas.openxmlformats.org/drawingml/2006/wordprocessingDrawing" xmlns:w10="urn:schemas-microsoft-com:office:word" xmlns:w="http://schemas.openxmlformats.org/wordprocessingml/2006/main" xmlns:w14="http://schemas.microsoft.com/office/word/2010/wordml" xmlns:w15="http://schemas.microsoft.com/office/word/2012/wordml" xmlns:w16cei="http://schemas.microsoft.com/office/word/2026/wordml/cei" xmlns:w16cex="http://schemas.microsoft.com/office/word/2018/wordml/cex" xmlns:w16cid="http://schemas.microsoft.com/office/word/2016/wordml/cid" xmlns:w16="http://schemas.microsoft.com/office/word/2018/wordml" xmlns:w16du="http://schemas.microsoft.com/office/word/2023/wordml/word16du" xmlns:w16sdtdh="http://schemas.microsoft.com/office/word/2020/wordml/sdtdatahash" xmlns:w16sdtfl="http://schemas.microsoft.com/office/word/2024/wordml/sdtformatlock" xmlns:w16se="http://schemas.microsoft.com/office/word/2015/wordml/symex" xmlns:wpg="http://schemas.microsoft.com/office/word/2010/wordprocessingGroup" xmlns:wpi="http://schemas.microsoft.com/office/word/2010/wordprocessingInk" xmlns:wne="http://schemas.microsoft.com/office/word/2006/wordml" xmlns:wps="http://schemas.microsoft.com/office/word/2010/wordprocessingShape" mc:Ignorable="w14 w15 w16se w16cid w16 w16cex w16sdtdh w16sdtfl w16du wp14">
   <w:abstractNum w:abstractNumId="0" w15:restartNumberingAfterBreak="0">
     <w:nsid w:val="05D56582"/>
     <w:multiLevelType w:val="hybridMultilevel"/>
@@ -53953,7 +54540,7 @@
 </file>
 
 <file path=word/styles.xml><?xml version="1.0" encoding="utf-8"?>
-<w:styles xmlns:mc="http://schemas.openxmlformats.org/markup-compatibility/2006" xmlns:r="http://schemas.openxmlformats.org/officeDocument/2006/relationships" xmlns:w="http://schemas.openxmlformats.org/wordprocessingml/2006/main" xmlns:w14="http://schemas.microsoft.com/office/word/2010/wordml" xmlns:w15="http://schemas.microsoft.com/office/word/2012/wordml" xmlns:w16cex="http://schemas.microsoft.com/office/word/2018/wordml/cex" xmlns:w16cid="http://schemas.microsoft.com/office/word/2016/wordml/cid" xmlns:w16="http://schemas.microsoft.com/office/word/2018/wordml" xmlns:w16du="http://schemas.microsoft.com/office/word/2023/wordml/word16du" xmlns:w16sdtdh="http://schemas.microsoft.com/office/word/2020/wordml/sdtdatahash" xmlns:w16se="http://schemas.microsoft.com/office/word/2015/wordml/symex" mc:Ignorable="w14 w15 w16se w16cid w16 w16cex w16sdtdh w16du">
+<w:styles xmlns:mc="http://schemas.openxmlformats.org/markup-compatibility/2006" xmlns:r="http://schemas.openxmlformats.org/officeDocument/2006/relationships" xmlns:w="http://schemas.openxmlformats.org/wordprocessingml/2006/main" xmlns:w14="http://schemas.microsoft.com/office/word/2010/wordml" xmlns:w15="http://schemas.microsoft.com/office/word/2012/wordml" xmlns:w16cex="http://schemas.microsoft.com/office/word/2018/wordml/cex" xmlns:w16cid="http://schemas.microsoft.com/office/word/2016/wordml/cid" xmlns:w16="http://schemas.microsoft.com/office/word/2018/wordml" xmlns:w16du="http://schemas.microsoft.com/office/word/2023/wordml/word16du" xmlns:w16sdtdh="http://schemas.microsoft.com/office/word/2020/wordml/sdtdatahash" xmlns:w16sdtfl="http://schemas.microsoft.com/office/word/2024/wordml/sdtformatlock" xmlns:w16se="http://schemas.microsoft.com/office/word/2015/wordml/symex" mc:Ignorable="w14 w15 w16se w16cid w16 w16cex w16sdtdh w16sdtfl w16du">
   <w:docDefaults>
     <w:rPrDefault>
       <w:rPr>

</xml_diff>